<commit_message>
actualización de plantilla para agregar los gráficos de correctivos
</commit_message>
<xml_diff>
--- a/Plantilla.docx
+++ b/Plantilla.docx
@@ -2040,6 +2040,87 @@
         <w:t>{{lamparas_4_tabla}}</w:t>
       </w:r>
     </w:p>
+    <w:p>
+      <w:pPr>
+        <w:pBdr>
+          <w:bottom w:val="single" w:sz="6" w:space="1" w:color="auto"/>
+        </w:pBdr>
+      </w:pPr>
+    </w:p>
+    <w:p>
+      <w:pPr>
+        <w:rPr>
+          <w:b/>
+          <w:bCs/>
+        </w:rPr>
+      </w:pPr>
+      <w:r>
+        <w:rPr>
+          <w:b/>
+          <w:bCs/>
+        </w:rPr>
+        <w:t>Registro control de órdenes de mantenimiento y seguimiento. CORRECTIVOS</w:t>
+      </w:r>
+    </w:p>
+    <w:p/>
+    <w:p>
+      <w:r>
+        <w:t>{{correctivo_1_plot}}</w:t>
+      </w:r>
+    </w:p>
+    <w:p>
+      <w:r>
+        <w:t>{{correctivo_1_tabla}}</w:t>
+      </w:r>
+    </w:p>
+    <w:p/>
+    <w:p/>
+    <w:p/>
+    <w:p/>
+    <w:p/>
+    <w:p>
+      <w:r>
+        <w:t>{{correctivo_2_plot}}</w:t>
+      </w:r>
+    </w:p>
+    <w:p>
+      <w:r>
+        <w:t>{{correctivo_2_tabla}}</w:t>
+      </w:r>
+    </w:p>
+    <w:p/>
+    <w:p/>
+    <w:p/>
+    <w:p/>
+    <w:p>
+      <w:r>
+        <w:lastRenderedPageBreak/>
+        <w:t>{{correctivo_</w:t>
+      </w:r>
+      <w:r>
+        <w:t>3</w:t>
+      </w:r>
+      <w:r>
+        <w:t>_plot}}</w:t>
+      </w:r>
+    </w:p>
+    <w:p>
+      <w:r>
+        <w:t>{{correctivo_</w:t>
+      </w:r>
+      <w:r>
+        <w:t>3</w:t>
+      </w:r>
+      <w:r>
+        <w:t>_tabla}}</w:t>
+      </w:r>
+    </w:p>
+    <w:p/>
+    <w:p/>
+    <w:p/>
+    <w:p/>
+    <w:p/>
+    <w:p/>
     <w:p/>
     <w:p>
       <w:pPr>
@@ -2423,7 +2504,6 @@
         <w:rPr>
           <w:rFonts w:ascii="Avenir Book" w:hAnsi="Avenir Book"/>
         </w:rPr>
-        <w:lastRenderedPageBreak/>
         <w:t>Responsable: Mantenimiento y servicios generales</w:t>
       </w:r>
     </w:p>

</xml_diff>

<commit_message>
actualizar plantilla para agregar grafico faltante de Correctivos
</commit_message>
<xml_diff>
--- a/Plantilla.docx
+++ b/Plantilla.docx
@@ -2095,10 +2095,22 @@
     <w:p>
       <w:r>
         <w:lastRenderedPageBreak/>
+        <w:t>{{correctivo_3_plot}}</w:t>
+      </w:r>
+    </w:p>
+    <w:p>
+      <w:r>
+        <w:t>{{correctivo_3_tabla}}</w:t>
+      </w:r>
+    </w:p>
+    <w:p/>
+    <w:p/>
+    <w:p>
+      <w:r>
         <w:t>{{correctivo_</w:t>
       </w:r>
       <w:r>
-        <w:t>3</w:t>
+        <w:t>4</w:t>
       </w:r>
       <w:r>
         <w:t>_plot}}</w:t>
@@ -2109,7 +2121,7 @@
         <w:t>{{correctivo_</w:t>
       </w:r>
       <w:r>
-        <w:t>3</w:t>
+        <w:t>4</w:t>
       </w:r>
       <w:r>
         <w:t>_tabla}}</w:t>
@@ -2522,6 +2534,7 @@
         <w:rPr>
           <w:rFonts w:ascii="Avenir Book" w:hAnsi="Avenir Book"/>
         </w:rPr>
+        <w:lastRenderedPageBreak/>
         <w:t>Aprobar mapa de puntos de control de lámparas para el HU</w:t>
       </w:r>
     </w:p>

</xml_diff>

<commit_message>
Agregar descripciones a la plantilla para los gráficos.
</commit_message>
<xml_diff>
--- a/Plantilla.docx
+++ b/Plantilla.docx
@@ -2062,69 +2062,1168 @@
         <w:t>Registro control de órdenes de mantenimiento y seguimiento. CORRECTIVOS</w:t>
       </w:r>
     </w:p>
+    <w:p>
+      <w:pPr>
+        <w:jc w:val="both"/>
+        <w:rPr>
+          <w:rFonts w:ascii="Avenir Book" w:hAnsi="Avenir Book"/>
+        </w:rPr>
+      </w:pPr>
+      <w:r>
+        <w:rPr>
+          <w:rFonts w:ascii="Avenir Book" w:hAnsi="Avenir Book"/>
+        </w:rPr>
+        <w:t xml:space="preserve">El </w:t>
+      </w:r>
+      <w:r>
+        <w:rPr>
+          <w:rFonts w:ascii="Avenir Book" w:hAnsi="Avenir Book"/>
+        </w:rPr>
+        <w:t>siguiente g</w:t>
+      </w:r>
+      <w:r>
+        <w:rPr>
+          <w:rFonts w:ascii="Avenir Book" w:hAnsi="Avenir Book"/>
+        </w:rPr>
+        <w:t xml:space="preserve">ráfico compara dos métricas por mes: la cantidad total de órdenes de mantenimiento correctivo y el número de órdenes que reportaron evidencia de plagas. Cada mes se representa con dos barras verticales </w:t>
+      </w:r>
+      <w:r>
+        <w:rPr>
+          <w:rFonts w:ascii="Avenir Book" w:hAnsi="Avenir Book"/>
+        </w:rPr>
+        <w:t>una al lado de la otra</w:t>
+      </w:r>
+      <w:r>
+        <w:rPr>
+          <w:rFonts w:ascii="Avenir Book" w:hAnsi="Avenir Book"/>
+        </w:rPr>
+        <w:t xml:space="preserve">, permitiendo una comparación visual directa entre el volumen total de trabajo y los casos que requirieron intervención por presencia de plagas. </w:t>
+      </w:r>
+    </w:p>
+    <w:p>
+      <w:r>
+        <w:t>{{correctivo_1_plot}}</w:t>
+      </w:r>
+    </w:p>
+    <w:p>
+      <w:r>
+        <w:t>{{correctivo_1_tabla}}</w:t>
+      </w:r>
+    </w:p>
     <w:p/>
-    <w:p>
-      <w:r>
-        <w:t>{{correctivo_1_plot}}</w:t>
-      </w:r>
-    </w:p>
-    <w:p>
-      <w:r>
-        <w:t>{{correctivo_1_tabla}}</w:t>
+    <w:p/>
+    <w:p/>
+    <w:p>
+      <w:pPr>
+        <w:jc w:val="both"/>
+        <w:rPr>
+          <w:rFonts w:ascii="Avenir Book" w:hAnsi="Avenir Book"/>
+        </w:rPr>
+      </w:pPr>
+      <w:r>
+        <w:rPr>
+          <w:rFonts w:ascii="Avenir Book" w:hAnsi="Avenir Book"/>
+        </w:rPr>
+        <w:t xml:space="preserve">El </w:t>
+      </w:r>
+      <w:r>
+        <w:rPr>
+          <w:rFonts w:ascii="Avenir Book" w:hAnsi="Avenir Book"/>
+        </w:rPr>
+        <w:t xml:space="preserve">siguiente </w:t>
+      </w:r>
+      <w:r>
+        <w:rPr>
+          <w:rFonts w:ascii="Avenir Book" w:hAnsi="Avenir Book"/>
+        </w:rPr>
+        <w:t>gráfico m</w:t>
+      </w:r>
+      <w:r>
+        <w:rPr>
+          <w:rFonts w:ascii="Avenir Book" w:hAnsi="Avenir Book"/>
+        </w:rPr>
+        <w:t xml:space="preserve">uestra </w:t>
+      </w:r>
+      <w:r>
+        <w:rPr>
+          <w:rFonts w:ascii="Avenir Book" w:hAnsi="Avenir Book"/>
+        </w:rPr>
+        <w:t xml:space="preserve">la evolución temporal del total de hallazgos </w:t>
+      </w:r>
+      <w:r>
+        <w:rPr>
+          <w:rFonts w:ascii="Avenir Book" w:hAnsi="Avenir Book"/>
+        </w:rPr>
+        <w:t xml:space="preserve">encontrados en órdenes correctivas. </w:t>
+      </w:r>
+      <w:r>
+        <w:rPr>
+          <w:rFonts w:ascii="Avenir Book" w:hAnsi="Avenir Book"/>
+        </w:rPr>
+        <w:t xml:space="preserve"> </w:t>
+      </w:r>
+      <w:r>
+        <w:rPr>
+          <w:rFonts w:ascii="Avenir Book" w:hAnsi="Avenir Book"/>
+        </w:rPr>
+        <w:t xml:space="preserve">Las baras representan el </w:t>
+      </w:r>
+      <w:r>
+        <w:rPr>
+          <w:rFonts w:ascii="Avenir Book" w:hAnsi="Avenir Book"/>
+        </w:rPr>
+        <w:t xml:space="preserve">volumen </w:t>
+      </w:r>
+      <w:r>
+        <w:rPr>
+          <w:rFonts w:ascii="Avenir Book" w:hAnsi="Avenir Book"/>
+        </w:rPr>
+        <w:t xml:space="preserve">total </w:t>
+      </w:r>
+      <w:r>
+        <w:rPr>
+          <w:rFonts w:ascii="Avenir Book" w:hAnsi="Avenir Book"/>
+        </w:rPr>
+        <w:t xml:space="preserve">mensual, mientras que la línea negra conecta los puntos de datos creando una trayectoria clara de la tendencia a lo largo del tiempo. </w:t>
+      </w:r>
+    </w:p>
+    <w:p>
+      <w:r>
+        <w:t>{{correctivo_2_plot}}</w:t>
+      </w:r>
+    </w:p>
+    <w:p>
+      <w:r>
+        <w:t>{{correctivo_2_tabla}}</w:t>
       </w:r>
     </w:p>
     <w:p/>
     <w:p/>
     <w:p/>
     <w:p/>
+    <w:p>
+      <w:pPr>
+        <w:jc w:val="both"/>
+        <w:rPr>
+          <w:rFonts w:ascii="Avenir Book" w:hAnsi="Avenir Book"/>
+        </w:rPr>
+      </w:pPr>
+      <w:r>
+        <w:rPr>
+          <w:rFonts w:ascii="Avenir Book" w:hAnsi="Avenir Book"/>
+        </w:rPr>
+        <w:t xml:space="preserve">El </w:t>
+      </w:r>
+      <w:r>
+        <w:rPr>
+          <w:rFonts w:ascii="Avenir Book" w:hAnsi="Avenir Book"/>
+        </w:rPr>
+        <w:t xml:space="preserve">siguiente </w:t>
+      </w:r>
+      <w:r>
+        <w:rPr>
+          <w:rFonts w:ascii="Avenir Book" w:hAnsi="Avenir Book"/>
+        </w:rPr>
+        <w:t>gráfico presenta una visualización que analiza el nivel de infestación detectado en las órdenes de mantenimiento correctiv</w:t>
+      </w:r>
+      <w:r>
+        <w:rPr>
+          <w:rFonts w:ascii="Avenir Book" w:hAnsi="Avenir Book"/>
+        </w:rPr>
+        <w:t>as</w:t>
+      </w:r>
+      <w:r>
+        <w:rPr>
+          <w:rFonts w:ascii="Avenir Book" w:hAnsi="Avenir Book"/>
+        </w:rPr>
+        <w:t xml:space="preserve"> del mes más reciente. Cada panel corresponde a una especie de plaga diferente y muestra la distribución de órdenes clasificadas en tres categorías: Alto, Medio y Bajo. La clasificación se determina comparando la cantidad de hallazgos reportados en cada orden con los valores de referencia establecidos en la tabla </w:t>
+      </w:r>
+      <w:r>
+        <w:rPr>
+          <w:rFonts w:ascii="Avenir Book" w:hAnsi="Avenir Book"/>
+        </w:rPr>
+        <w:t>de referencia</w:t>
+      </w:r>
+      <w:r>
+        <w:rPr>
+          <w:rFonts w:ascii="Avenir Book" w:hAnsi="Avenir Book"/>
+        </w:rPr>
+        <w:t>. Las órdenes sin evidencia de plagas se excluyen del gráfico para concentrar el análisis únicamente en situaciones que requieren intervención.</w:t>
+      </w:r>
+    </w:p>
+    <w:tbl>
+      <w:tblPr>
+        <w:tblStyle w:val="TableGrid"/>
+        <w:tblW w:w="0" w:type="auto"/>
+        <w:jc w:val="center"/>
+        <w:tblLook w:val="04A0" w:firstRow="1" w:lastRow="0" w:firstColumn="1" w:lastColumn="0" w:noHBand="0" w:noVBand="1"/>
+      </w:tblPr>
+      <w:tblGrid>
+        <w:gridCol w:w="2268"/>
+        <w:gridCol w:w="827"/>
+        <w:gridCol w:w="1016"/>
+        <w:gridCol w:w="850"/>
+      </w:tblGrid>
+      <w:tr>
+        <w:trPr>
+          <w:jc w:val="center"/>
+        </w:trPr>
+        <w:tc>
+          <w:tcPr>
+            <w:tcW w:w="4961" w:type="dxa"/>
+            <w:gridSpan w:val="4"/>
+            <w:vAlign w:val="center"/>
+          </w:tcPr>
+          <w:p>
+            <w:pPr>
+              <w:jc w:val="center"/>
+              <w:rPr>
+                <w:rFonts w:ascii="Avenir Book" w:hAnsi="Avenir Book"/>
+                <w:b/>
+                <w:bCs/>
+              </w:rPr>
+            </w:pPr>
+            <w:r>
+              <w:rPr>
+                <w:rFonts w:ascii="Avenir Book" w:hAnsi="Avenir Book"/>
+                <w:b/>
+                <w:bCs/>
+              </w:rPr>
+              <w:t>Valores de Referencia</w:t>
+            </w:r>
+          </w:p>
+        </w:tc>
+      </w:tr>
+      <w:tr>
+        <w:trPr>
+          <w:jc w:val="center"/>
+        </w:trPr>
+        <w:tc>
+          <w:tcPr>
+            <w:tcW w:w="2268" w:type="dxa"/>
+            <w:vAlign w:val="center"/>
+          </w:tcPr>
+          <w:p>
+            <w:pPr>
+              <w:jc w:val="right"/>
+              <w:rPr>
+                <w:rFonts w:ascii="Avenir Book" w:hAnsi="Avenir Book"/>
+              </w:rPr>
+            </w:pPr>
+            <w:r>
+              <w:rPr>
+                <w:rFonts w:ascii="Avenir Book" w:hAnsi="Avenir Book"/>
+              </w:rPr>
+              <w:t>Plaga</w:t>
+            </w:r>
+          </w:p>
+        </w:tc>
+        <w:tc>
+          <w:tcPr>
+            <w:tcW w:w="827" w:type="dxa"/>
+            <w:shd w:val="clear" w:color="auto" w:fill="8FCC4F"/>
+            <w:vAlign w:val="center"/>
+          </w:tcPr>
+          <w:p>
+            <w:pPr>
+              <w:jc w:val="center"/>
+              <w:rPr>
+                <w:rFonts w:ascii="Avenir Book" w:hAnsi="Avenir Book"/>
+              </w:rPr>
+            </w:pPr>
+            <w:r>
+              <w:rPr>
+                <w:rFonts w:ascii="Avenir Book" w:hAnsi="Avenir Book"/>
+              </w:rPr>
+              <w:t>Bajo</w:t>
+            </w:r>
+          </w:p>
+        </w:tc>
+        <w:tc>
+          <w:tcPr>
+            <w:tcW w:w="1016" w:type="dxa"/>
+            <w:shd w:val="clear" w:color="auto" w:fill="F5B800"/>
+            <w:vAlign w:val="center"/>
+          </w:tcPr>
+          <w:p>
+            <w:pPr>
+              <w:jc w:val="center"/>
+              <w:rPr>
+                <w:rFonts w:ascii="Avenir Book" w:hAnsi="Avenir Book"/>
+              </w:rPr>
+            </w:pPr>
+            <w:r>
+              <w:rPr>
+                <w:rFonts w:ascii="Avenir Book" w:hAnsi="Avenir Book"/>
+              </w:rPr>
+              <w:t>Medio</w:t>
+            </w:r>
+          </w:p>
+        </w:tc>
+        <w:tc>
+          <w:tcPr>
+            <w:tcW w:w="850" w:type="dxa"/>
+            <w:shd w:val="clear" w:color="auto" w:fill="DF0204"/>
+            <w:vAlign w:val="center"/>
+          </w:tcPr>
+          <w:p>
+            <w:pPr>
+              <w:jc w:val="center"/>
+              <w:rPr>
+                <w:rFonts w:ascii="Avenir Book" w:hAnsi="Avenir Book"/>
+              </w:rPr>
+            </w:pPr>
+            <w:r>
+              <w:rPr>
+                <w:rFonts w:ascii="Avenir Book" w:hAnsi="Avenir Book"/>
+              </w:rPr>
+              <w:t>Alto</w:t>
+            </w:r>
+          </w:p>
+        </w:tc>
+      </w:tr>
+      <w:tr>
+        <w:trPr>
+          <w:jc w:val="center"/>
+        </w:trPr>
+        <w:tc>
+          <w:tcPr>
+            <w:tcW w:w="2268" w:type="dxa"/>
+            <w:vAlign w:val="center"/>
+          </w:tcPr>
+          <w:p>
+            <w:pPr>
+              <w:jc w:val="right"/>
+              <w:rPr>
+                <w:rFonts w:ascii="Avenir Book" w:hAnsi="Avenir Book"/>
+              </w:rPr>
+            </w:pPr>
+            <w:r>
+              <w:rPr>
+                <w:rFonts w:ascii="Avenir Book" w:hAnsi="Avenir Book"/>
+              </w:rPr>
+              <w:t>Cucaracha Americana</w:t>
+            </w:r>
+          </w:p>
+        </w:tc>
+        <w:tc>
+          <w:tcPr>
+            <w:tcW w:w="827" w:type="dxa"/>
+            <w:vAlign w:val="center"/>
+          </w:tcPr>
+          <w:p>
+            <w:pPr>
+              <w:jc w:val="center"/>
+              <w:rPr>
+                <w:rFonts w:ascii="Avenir Book" w:hAnsi="Avenir Book"/>
+              </w:rPr>
+            </w:pPr>
+            <w:r>
+              <w:rPr>
+                <w:rFonts w:ascii="Avenir Book" w:hAnsi="Avenir Book"/>
+              </w:rPr>
+              <w:t>1-20</w:t>
+            </w:r>
+          </w:p>
+        </w:tc>
+        <w:tc>
+          <w:tcPr>
+            <w:tcW w:w="1016" w:type="dxa"/>
+            <w:vAlign w:val="center"/>
+          </w:tcPr>
+          <w:p>
+            <w:pPr>
+              <w:jc w:val="center"/>
+              <w:rPr>
+                <w:rFonts w:ascii="Avenir Book" w:hAnsi="Avenir Book"/>
+              </w:rPr>
+            </w:pPr>
+            <w:r>
+              <w:rPr>
+                <w:rFonts w:ascii="Avenir Book" w:hAnsi="Avenir Book"/>
+              </w:rPr>
+              <w:t>21-50</w:t>
+            </w:r>
+          </w:p>
+        </w:tc>
+        <w:tc>
+          <w:tcPr>
+            <w:tcW w:w="850" w:type="dxa"/>
+            <w:vAlign w:val="center"/>
+          </w:tcPr>
+          <w:p>
+            <w:pPr>
+              <w:jc w:val="center"/>
+              <w:rPr>
+                <w:rFonts w:ascii="Avenir Book" w:hAnsi="Avenir Book"/>
+              </w:rPr>
+            </w:pPr>
+            <w:r>
+              <w:rPr>
+                <w:rFonts w:ascii="Avenir Book" w:hAnsi="Avenir Book"/>
+              </w:rPr>
+              <w:t>&gt;50</w:t>
+            </w:r>
+          </w:p>
+        </w:tc>
+      </w:tr>
+      <w:tr>
+        <w:trPr>
+          <w:jc w:val="center"/>
+        </w:trPr>
+        <w:tc>
+          <w:tcPr>
+            <w:tcW w:w="2268" w:type="dxa"/>
+            <w:vAlign w:val="center"/>
+          </w:tcPr>
+          <w:p>
+            <w:pPr>
+              <w:jc w:val="right"/>
+              <w:rPr>
+                <w:rFonts w:ascii="Avenir Book" w:hAnsi="Avenir Book"/>
+              </w:rPr>
+            </w:pPr>
+            <w:r>
+              <w:rPr>
+                <w:rFonts w:ascii="Avenir Book" w:hAnsi="Avenir Book"/>
+              </w:rPr>
+              <w:t>Cucaracha Alemana</w:t>
+            </w:r>
+          </w:p>
+        </w:tc>
+        <w:tc>
+          <w:tcPr>
+            <w:tcW w:w="827" w:type="dxa"/>
+            <w:vAlign w:val="center"/>
+          </w:tcPr>
+          <w:p>
+            <w:pPr>
+              <w:jc w:val="center"/>
+              <w:rPr>
+                <w:rFonts w:ascii="Avenir Book" w:hAnsi="Avenir Book"/>
+              </w:rPr>
+            </w:pPr>
+            <w:r>
+              <w:rPr>
+                <w:rFonts w:ascii="Avenir Book" w:hAnsi="Avenir Book"/>
+              </w:rPr>
+              <w:t>1-20</w:t>
+            </w:r>
+          </w:p>
+        </w:tc>
+        <w:tc>
+          <w:tcPr>
+            <w:tcW w:w="1016" w:type="dxa"/>
+            <w:vAlign w:val="center"/>
+          </w:tcPr>
+          <w:p>
+            <w:pPr>
+              <w:jc w:val="center"/>
+              <w:rPr>
+                <w:rFonts w:ascii="Avenir Book" w:hAnsi="Avenir Book"/>
+              </w:rPr>
+            </w:pPr>
+            <w:r>
+              <w:rPr>
+                <w:rFonts w:ascii="Avenir Book" w:hAnsi="Avenir Book"/>
+              </w:rPr>
+              <w:t>21-50</w:t>
+            </w:r>
+          </w:p>
+        </w:tc>
+        <w:tc>
+          <w:tcPr>
+            <w:tcW w:w="850" w:type="dxa"/>
+            <w:vAlign w:val="center"/>
+          </w:tcPr>
+          <w:p>
+            <w:pPr>
+              <w:jc w:val="center"/>
+              <w:rPr>
+                <w:rFonts w:ascii="Avenir Book" w:hAnsi="Avenir Book"/>
+              </w:rPr>
+            </w:pPr>
+            <w:r>
+              <w:rPr>
+                <w:rFonts w:ascii="Avenir Book" w:hAnsi="Avenir Book"/>
+              </w:rPr>
+              <w:t>&gt;50</w:t>
+            </w:r>
+          </w:p>
+        </w:tc>
+      </w:tr>
+      <w:tr>
+        <w:trPr>
+          <w:jc w:val="center"/>
+        </w:trPr>
+        <w:tc>
+          <w:tcPr>
+            <w:tcW w:w="2268" w:type="dxa"/>
+            <w:vAlign w:val="center"/>
+          </w:tcPr>
+          <w:p>
+            <w:pPr>
+              <w:jc w:val="right"/>
+              <w:rPr>
+                <w:rFonts w:ascii="Avenir Book" w:hAnsi="Avenir Book"/>
+              </w:rPr>
+            </w:pPr>
+            <w:r>
+              <w:rPr>
+                <w:rFonts w:ascii="Avenir Book" w:hAnsi="Avenir Book"/>
+              </w:rPr>
+              <w:t>Hormigas</w:t>
+            </w:r>
+          </w:p>
+        </w:tc>
+        <w:tc>
+          <w:tcPr>
+            <w:tcW w:w="827" w:type="dxa"/>
+            <w:vAlign w:val="center"/>
+          </w:tcPr>
+          <w:p>
+            <w:pPr>
+              <w:jc w:val="center"/>
+              <w:rPr>
+                <w:rFonts w:ascii="Avenir Book" w:hAnsi="Avenir Book"/>
+              </w:rPr>
+            </w:pPr>
+            <w:r>
+              <w:rPr>
+                <w:rFonts w:ascii="Avenir Book" w:hAnsi="Avenir Book"/>
+              </w:rPr>
+              <w:t>1-100</w:t>
+            </w:r>
+          </w:p>
+        </w:tc>
+        <w:tc>
+          <w:tcPr>
+            <w:tcW w:w="1016" w:type="dxa"/>
+            <w:vAlign w:val="center"/>
+          </w:tcPr>
+          <w:p>
+            <w:pPr>
+              <w:jc w:val="center"/>
+              <w:rPr>
+                <w:rFonts w:ascii="Avenir Book" w:hAnsi="Avenir Book"/>
+              </w:rPr>
+            </w:pPr>
+            <w:r>
+              <w:rPr>
+                <w:rFonts w:ascii="Avenir Book" w:hAnsi="Avenir Book"/>
+              </w:rPr>
+              <w:t>101-200</w:t>
+            </w:r>
+          </w:p>
+        </w:tc>
+        <w:tc>
+          <w:tcPr>
+            <w:tcW w:w="850" w:type="dxa"/>
+            <w:vAlign w:val="center"/>
+          </w:tcPr>
+          <w:p>
+            <w:pPr>
+              <w:jc w:val="center"/>
+              <w:rPr>
+                <w:rFonts w:ascii="Avenir Book" w:hAnsi="Avenir Book"/>
+              </w:rPr>
+            </w:pPr>
+            <w:r>
+              <w:rPr>
+                <w:rFonts w:ascii="Avenir Book" w:hAnsi="Avenir Book"/>
+              </w:rPr>
+              <w:t>&gt;200</w:t>
+            </w:r>
+          </w:p>
+        </w:tc>
+      </w:tr>
+      <w:tr>
+        <w:trPr>
+          <w:jc w:val="center"/>
+        </w:trPr>
+        <w:tc>
+          <w:tcPr>
+            <w:tcW w:w="2268" w:type="dxa"/>
+            <w:vAlign w:val="center"/>
+          </w:tcPr>
+          <w:p>
+            <w:pPr>
+              <w:jc w:val="right"/>
+              <w:rPr>
+                <w:rFonts w:ascii="Avenir Book" w:hAnsi="Avenir Book"/>
+              </w:rPr>
+            </w:pPr>
+            <w:r>
+              <w:rPr>
+                <w:rFonts w:ascii="Avenir Book" w:hAnsi="Avenir Book"/>
+              </w:rPr>
+              <w:t>Moscas</w:t>
+            </w:r>
+          </w:p>
+        </w:tc>
+        <w:tc>
+          <w:tcPr>
+            <w:tcW w:w="827" w:type="dxa"/>
+            <w:vAlign w:val="center"/>
+          </w:tcPr>
+          <w:p>
+            <w:pPr>
+              <w:jc w:val="center"/>
+              <w:rPr>
+                <w:rFonts w:ascii="Avenir Book" w:hAnsi="Avenir Book"/>
+              </w:rPr>
+            </w:pPr>
+            <w:r>
+              <w:rPr>
+                <w:rFonts w:ascii="Avenir Book" w:hAnsi="Avenir Book"/>
+              </w:rPr>
+              <w:t>1-</w:t>
+            </w:r>
+            <w:r>
+              <w:rPr>
+                <w:rFonts w:ascii="Avenir Book" w:hAnsi="Avenir Book"/>
+              </w:rPr>
+              <w:t>5</w:t>
+            </w:r>
+          </w:p>
+        </w:tc>
+        <w:tc>
+          <w:tcPr>
+            <w:tcW w:w="1016" w:type="dxa"/>
+            <w:vAlign w:val="center"/>
+          </w:tcPr>
+          <w:p>
+            <w:pPr>
+              <w:jc w:val="center"/>
+              <w:rPr>
+                <w:rFonts w:ascii="Avenir Book" w:hAnsi="Avenir Book"/>
+              </w:rPr>
+            </w:pPr>
+            <w:r>
+              <w:rPr>
+                <w:rFonts w:ascii="Avenir Book" w:hAnsi="Avenir Book"/>
+              </w:rPr>
+              <w:t>6-20</w:t>
+            </w:r>
+          </w:p>
+        </w:tc>
+        <w:tc>
+          <w:tcPr>
+            <w:tcW w:w="850" w:type="dxa"/>
+            <w:vAlign w:val="center"/>
+          </w:tcPr>
+          <w:p>
+            <w:pPr>
+              <w:jc w:val="center"/>
+              <w:rPr>
+                <w:rFonts w:ascii="Avenir Book" w:hAnsi="Avenir Book"/>
+              </w:rPr>
+            </w:pPr>
+            <w:r>
+              <w:rPr>
+                <w:rFonts w:ascii="Avenir Book" w:hAnsi="Avenir Book"/>
+              </w:rPr>
+              <w:t>&gt;20</w:t>
+            </w:r>
+          </w:p>
+        </w:tc>
+      </w:tr>
+      <w:tr>
+        <w:trPr>
+          <w:jc w:val="center"/>
+        </w:trPr>
+        <w:tc>
+          <w:tcPr>
+            <w:tcW w:w="2268" w:type="dxa"/>
+            <w:vAlign w:val="center"/>
+          </w:tcPr>
+          <w:p>
+            <w:pPr>
+              <w:jc w:val="right"/>
+              <w:rPr>
+                <w:rFonts w:ascii="Avenir Book" w:hAnsi="Avenir Book"/>
+              </w:rPr>
+            </w:pPr>
+            <w:r>
+              <w:rPr>
+                <w:rFonts w:ascii="Avenir Book" w:hAnsi="Avenir Book"/>
+              </w:rPr>
+              <w:t>Mosquitos</w:t>
+            </w:r>
+          </w:p>
+        </w:tc>
+        <w:tc>
+          <w:tcPr>
+            <w:tcW w:w="827" w:type="dxa"/>
+            <w:vAlign w:val="center"/>
+          </w:tcPr>
+          <w:p>
+            <w:pPr>
+              <w:jc w:val="center"/>
+              <w:rPr>
+                <w:rFonts w:ascii="Avenir Book" w:hAnsi="Avenir Book"/>
+              </w:rPr>
+            </w:pPr>
+            <w:r>
+              <w:rPr>
+                <w:rFonts w:ascii="Avenir Book" w:hAnsi="Avenir Book"/>
+              </w:rPr>
+              <w:t>1-5</w:t>
+            </w:r>
+          </w:p>
+        </w:tc>
+        <w:tc>
+          <w:tcPr>
+            <w:tcW w:w="1016" w:type="dxa"/>
+            <w:vAlign w:val="center"/>
+          </w:tcPr>
+          <w:p>
+            <w:pPr>
+              <w:jc w:val="center"/>
+              <w:rPr>
+                <w:rFonts w:ascii="Avenir Book" w:hAnsi="Avenir Book"/>
+              </w:rPr>
+            </w:pPr>
+            <w:r>
+              <w:rPr>
+                <w:rFonts w:ascii="Avenir Book" w:hAnsi="Avenir Book"/>
+              </w:rPr>
+              <w:t>6-15</w:t>
+            </w:r>
+          </w:p>
+        </w:tc>
+        <w:tc>
+          <w:tcPr>
+            <w:tcW w:w="850" w:type="dxa"/>
+            <w:vAlign w:val="center"/>
+          </w:tcPr>
+          <w:p>
+            <w:pPr>
+              <w:jc w:val="center"/>
+              <w:rPr>
+                <w:rFonts w:ascii="Avenir Book" w:hAnsi="Avenir Book"/>
+              </w:rPr>
+            </w:pPr>
+            <w:r>
+              <w:rPr>
+                <w:rFonts w:ascii="Avenir Book" w:hAnsi="Avenir Book"/>
+              </w:rPr>
+              <w:t>&gt;15</w:t>
+            </w:r>
+          </w:p>
+        </w:tc>
+      </w:tr>
+      <w:tr>
+        <w:trPr>
+          <w:jc w:val="center"/>
+        </w:trPr>
+        <w:tc>
+          <w:tcPr>
+            <w:tcW w:w="2268" w:type="dxa"/>
+            <w:vAlign w:val="center"/>
+          </w:tcPr>
+          <w:p>
+            <w:pPr>
+              <w:jc w:val="right"/>
+              <w:rPr>
+                <w:rFonts w:ascii="Avenir Book" w:hAnsi="Avenir Book"/>
+              </w:rPr>
+            </w:pPr>
+            <w:r>
+              <w:rPr>
+                <w:rFonts w:ascii="Avenir Book" w:hAnsi="Avenir Book"/>
+              </w:rPr>
+              <w:t>Zancudos</w:t>
+            </w:r>
+          </w:p>
+        </w:tc>
+        <w:tc>
+          <w:tcPr>
+            <w:tcW w:w="827" w:type="dxa"/>
+            <w:vAlign w:val="center"/>
+          </w:tcPr>
+          <w:p>
+            <w:pPr>
+              <w:jc w:val="center"/>
+              <w:rPr>
+                <w:rFonts w:ascii="Avenir Book" w:hAnsi="Avenir Book"/>
+              </w:rPr>
+            </w:pPr>
+            <w:r>
+              <w:rPr>
+                <w:rFonts w:ascii="Avenir Book" w:hAnsi="Avenir Book"/>
+              </w:rPr>
+              <w:t>1-5</w:t>
+            </w:r>
+          </w:p>
+        </w:tc>
+        <w:tc>
+          <w:tcPr>
+            <w:tcW w:w="1016" w:type="dxa"/>
+            <w:vAlign w:val="center"/>
+          </w:tcPr>
+          <w:p>
+            <w:pPr>
+              <w:jc w:val="center"/>
+              <w:rPr>
+                <w:rFonts w:ascii="Avenir Book" w:hAnsi="Avenir Book"/>
+              </w:rPr>
+            </w:pPr>
+            <w:r>
+              <w:rPr>
+                <w:rFonts w:ascii="Avenir Book" w:hAnsi="Avenir Book"/>
+              </w:rPr>
+              <w:t>6-15</w:t>
+            </w:r>
+          </w:p>
+        </w:tc>
+        <w:tc>
+          <w:tcPr>
+            <w:tcW w:w="850" w:type="dxa"/>
+            <w:vAlign w:val="center"/>
+          </w:tcPr>
+          <w:p>
+            <w:pPr>
+              <w:jc w:val="center"/>
+              <w:rPr>
+                <w:rFonts w:ascii="Avenir Book" w:hAnsi="Avenir Book"/>
+              </w:rPr>
+            </w:pPr>
+            <w:r>
+              <w:rPr>
+                <w:rFonts w:ascii="Avenir Book" w:hAnsi="Avenir Book"/>
+              </w:rPr>
+              <w:t>&gt;15</w:t>
+            </w:r>
+          </w:p>
+        </w:tc>
+      </w:tr>
+      <w:tr>
+        <w:trPr>
+          <w:jc w:val="center"/>
+        </w:trPr>
+        <w:tc>
+          <w:tcPr>
+            <w:tcW w:w="2268" w:type="dxa"/>
+            <w:vAlign w:val="center"/>
+          </w:tcPr>
+          <w:p>
+            <w:pPr>
+              <w:jc w:val="right"/>
+              <w:rPr>
+                <w:rFonts w:ascii="Avenir Book" w:hAnsi="Avenir Book"/>
+              </w:rPr>
+            </w:pPr>
+            <w:r>
+              <w:rPr>
+                <w:rFonts w:ascii="Avenir Book" w:hAnsi="Avenir Book"/>
+              </w:rPr>
+              <w:t>Ratón casero</w:t>
+            </w:r>
+          </w:p>
+        </w:tc>
+        <w:tc>
+          <w:tcPr>
+            <w:tcW w:w="827" w:type="dxa"/>
+            <w:vAlign w:val="center"/>
+          </w:tcPr>
+          <w:p>
+            <w:pPr>
+              <w:jc w:val="center"/>
+              <w:rPr>
+                <w:rFonts w:ascii="Avenir Book" w:hAnsi="Avenir Book"/>
+              </w:rPr>
+            </w:pPr>
+            <w:r>
+              <w:rPr>
+                <w:rFonts w:ascii="Avenir Book" w:hAnsi="Avenir Book"/>
+              </w:rPr>
+              <w:t>1</w:t>
+            </w:r>
+          </w:p>
+        </w:tc>
+        <w:tc>
+          <w:tcPr>
+            <w:tcW w:w="1016" w:type="dxa"/>
+            <w:vAlign w:val="center"/>
+          </w:tcPr>
+          <w:p>
+            <w:pPr>
+              <w:jc w:val="center"/>
+              <w:rPr>
+                <w:rFonts w:ascii="Avenir Book" w:hAnsi="Avenir Book"/>
+              </w:rPr>
+            </w:pPr>
+            <w:r>
+              <w:rPr>
+                <w:rFonts w:ascii="Avenir Book" w:hAnsi="Avenir Book"/>
+              </w:rPr>
+              <w:t>2-3</w:t>
+            </w:r>
+          </w:p>
+        </w:tc>
+        <w:tc>
+          <w:tcPr>
+            <w:tcW w:w="850" w:type="dxa"/>
+            <w:vAlign w:val="center"/>
+          </w:tcPr>
+          <w:p>
+            <w:pPr>
+              <w:jc w:val="center"/>
+              <w:rPr>
+                <w:rFonts w:ascii="Avenir Book" w:hAnsi="Avenir Book"/>
+              </w:rPr>
+            </w:pPr>
+            <w:r>
+              <w:rPr>
+                <w:rFonts w:ascii="Avenir Book" w:hAnsi="Avenir Book"/>
+              </w:rPr>
+              <w:t>&gt;3</w:t>
+            </w:r>
+          </w:p>
+        </w:tc>
+      </w:tr>
+      <w:tr>
+        <w:trPr>
+          <w:jc w:val="center"/>
+        </w:trPr>
+        <w:tc>
+          <w:tcPr>
+            <w:tcW w:w="2268" w:type="dxa"/>
+            <w:vAlign w:val="center"/>
+          </w:tcPr>
+          <w:p>
+            <w:pPr>
+              <w:jc w:val="right"/>
+              <w:rPr>
+                <w:rFonts w:ascii="Avenir Book" w:hAnsi="Avenir Book"/>
+              </w:rPr>
+            </w:pPr>
+            <w:r>
+              <w:rPr>
+                <w:rFonts w:ascii="Avenir Book" w:hAnsi="Avenir Book"/>
+              </w:rPr>
+              <w:t>Rata Noruega</w:t>
+            </w:r>
+          </w:p>
+        </w:tc>
+        <w:tc>
+          <w:tcPr>
+            <w:tcW w:w="827" w:type="dxa"/>
+            <w:vAlign w:val="center"/>
+          </w:tcPr>
+          <w:p>
+            <w:pPr>
+              <w:jc w:val="center"/>
+              <w:rPr>
+                <w:rFonts w:ascii="Avenir Book" w:hAnsi="Avenir Book"/>
+              </w:rPr>
+            </w:pPr>
+            <w:r>
+              <w:rPr>
+                <w:rFonts w:ascii="Avenir Book" w:hAnsi="Avenir Book"/>
+              </w:rPr>
+              <w:t>1</w:t>
+            </w:r>
+          </w:p>
+        </w:tc>
+        <w:tc>
+          <w:tcPr>
+            <w:tcW w:w="1016" w:type="dxa"/>
+            <w:vAlign w:val="center"/>
+          </w:tcPr>
+          <w:p>
+            <w:pPr>
+              <w:jc w:val="center"/>
+              <w:rPr>
+                <w:rFonts w:ascii="Avenir Book" w:hAnsi="Avenir Book"/>
+              </w:rPr>
+            </w:pPr>
+            <w:r>
+              <w:rPr>
+                <w:rFonts w:ascii="Avenir Book" w:hAnsi="Avenir Book"/>
+              </w:rPr>
+              <w:t>2-3</w:t>
+            </w:r>
+          </w:p>
+        </w:tc>
+        <w:tc>
+          <w:tcPr>
+            <w:tcW w:w="850" w:type="dxa"/>
+            <w:vAlign w:val="center"/>
+          </w:tcPr>
+          <w:p>
+            <w:pPr>
+              <w:jc w:val="center"/>
+              <w:rPr>
+                <w:rFonts w:ascii="Avenir Book" w:hAnsi="Avenir Book"/>
+              </w:rPr>
+            </w:pPr>
+            <w:r>
+              <w:rPr>
+                <w:rFonts w:ascii="Avenir Book" w:hAnsi="Avenir Book"/>
+              </w:rPr>
+              <w:t>&gt;3</w:t>
+            </w:r>
+          </w:p>
+        </w:tc>
+      </w:tr>
+      <w:tr>
+        <w:trPr>
+          <w:jc w:val="center"/>
+        </w:trPr>
+        <w:tc>
+          <w:tcPr>
+            <w:tcW w:w="2268" w:type="dxa"/>
+            <w:vAlign w:val="center"/>
+          </w:tcPr>
+          <w:p>
+            <w:pPr>
+              <w:jc w:val="right"/>
+              <w:rPr>
+                <w:rFonts w:ascii="Avenir Book" w:hAnsi="Avenir Book"/>
+              </w:rPr>
+            </w:pPr>
+            <w:r>
+              <w:rPr>
+                <w:rFonts w:ascii="Avenir Book" w:hAnsi="Avenir Book"/>
+              </w:rPr>
+              <w:t>Ratón de tejado</w:t>
+            </w:r>
+          </w:p>
+        </w:tc>
+        <w:tc>
+          <w:tcPr>
+            <w:tcW w:w="827" w:type="dxa"/>
+            <w:vAlign w:val="center"/>
+          </w:tcPr>
+          <w:p>
+            <w:pPr>
+              <w:jc w:val="center"/>
+              <w:rPr>
+                <w:rFonts w:ascii="Avenir Book" w:hAnsi="Avenir Book"/>
+              </w:rPr>
+            </w:pPr>
+            <w:r>
+              <w:rPr>
+                <w:rFonts w:ascii="Avenir Book" w:hAnsi="Avenir Book"/>
+              </w:rPr>
+              <w:t>1</w:t>
+            </w:r>
+          </w:p>
+        </w:tc>
+        <w:tc>
+          <w:tcPr>
+            <w:tcW w:w="1016" w:type="dxa"/>
+            <w:vAlign w:val="center"/>
+          </w:tcPr>
+          <w:p>
+            <w:pPr>
+              <w:jc w:val="center"/>
+              <w:rPr>
+                <w:rFonts w:ascii="Avenir Book" w:hAnsi="Avenir Book"/>
+              </w:rPr>
+            </w:pPr>
+            <w:r>
+              <w:rPr>
+                <w:rFonts w:ascii="Avenir Book" w:hAnsi="Avenir Book"/>
+              </w:rPr>
+              <w:t>2-3</w:t>
+            </w:r>
+          </w:p>
+        </w:tc>
+        <w:tc>
+          <w:tcPr>
+            <w:tcW w:w="850" w:type="dxa"/>
+            <w:vAlign w:val="center"/>
+          </w:tcPr>
+          <w:p>
+            <w:pPr>
+              <w:jc w:val="center"/>
+              <w:rPr>
+                <w:rFonts w:ascii="Avenir Book" w:hAnsi="Avenir Book"/>
+              </w:rPr>
+            </w:pPr>
+            <w:r>
+              <w:rPr>
+                <w:rFonts w:ascii="Avenir Book" w:hAnsi="Avenir Book"/>
+              </w:rPr>
+              <w:t>&gt;3</w:t>
+            </w:r>
+          </w:p>
+        </w:tc>
+      </w:tr>
+    </w:tbl>
     <w:p/>
     <w:p>
       <w:r>
-        <w:t>{{correctivo_2_plot}}</w:t>
-      </w:r>
-    </w:p>
-    <w:p>
-      <w:r>
-        <w:t>{{correctivo_2_tabla}}</w:t>
+        <w:t>{{correctivo_3_plot}}</w:t>
+      </w:r>
+    </w:p>
+    <w:p>
+      <w:r>
+        <w:t>{{correctivo_3_tabla}}</w:t>
       </w:r>
     </w:p>
     <w:p/>
-    <w:p/>
-    <w:p/>
-    <w:p/>
-    <w:p>
-      <w:r>
-        <w:lastRenderedPageBreak/>
-        <w:t>{{correctivo_3_plot}}</w:t>
-      </w:r>
-    </w:p>
-    <w:p>
-      <w:r>
-        <w:t>{{correctivo_3_tabla}}</w:t>
-      </w:r>
-    </w:p>
-    <w:p/>
-    <w:p/>
-    <w:p>
-      <w:r>
-        <w:t>{{correctivo_</w:t>
-      </w:r>
-      <w:r>
-        <w:t>4</w:t>
-      </w:r>
-      <w:r>
-        <w:t>_plot}}</w:t>
-      </w:r>
-    </w:p>
-    <w:p>
-      <w:r>
-        <w:t>{{correctivo_</w:t>
-      </w:r>
-      <w:r>
-        <w:t>4</w:t>
-      </w:r>
-      <w:r>
-        <w:t>_tabla}}</w:t>
+    <w:p>
+      <w:pPr>
+        <w:jc w:val="both"/>
+        <w:rPr>
+          <w:rFonts w:ascii="Avenir Book" w:hAnsi="Avenir Book"/>
+        </w:rPr>
+      </w:pPr>
+      <w:r>
+        <w:rPr>
+          <w:rFonts w:ascii="Avenir Book" w:hAnsi="Avenir Book"/>
+        </w:rPr>
+        <w:t xml:space="preserve">El </w:t>
+      </w:r>
+      <w:r>
+        <w:rPr>
+          <w:rFonts w:ascii="Avenir Book" w:hAnsi="Avenir Book"/>
+        </w:rPr>
+        <w:t xml:space="preserve">siguiente </w:t>
+      </w:r>
+      <w:r>
+        <w:rPr>
+          <w:rFonts w:ascii="Avenir Book" w:hAnsi="Avenir Book"/>
+        </w:rPr>
+        <w:t xml:space="preserve">gráfico </w:t>
+      </w:r>
+      <w:r>
+        <w:rPr>
+          <w:rFonts w:ascii="Avenir Book" w:hAnsi="Avenir Book"/>
+        </w:rPr>
+        <w:t>desglosa</w:t>
+      </w:r>
+      <w:r>
+        <w:rPr>
+          <w:rFonts w:ascii="Avenir Book" w:hAnsi="Avenir Book"/>
+        </w:rPr>
+        <w:t xml:space="preserve"> la información de hallazgos de plagas por especie a lo largo del tiempo. Cada panel corresponde a una especie diferente y muestra su evolución </w:t>
+      </w:r>
+      <w:r>
+        <w:rPr>
+          <w:rFonts w:ascii="Avenir Book" w:hAnsi="Avenir Book"/>
+        </w:rPr>
+        <w:t xml:space="preserve">mensual </w:t>
+      </w:r>
+      <w:r>
+        <w:rPr>
+          <w:rFonts w:ascii="Avenir Book" w:hAnsi="Avenir Book"/>
+        </w:rPr>
+        <w:t>y una línea de tendencia con marcadores. Esta configuración multi-panel permite comparaciones simultáneas entre especies, identificación de cuáles presentan mayor variabilidad temporal, y detección de patrones específicos de cada tipo de plaga que podrían requerir estrategias de control diferenciadas.</w:t>
+      </w:r>
+    </w:p>
+    <w:p>
+      <w:r>
+        <w:t>{{correctivo_4_plot}}</w:t>
+      </w:r>
+    </w:p>
+    <w:p>
+      <w:r>
+        <w:t>{{correctivo_4_tabla}}</w:t>
       </w:r>
     </w:p>
     <w:p/>
@@ -2534,7 +3633,6 @@
         <w:rPr>
           <w:rFonts w:ascii="Avenir Book" w:hAnsi="Avenir Book"/>
         </w:rPr>
-        <w:lastRenderedPageBreak/>
         <w:t>Aprobar mapa de puntos de control de lámparas para el HU</w:t>
       </w:r>
     </w:p>
@@ -2745,11 +3843,22 @@
             </w:r>
           </w:p>
           <w:p>
-            <w:fldSimple w:instr=" DOCVARIABLE &quot;asesor&quot; ">
-              <w:r>
-                <w:t>Fernando Q</w:t>
-              </w:r>
-            </w:fldSimple>
+            <w:r>
+              <w:lastRenderedPageBreak/>
+              <w:fldChar w:fldCharType="begin"/>
+            </w:r>
+            <w:r>
+              <w:instrText xml:space="preserve"> DOCVARIABLE "asesor" </w:instrText>
+            </w:r>
+            <w:r>
+              <w:fldChar w:fldCharType="separate"/>
+            </w:r>
+            <w:r>
+              <w:t>Fernando Q</w:t>
+            </w:r>
+            <w:r>
+              <w:fldChar w:fldCharType="end"/>
+            </w:r>
             <w:r>
               <w:t>uintero</w:t>
             </w:r>
@@ -2768,19 +3877,39 @@
             <w:r>
               <w:t xml:space="preserve">Celular:  </w:t>
             </w:r>
-            <w:fldSimple w:instr=" DOCVARIABLE &quot;cel_asesor&quot; ">
-              <w:r>
-                <w:t>311 622 60 19</w:t>
-              </w:r>
-            </w:fldSimple>
+            <w:r>
+              <w:fldChar w:fldCharType="begin"/>
+            </w:r>
+            <w:r>
+              <w:instrText xml:space="preserve"> DOCVARIABLE "cel_asesor" </w:instrText>
+            </w:r>
+            <w:r>
+              <w:fldChar w:fldCharType="separate"/>
+            </w:r>
+            <w:r>
+              <w:t>311 622 60 19</w:t>
+            </w:r>
+            <w:r>
+              <w:fldChar w:fldCharType="end"/>
+            </w:r>
             <w:r>
               <w:t xml:space="preserve">  -   310 469 50 50                                                                             e-mail: </w:t>
             </w:r>
-            <w:fldSimple w:instr=" DOCVARIABLE &quot;e_asesor&quot; ">
-              <w:r>
-                <w:t>splagasmedellin@gmail.co</w:t>
-              </w:r>
-            </w:fldSimple>
+            <w:r>
+              <w:fldChar w:fldCharType="begin"/>
+            </w:r>
+            <w:r>
+              <w:instrText xml:space="preserve"> DOCVARIABLE "e_asesor" </w:instrText>
+            </w:r>
+            <w:r>
+              <w:fldChar w:fldCharType="separate"/>
+            </w:r>
+            <w:r>
+              <w:t>splagasmedellin@gmail.co</w:t>
+            </w:r>
+            <w:r>
+              <w:fldChar w:fldCharType="end"/>
+            </w:r>
             <w:r>
               <w:t>m</w:t>
             </w:r>
@@ -2803,6 +3932,7 @@
                 <w:noProof/>
                 <w:lang w:val="en-US"/>
               </w:rPr>
+              <w:lastRenderedPageBreak/>
               <w:drawing>
                 <wp:anchor distT="0" distB="0" distL="114300" distR="114300" simplePos="0" relativeHeight="251659264" behindDoc="1" locked="0" layoutInCell="1" allowOverlap="1" wp14:anchorId="6AF3BE56" wp14:editId="69CA2514">
                   <wp:simplePos x="0" y="0"/>

</xml_diff>

<commit_message>
modificar las descripciones de las figuras en la planialla de word
</commit_message>
<xml_diff>
--- a/Plantilla.docx
+++ b/Plantilla.docx
@@ -1533,7 +1533,6 @@
         <w:t>Registro control de insectos rastreros. PREVENTIVOS</w:t>
       </w:r>
     </w:p>
-    <w:p/>
     <w:p>
       <w:pPr>
         <w:jc w:val="both"/>
@@ -1545,38 +1544,82 @@
         <w:rPr>
           <w:rFonts w:ascii="Avenir Light" w:hAnsi="Avenir Light" w:cs="Times New Roman"/>
         </w:rPr>
-        <w:t>La gráfica # 1 refleja la cantidad de órdenes, la cantidad de subáreas controladas y la cantidad de subáreas con plagas.</w:t>
-      </w:r>
-      <w:r>
+        <w:t>El siguiente gráfico compara tres métricas por mes: la cantidad total de órdenes de mantenimiento preventivo, la cantidad de subáreas inspeccionadas y el número de subáreas que presentaron evidencia de plagas. Cada mes se representa con tres barras verticales una al lado de la otra, permitiendo una comparación visual directa entre el volumen total de trabajo, la cobertura de inspección y los casos que requirieron intervención por presencia de plagas.</w:t>
+      </w:r>
+    </w:p>
+    <w:p>
+      <w:r>
+        <w:t>{{preventivos</w:t>
+      </w:r>
+      <w:r>
+        <w:t>_1</w:t>
+      </w:r>
+      <w:r>
+        <w:t>_plot}}</w:t>
+      </w:r>
+    </w:p>
+    <w:p>
+      <w:r>
+        <w:t>{{preventivos_</w:t>
+      </w:r>
+      <w:r>
+        <w:t>1_</w:t>
+      </w:r>
+      <w:r>
+        <w:t>tabla}}</w:t>
+      </w:r>
+    </w:p>
+    <w:p>
+      <w:pPr>
+        <w:jc w:val="both"/>
         <w:rPr>
           <w:rFonts w:ascii="Avenir Light" w:hAnsi="Avenir Light" w:cs="Times New Roman"/>
         </w:rPr>
-        <w:t xml:space="preserve"> La tabla con todos los valores es incluida para seguimiento y mayor detalle. </w:t>
-      </w:r>
-    </w:p>
-    <w:p>
-      <w:r>
-        <w:t>{{preventivos</w:t>
-      </w:r>
-      <w:r>
-        <w:t>_1</w:t>
-      </w:r>
-      <w:r>
-        <w:t>_plot}}</w:t>
-      </w:r>
-    </w:p>
-    <w:p>
-      <w:r>
-        <w:t>{{preventivos_</w:t>
-      </w:r>
-      <w:r>
-        <w:t>1_</w:t>
-      </w:r>
-      <w:r>
-        <w:t>tabla}}</w:t>
-      </w:r>
-    </w:p>
-    <w:p/>
+      </w:pPr>
+      <w:r>
+        <w:rPr>
+          <w:rFonts w:ascii="Avenir Light" w:hAnsi="Avenir Light" w:cs="Times New Roman"/>
+        </w:rPr>
+        <w:t>El siguiente gráfico desglosa la información de hallazgos de plagas por especie a lo largo del tiempo. Cada panel corresponde a una especie diferente y muestra su evolución mensual mediante barras que representan el volumen de capturas y una línea de tendencia con marcadores. Est</w:t>
+      </w:r>
+      <w:r>
+        <w:rPr>
+          <w:rFonts w:ascii="Avenir Light" w:hAnsi="Avenir Light" w:cs="Times New Roman"/>
+        </w:rPr>
+        <w:t xml:space="preserve">e gráfico permite </w:t>
+      </w:r>
+      <w:r>
+        <w:rPr>
+          <w:rFonts w:ascii="Avenir Light" w:hAnsi="Avenir Light" w:cs="Times New Roman"/>
+        </w:rPr>
+        <w:t>comparaciones simultáneas entre especies</w:t>
+      </w:r>
+      <w:r>
+        <w:rPr>
+          <w:rFonts w:ascii="Avenir Light" w:hAnsi="Avenir Light" w:cs="Times New Roman"/>
+        </w:rPr>
+        <w:t xml:space="preserve"> y</w:t>
+      </w:r>
+      <w:r>
+        <w:rPr>
+          <w:rFonts w:ascii="Avenir Light" w:hAnsi="Avenir Light" w:cs="Times New Roman"/>
+        </w:rPr>
+        <w:t xml:space="preserve"> detección de patrones específicos de cada tipo de plaga que podrían requerir estrategias de control diferenciadas.</w:t>
+      </w:r>
+    </w:p>
+    <w:p>
+      <w:r>
+        <w:t>{{preventivos_2_plot}</w:t>
+      </w:r>
+      <w:r>
+        <w:t>}</w:t>
+      </w:r>
+    </w:p>
+    <w:p>
+      <w:r>
+        <w:t>{{preventivos_2_tabla}}</w:t>
+      </w:r>
+    </w:p>
     <w:p>
       <w:pPr>
         <w:jc w:val="both"/>
@@ -1588,75 +1631,15 @@
         <w:rPr>
           <w:rFonts w:ascii="Avenir Light" w:hAnsi="Avenir Light" w:cs="Times New Roman"/>
         </w:rPr>
-        <w:t xml:space="preserve">La gráfica # </w:t>
-      </w:r>
-      <w:r>
-        <w:rPr>
-          <w:rFonts w:ascii="Avenir Light" w:hAnsi="Avenir Light" w:cs="Times New Roman"/>
-        </w:rPr>
-        <w:t xml:space="preserve">2 refleja </w:t>
-      </w:r>
-      <w:r>
-        <w:rPr>
-          <w:rFonts w:ascii="Avenir Light" w:hAnsi="Avenir Light" w:cs="Times New Roman"/>
-        </w:rPr>
-        <w:t xml:space="preserve">la cantidad de </w:t>
-      </w:r>
-      <w:r>
-        <w:rPr>
-          <w:rFonts w:ascii="Avenir Light" w:hAnsi="Avenir Light" w:cs="Times New Roman"/>
-        </w:rPr>
-        <w:t>diversas plagas encontradas en el tiempo</w:t>
-      </w:r>
-      <w:r>
-        <w:rPr>
-          <w:rFonts w:ascii="Avenir Light" w:hAnsi="Avenir Light" w:cs="Times New Roman"/>
-        </w:rPr>
-        <w:t>.</w:t>
-      </w:r>
-      <w:r>
-        <w:rPr>
-          <w:rFonts w:ascii="Avenir Light" w:hAnsi="Avenir Light" w:cs="Times New Roman"/>
-        </w:rPr>
-        <w:t xml:space="preserve"> La tabla con todos los valores es incluida para seguimiento y mayor detalle. </w:t>
-      </w:r>
-    </w:p>
-    <w:p>
-      <w:r>
-        <w:t>{{preventivos_2_plot}</w:t>
-      </w:r>
-      <w:r>
-        <w:t>}</w:t>
-      </w:r>
-    </w:p>
-    <w:p>
-      <w:r>
-        <w:t>{{preventivos_2_tabla}}</w:t>
-      </w:r>
-    </w:p>
-    <w:p/>
+        <w:t>El siguiente gráfico muestra la evolución temporal del total de plagas eliminadas en órdenes preventivas. Las barras representan el volumen total mensual de todas las especies combinadas, mientras que la línea negra conecta los puntos de datos creando una trayectoria clara de la tendencia a lo largo del tiempo.</w:t>
+      </w:r>
+    </w:p>
     <w:p>
       <w:pPr>
         <w:jc w:val="both"/>
-        <w:rPr>
-          <w:rFonts w:ascii="Avenir Light" w:hAnsi="Avenir Light" w:cs="Times New Roman"/>
-        </w:rPr>
-      </w:pPr>
-      <w:r>
-        <w:rPr>
-          <w:rFonts w:ascii="Avenir Light" w:hAnsi="Avenir Light" w:cs="Times New Roman"/>
-        </w:rPr>
-        <w:t xml:space="preserve">La gráfica # </w:t>
-      </w:r>
-      <w:r>
-        <w:rPr>
-          <w:rFonts w:ascii="Avenir Light" w:hAnsi="Avenir Light" w:cs="Times New Roman"/>
-        </w:rPr>
-        <w:t xml:space="preserve">3 refleja el consolidado total de plagas eliminadas por mes. La tabla con todos los valores es incluida para seguimiento y mayor detalle. </w:t>
-      </w:r>
-    </w:p>
-    <w:p>
-      <w:r>
+      </w:pPr>
+      <w:r>
+        <w:lastRenderedPageBreak/>
         <w:t>{{preventivos_3_plot}}</w:t>
       </w:r>
     </w:p>
@@ -1665,7 +1648,6 @@
         <w:t>{{preventivos_3_tabla}}</w:t>
       </w:r>
     </w:p>
-    <w:p/>
     <w:p>
       <w:pPr>
         <w:pBdr>
@@ -1684,46 +1666,34 @@
     </w:p>
     <w:p>
       <w:pPr>
-        <w:rPr>
-          <w:rFonts w:ascii="Avenir Book" w:hAnsi="Avenir Book"/>
-        </w:rPr>
-      </w:pPr>
-    </w:p>
-    <w:p>
-      <w:pPr>
-        <w:rPr>
-          <w:rFonts w:ascii="Avenir Book" w:hAnsi="Avenir Book"/>
-        </w:rPr>
-      </w:pPr>
-      <w:r>
-        <w:rPr>
-          <w:rFonts w:ascii="Avenir Book" w:hAnsi="Avenir Book"/>
-        </w:rPr>
-        <w:t xml:space="preserve">La gráfica # 1 refleja </w:t>
-      </w:r>
-      <w:r>
-        <w:rPr>
-          <w:rFonts w:ascii="Avenir Book" w:hAnsi="Avenir Book"/>
-        </w:rPr>
-        <w:t>es estado de la estaciones</w:t>
-      </w:r>
-      <w:r>
-        <w:rPr>
-          <w:rFonts w:ascii="Avenir Book" w:hAnsi="Avenir Book"/>
-        </w:rPr>
-        <w:t xml:space="preserve"> portacebos instaladas en el hospital </w:t>
-      </w:r>
-      <w:r>
-        <w:rPr>
-          <w:rFonts w:ascii="Avenir Book" w:hAnsi="Avenir Book"/>
-        </w:rPr>
-        <w:t xml:space="preserve">en el tiempo, permitiendo entender las tendencias y los patrones y como estas estaciones se comportan en el tiempo. </w:t>
-      </w:r>
-      <w:r>
-        <w:rPr>
-          <w:rFonts w:ascii="Avenir Book" w:hAnsi="Avenir Book" w:cs="Times New Roman"/>
-        </w:rPr>
-        <w:t>La tabla con todos los valores es incluida para seguimiento y mayor detalle.</w:t>
+        <w:jc w:val="both"/>
+        <w:rPr>
+          <w:rFonts w:ascii="Avenir Book" w:hAnsi="Avenir Book"/>
+        </w:rPr>
+      </w:pPr>
+      <w:r>
+        <w:rPr>
+          <w:rFonts w:ascii="Avenir Book" w:hAnsi="Avenir Book"/>
+        </w:rPr>
+        <w:t xml:space="preserve">El siguiente gráfico desglosa el estado de las estaciones de control de roedores por categoría a lo largo del tiempo. Cada </w:t>
+      </w:r>
+      <w:r>
+        <w:rPr>
+          <w:rFonts w:ascii="Avenir Book" w:hAnsi="Avenir Book"/>
+        </w:rPr>
+        <w:t>panel</w:t>
+      </w:r>
+      <w:r>
+        <w:rPr>
+          <w:rFonts w:ascii="Avenir Book" w:hAnsi="Avenir Book"/>
+        </w:rPr>
+        <w:t xml:space="preserve"> corresponde a un estado diferente de la estación (Cambio de cebo por consumo, Intacto, Deteriorado, etc.) y muestra su evolución mensual mediante barras que representan la cantidad y una línea de tendencia</w:t>
+      </w:r>
+      <w:r>
+        <w:rPr>
+          <w:rFonts w:ascii="Avenir Book" w:hAnsi="Avenir Book"/>
+        </w:rPr>
+        <w:t>.</w:t>
       </w:r>
     </w:p>
     <w:p>
@@ -1738,52 +1708,24 @@
     </w:p>
     <w:p>
       <w:pPr>
-        <w:rPr>
-          <w:rFonts w:ascii="Avenir Book" w:hAnsi="Avenir Book"/>
-        </w:rPr>
-      </w:pPr>
-    </w:p>
-    <w:p>
-      <w:pPr>
-        <w:rPr>
-          <w:rFonts w:ascii="Avenir Book" w:hAnsi="Avenir Book"/>
-        </w:rPr>
-      </w:pPr>
-      <w:r>
-        <w:rPr>
-          <w:rFonts w:ascii="Avenir Book" w:hAnsi="Avenir Book"/>
-        </w:rPr>
-        <w:t xml:space="preserve">La gráfica # </w:t>
-      </w:r>
-      <w:r>
-        <w:rPr>
-          <w:rFonts w:ascii="Avenir Book" w:hAnsi="Avenir Book"/>
-        </w:rPr>
-        <w:t>2</w:t>
-      </w:r>
-      <w:r>
-        <w:rPr>
-          <w:rFonts w:ascii="Avenir Book" w:hAnsi="Avenir Book"/>
-        </w:rPr>
-        <w:t xml:space="preserve"> refleja </w:t>
-      </w:r>
-      <w:r>
-        <w:rPr>
-          <w:rFonts w:ascii="Avenir Book" w:hAnsi="Avenir Book"/>
-        </w:rPr>
-        <w:t xml:space="preserve">la tendencia de eliminación mensual de roedores medida como la cantidad de estaciones que presentan consumo de manera mensual </w:t>
-      </w:r>
-      <w:r>
-        <w:rPr>
-          <w:rFonts w:ascii="Avenir Book" w:hAnsi="Avenir Book"/>
-        </w:rPr>
-        <w:t>comenzando el análisis en el mes de septiembre de 202</w:t>
-      </w:r>
-      <w:r>
-        <w:rPr>
-          <w:rFonts w:ascii="Avenir Book" w:hAnsi="Avenir Book"/>
-        </w:rPr>
-        <w:t>5</w:t>
+        <w:jc w:val="both"/>
+        <w:rPr>
+          <w:rFonts w:ascii="Avenir Book" w:hAnsi="Avenir Book"/>
+        </w:rPr>
+      </w:pPr>
+      <w:r>
+        <w:rPr>
+          <w:rFonts w:ascii="Avenir Book" w:hAnsi="Avenir Book"/>
+        </w:rPr>
+        <w:t xml:space="preserve">El siguiente gráfico muestra la evolución temporal de la eliminación de roedores </w:t>
+      </w:r>
+      <w:r>
+        <w:rPr>
+          <w:rFonts w:ascii="Avenir Book" w:hAnsi="Avenir Book"/>
+          <w:b/>
+          <w:bCs/>
+        </w:rPr>
+        <w:t>basada en el consumo de cebo</w:t>
       </w:r>
       <w:r>
         <w:rPr>
@@ -1793,9 +1735,15 @@
       </w:r>
       <w:r>
         <w:rPr>
-          <w:rFonts w:ascii="Avenir Book" w:hAnsi="Avenir Book" w:cs="Times New Roman"/>
-        </w:rPr>
-        <w:t>La tabla con todos los valores es incluida para seguimiento y mayor detalle.</w:t>
+          <w:rFonts w:ascii="Avenir Book" w:hAnsi="Avenir Book"/>
+        </w:rPr>
+        <w:t>La</w:t>
+      </w:r>
+      <w:r>
+        <w:rPr>
+          <w:rFonts w:ascii="Avenir Book" w:hAnsi="Avenir Book"/>
+        </w:rPr>
+        <w:t xml:space="preserve"> línea negra conecta los puntos de datos creando una trayectoria clara de la tendencia a lo largo del tiempo, permitiendo evaluar la presión de roedores y la efectividad del programa de control.</w:t>
       </w:r>
     </w:p>
     <w:p>
@@ -1808,7 +1756,6 @@
         <w:t>{{roedores_2_tabla}}</w:t>
       </w:r>
     </w:p>
-    <w:p/>
     <w:p>
       <w:pPr>
         <w:pBdr>
@@ -1823,211 +1770,266 @@
           <w:bCs/>
         </w:rPr>
       </w:pPr>
-    </w:p>
-    <w:p>
-      <w:pPr>
+      <w:r>
         <w:rPr>
           <w:b/>
           <w:bCs/>
         </w:rPr>
-      </w:pPr>
-      <w:r>
-        <w:rPr>
+        <w:t>Registro control de insectos voladores. Consolidado mensual y tendencia. LAMPARAS</w:t>
+      </w:r>
+    </w:p>
+    <w:p>
+      <w:pPr>
+        <w:jc w:val="both"/>
+        <w:rPr>
+          <w:rFonts w:ascii="Avenir Book" w:hAnsi="Avenir Book"/>
+        </w:rPr>
+      </w:pPr>
+      <w:r>
+        <w:rPr>
+          <w:rFonts w:ascii="Avenir Book" w:hAnsi="Avenir Book"/>
+        </w:rPr>
+        <w:t xml:space="preserve">El siguiente gráfico desglosa el estado de las lámparas por categoría a lo largo del tiempo. Cada </w:t>
+      </w:r>
+      <w:r>
+        <w:rPr>
+          <w:rFonts w:ascii="Avenir Book" w:hAnsi="Avenir Book"/>
+        </w:rPr>
+        <w:t>subgráfico</w:t>
+      </w:r>
+      <w:r>
+        <w:rPr>
+          <w:rFonts w:ascii="Avenir Book" w:hAnsi="Avenir Book"/>
+        </w:rPr>
+        <w:t xml:space="preserve"> corresponde a un estado diferente de la lámpara (Buena potencia, Deteriorada, Apagada, etc.) y muestra su evolución mensual mediante barras que representan la cantidad y una línea de tendencia con marcadores. </w:t>
+      </w:r>
+    </w:p>
+    <w:p>
+      <w:r>
+        <w:t>{{lamparas_1_plot}}</w:t>
+      </w:r>
+    </w:p>
+    <w:p>
+      <w:r>
+        <w:t>{{lamparas_1_tabla}}</w:t>
+      </w:r>
+    </w:p>
+    <w:p>
+      <w:pPr>
+        <w:jc w:val="both"/>
+      </w:pPr>
+      <w:r>
+        <w:rPr>
+          <w:rFonts w:ascii="Avenir Book" w:hAnsi="Avenir Book"/>
+        </w:rPr>
+        <w:t xml:space="preserve">El siguiente gráfico presenta una visualización de dispersión con burbujas que muestra el estado de las lámparas por área en </w:t>
+      </w:r>
+      <w:r>
+        <w:rPr>
+          <w:rFonts w:ascii="Avenir Book" w:hAnsi="Avenir Book"/>
           <w:b/>
           <w:bCs/>
         </w:rPr>
-        <w:t>Registro control de insectos voladores. Consolidado mensual y tendencia. LAMPARAS</w:t>
+        <w:t>el mes más reciente</w:t>
+      </w:r>
+      <w:r>
+        <w:rPr>
+          <w:rFonts w:ascii="Avenir Book" w:hAnsi="Avenir Book"/>
+        </w:rPr>
+        <w:t>. Cada fila representa un área específica, cada columna representa un estado de la lámpara, y el tamaño de las burbujas indica la cantidad de lámparas en ese estado. Los colores facilitan la identificación rápida de situaciones críticas (</w:t>
+      </w:r>
+      <w:r>
+        <w:rPr>
+          <w:rFonts w:ascii="Avenir Book" w:hAnsi="Avenir Book"/>
+          <w:color w:val="DE433B"/>
+        </w:rPr>
+        <w:t>rojo</w:t>
+      </w:r>
+      <w:r>
+        <w:rPr>
+          <w:rFonts w:ascii="Avenir Book" w:hAnsi="Avenir Book"/>
+        </w:rPr>
+        <w:t>)</w:t>
+      </w:r>
+      <w:r>
+        <w:rPr>
+          <w:rFonts w:ascii="Avenir Book" w:hAnsi="Avenir Book"/>
+        </w:rPr>
+        <w:t>, situaciones que requieren intervención pero no son críticas (</w:t>
+      </w:r>
+      <w:r>
+        <w:rPr>
+          <w:rFonts w:ascii="Avenir Book" w:hAnsi="Avenir Book"/>
+          <w:color w:val="F18B2C"/>
+        </w:rPr>
+        <w:t>naranja</w:t>
+      </w:r>
+      <w:r>
+        <w:rPr>
+          <w:rFonts w:ascii="Avenir Book" w:hAnsi="Avenir Book"/>
+        </w:rPr>
+        <w:t xml:space="preserve">) y </w:t>
+      </w:r>
+      <w:r>
+        <w:rPr>
+          <w:rFonts w:ascii="Avenir Book" w:hAnsi="Avenir Book"/>
+        </w:rPr>
+        <w:t>condiciones óptimas (</w:t>
+      </w:r>
+      <w:r>
+        <w:rPr>
+          <w:rFonts w:ascii="Avenir Book" w:hAnsi="Avenir Book"/>
+          <w:color w:val="57A177"/>
+        </w:rPr>
+        <w:t>verde</w:t>
+      </w:r>
+      <w:r>
+        <w:rPr>
+          <w:rFonts w:ascii="Avenir Book" w:hAnsi="Avenir Book"/>
+        </w:rPr>
+        <w:t xml:space="preserve">), permitiendo priorizar áreas que requieren </w:t>
+      </w:r>
+      <w:r>
+        <w:rPr>
+          <w:rFonts w:ascii="Avenir Book" w:hAnsi="Avenir Book"/>
+        </w:rPr>
+        <w:t>acciones</w:t>
+      </w:r>
+      <w:r>
+        <w:rPr>
+          <w:rFonts w:ascii="Avenir Book" w:hAnsi="Avenir Book"/>
+        </w:rPr>
+        <w:t xml:space="preserve"> inmediat</w:t>
+      </w:r>
+      <w:r>
+        <w:rPr>
+          <w:rFonts w:ascii="Avenir Book" w:hAnsi="Avenir Book"/>
+        </w:rPr>
+        <w:t>as</w:t>
+      </w:r>
+      <w:r>
+        <w:rPr>
+          <w:rFonts w:ascii="Avenir Book" w:hAnsi="Avenir Book"/>
+        </w:rPr>
+        <w:t>.</w:t>
+      </w:r>
+    </w:p>
+    <w:p>
+      <w:r>
+        <w:t>{{lamparas_2_plot}}</w:t>
+      </w:r>
+    </w:p>
+    <w:p>
+      <w:r>
+        <w:t>{{lamparas_2_tabla}}</w:t>
       </w:r>
     </w:p>
     <w:p/>
     <w:p>
       <w:pPr>
-        <w:rPr>
-          <w:rFonts w:ascii="Avenir Book" w:hAnsi="Avenir Book"/>
-        </w:rPr>
-      </w:pPr>
-      <w:r>
-        <w:rPr>
-          <w:rFonts w:ascii="Avenir Book" w:hAnsi="Avenir Book"/>
-        </w:rPr>
-        <w:t xml:space="preserve">La gráfica # </w:t>
-      </w:r>
-      <w:r>
-        <w:rPr>
-          <w:rFonts w:ascii="Avenir Book" w:hAnsi="Avenir Book"/>
-        </w:rPr>
-        <w:t>1</w:t>
-      </w:r>
-      <w:r>
-        <w:rPr>
-          <w:rFonts w:ascii="Avenir Book" w:hAnsi="Avenir Book"/>
-        </w:rPr>
-        <w:t xml:space="preserve"> refleja </w:t>
-      </w:r>
-      <w:r>
-        <w:rPr>
-          <w:rFonts w:ascii="Avenir Book" w:hAnsi="Avenir Book"/>
-        </w:rPr>
-        <w:t xml:space="preserve">los cambios en los estados de las estaciones en el tiempo </w:t>
-      </w:r>
-      <w:r>
-        <w:rPr>
-          <w:rFonts w:ascii="Avenir Book" w:hAnsi="Avenir Book"/>
-        </w:rPr>
-        <w:t>comenzando en el mes de septiembre de 202</w:t>
-      </w:r>
-      <w:r>
-        <w:rPr>
-          <w:rFonts w:ascii="Avenir Book" w:hAnsi="Avenir Book"/>
-        </w:rPr>
-        <w:t>5</w:t>
-      </w:r>
-      <w:r>
-        <w:rPr>
-          <w:rFonts w:ascii="Avenir Book" w:hAnsi="Avenir Book"/>
-        </w:rPr>
-        <w:t xml:space="preserve">. </w:t>
-      </w:r>
-      <w:r>
-        <w:rPr>
-          <w:rFonts w:ascii="Avenir Book" w:hAnsi="Avenir Book" w:cs="Times New Roman"/>
-        </w:rPr>
-        <w:t>La tabla con todos los valores es incluida para seguimiento y mayor detalle.</w:t>
-      </w:r>
-    </w:p>
-    <w:p>
-      <w:r>
-        <w:t>{{lamparas_1_plot}}</w:t>
-      </w:r>
-    </w:p>
-    <w:p>
-      <w:r>
-        <w:t>{{lamparas_1_tabla}}</w:t>
-      </w:r>
-    </w:p>
-    <w:p/>
-    <w:p>
-      <w:pPr>
-        <w:rPr>
-          <w:rFonts w:ascii="Avenir Book" w:hAnsi="Avenir Book"/>
-        </w:rPr>
-      </w:pPr>
-      <w:r>
-        <w:rPr>
-          <w:rFonts w:ascii="Avenir Book" w:hAnsi="Avenir Book"/>
-        </w:rPr>
-        <w:t xml:space="preserve">La gráfica # </w:t>
-      </w:r>
-      <w:r>
-        <w:rPr>
-          <w:rFonts w:ascii="Avenir Book" w:hAnsi="Avenir Book"/>
-        </w:rPr>
-        <w:t>2</w:t>
-      </w:r>
-      <w:r>
-        <w:rPr>
-          <w:rFonts w:ascii="Avenir Book" w:hAnsi="Avenir Book"/>
-        </w:rPr>
-        <w:t xml:space="preserve"> </w:t>
-      </w:r>
-      <w:r>
-        <w:rPr>
-          <w:rFonts w:ascii="Avenir Book" w:hAnsi="Avenir Book"/>
-        </w:rPr>
-        <w:t xml:space="preserve">lista las areas con lámpara y el estado en el que esas lámparas han estado en cada visita. La columna final lista el total de visitas a esa lámpara en el </w:t>
-      </w:r>
-      <w:r>
+        <w:jc w:val="both"/>
+        <w:rPr>
+          <w:rFonts w:ascii="Avenir Book" w:hAnsi="Avenir Book"/>
+        </w:rPr>
+      </w:pPr>
+      <w:r>
+        <w:rPr>
+          <w:rFonts w:ascii="Avenir Book" w:hAnsi="Avenir Book"/>
+        </w:rPr>
+        <w:lastRenderedPageBreak/>
+        <w:t xml:space="preserve">El siguiente gráfico </w:t>
+      </w:r>
+      <w:r>
+        <w:rPr>
+          <w:rFonts w:ascii="Avenir Book" w:hAnsi="Avenir Book"/>
+        </w:rPr>
+        <w:t>muestra</w:t>
+      </w:r>
+      <w:r>
+        <w:rPr>
+          <w:rFonts w:ascii="Avenir Book" w:hAnsi="Avenir Book"/>
+        </w:rPr>
+        <w:t xml:space="preserve"> las capturas por especie a lo largo del tiempo. Cada </w:t>
+      </w:r>
+      <w:r>
+        <w:rPr>
+          <w:rFonts w:ascii="Avenir Book" w:hAnsi="Avenir Book"/>
+        </w:rPr>
+        <w:t>subgráfico</w:t>
+      </w:r>
+      <w:r>
+        <w:rPr>
+          <w:rFonts w:ascii="Avenir Book" w:hAnsi="Avenir Book"/>
+        </w:rPr>
+        <w:t xml:space="preserve"> corresponde a una especie diferente capturada por las lámparas y muestra su evolución mensual mediante barras que representan el volumen de capturas y una línea de tendencia</w:t>
+      </w:r>
+      <w:r>
+        <w:rPr>
+          <w:rFonts w:ascii="Avenir Book" w:hAnsi="Avenir Book"/>
+        </w:rPr>
+        <w:t xml:space="preserve">, mostrando así </w:t>
+      </w:r>
+      <w:r>
+        <w:rPr>
+          <w:rFonts w:ascii="Avenir Book" w:hAnsi="Avenir Book"/>
+        </w:rPr>
+        <w:t xml:space="preserve">patrones específicos </w:t>
+      </w:r>
+      <w:r>
+        <w:rPr>
+          <w:rFonts w:ascii="Avenir Book" w:hAnsi="Avenir Book"/>
+        </w:rPr>
+        <w:t>a lo largo del tiempo.</w:t>
+      </w:r>
+    </w:p>
+    <w:p>
+      <w:r>
+        <w:t>{{lamparas_3_plot}}</w:t>
+      </w:r>
+    </w:p>
+    <w:p>
+      <w:r>
+        <w:t>{{lamparas_3_tabla}}</w:t>
+      </w:r>
+    </w:p>
+    <w:p>
+      <w:pPr>
+        <w:jc w:val="both"/>
         <w:rPr>
           <w:rFonts w:ascii="Avenir Light" w:hAnsi="Avenir Light" w:cs="Times New Roman"/>
         </w:rPr>
-        <w:t>{{mes_de_analisis}}</w:t>
-      </w:r>
-      <w:r>
-        <w:rPr>
-          <w:rFonts w:ascii="Avenir Book" w:hAnsi="Avenir Book"/>
-        </w:rPr>
-        <w:t xml:space="preserve">. </w:t>
-      </w:r>
-      <w:r>
-        <w:rPr>
-          <w:rFonts w:ascii="Avenir Book" w:hAnsi="Avenir Book" w:cs="Times New Roman"/>
-        </w:rPr>
-        <w:t>La tabla con todos los valores es incluida para seguimiento y mayor detalle.</w:t>
-      </w:r>
-    </w:p>
-    <w:p/>
-    <w:p>
-      <w:r>
-        <w:lastRenderedPageBreak/>
-        <w:t>{{lamparas_2_plot}}</w:t>
-      </w:r>
-    </w:p>
-    <w:p>
-      <w:r>
-        <w:t>{{lamparas_2_tabla}}</w:t>
-      </w:r>
-    </w:p>
-    <w:p/>
-    <w:p>
-      <w:pPr>
-        <w:rPr>
-          <w:rFonts w:ascii="Avenir Book" w:hAnsi="Avenir Book"/>
-        </w:rPr>
-      </w:pPr>
-      <w:r>
-        <w:rPr>
-          <w:rFonts w:ascii="Avenir Book" w:hAnsi="Avenir Book"/>
-        </w:rPr>
-        <w:t xml:space="preserve">La gráfica # </w:t>
-      </w:r>
-      <w:r>
-        <w:rPr>
-          <w:rFonts w:ascii="Avenir Book" w:hAnsi="Avenir Book"/>
-        </w:rPr>
-        <w:t>3 muestra la tendencia mensual de la cantidad de plagas mayoritariamente voladoras encontradas en total separada por especies</w:t>
-      </w:r>
-      <w:r>
-        <w:rPr>
-          <w:rFonts w:ascii="Avenir Book" w:hAnsi="Avenir Book"/>
-        </w:rPr>
-        <w:t xml:space="preserve">. </w:t>
-      </w:r>
-      <w:r>
-        <w:rPr>
-          <w:rFonts w:ascii="Avenir Book" w:hAnsi="Avenir Book" w:cs="Times New Roman"/>
-        </w:rPr>
-        <w:t>La tabla con todos los valores es incluida para seguimiento y mayor detalle.</w:t>
-      </w:r>
-    </w:p>
-    <w:p>
-      <w:r>
-        <w:t>{{lamparas_3_plot}}</w:t>
-      </w:r>
-    </w:p>
-    <w:p>
-      <w:r>
-        <w:t>{{lamparas_3_tabla}}</w:t>
-      </w:r>
-    </w:p>
-    <w:p/>
-    <w:p>
-      <w:pPr>
-        <w:jc w:val="both"/>
+      </w:pPr>
+      <w:r>
         <w:rPr>
           <w:rFonts w:ascii="Avenir Light" w:hAnsi="Avenir Light" w:cs="Times New Roman"/>
         </w:rPr>
-      </w:pPr>
+        <w:t xml:space="preserve">El siguiente gráfico muestra la evolución temporal del total de capturas de insectos realizadas por las lámparas. Las barras representan el volumen total mensual de </w:t>
+      </w:r>
       <w:r>
         <w:rPr>
           <w:rFonts w:ascii="Avenir Light" w:hAnsi="Avenir Light" w:cs="Times New Roman"/>
-        </w:rPr>
-        <w:t xml:space="preserve">La gráfica # </w:t>
+          <w:b/>
+          <w:bCs/>
+        </w:rPr>
+        <w:t>todas las especies combinadas</w:t>
       </w:r>
       <w:r>
         <w:rPr>
           <w:rFonts w:ascii="Avenir Light" w:hAnsi="Avenir Light" w:cs="Times New Roman"/>
         </w:rPr>
-        <w:t xml:space="preserve">4 refleja el consolidado total de plagas eliminadas por mes con el mecanismo de las lámparas y láminas. La tabla con todos los valores es incluida para seguimiento y mayor detalle. </w:t>
+        <w:t xml:space="preserve">, mientras que la línea negra conecta los </w:t>
+      </w:r>
+      <w:r>
+        <w:rPr>
+          <w:rFonts w:ascii="Avenir Light" w:hAnsi="Avenir Light" w:cs="Times New Roman"/>
+        </w:rPr>
+        <w:t>valores</w:t>
+      </w:r>
+      <w:r>
+        <w:rPr>
+          <w:rFonts w:ascii="Avenir Light" w:hAnsi="Avenir Light" w:cs="Times New Roman"/>
+        </w:rPr>
+        <w:t xml:space="preserve"> creando una trayectoria clara de la tendencia a lo largo del tiempo, permitiendo evaluar la efectividad general del sistema de control de insectos voladores.</w:t>
       </w:r>
     </w:p>
     <w:p>
@@ -2073,46 +2075,103 @@
         <w:rPr>
           <w:rFonts w:ascii="Avenir Book" w:hAnsi="Avenir Book"/>
         </w:rPr>
+        <w:t xml:space="preserve">El siguiente gráfico compara dos métricas por mes: la cantidad total de órdenes de mantenimiento correctivo y el número de órdenes que reportaron evidencia de plagas. Cada mes se representa con dos barras verticales una al lado de la otra, permitiendo una comparación visual directa entre el volumen total de trabajo y los casos que requirieron intervención por presencia de plagas. </w:t>
+      </w:r>
+    </w:p>
+    <w:p>
+      <w:r>
+        <w:t>{{correctivo_1_plot}}</w:t>
+      </w:r>
+    </w:p>
+    <w:p>
+      <w:r>
+        <w:t>{{correctivo_1_tabla}}</w:t>
+      </w:r>
+    </w:p>
+    <w:p>
+      <w:pPr>
+        <w:jc w:val="both"/>
+        <w:rPr>
+          <w:rFonts w:ascii="Avenir Book" w:hAnsi="Avenir Book"/>
+        </w:rPr>
+      </w:pPr>
+      <w:r>
+        <w:rPr>
+          <w:rFonts w:ascii="Avenir Book" w:hAnsi="Avenir Book"/>
+        </w:rPr>
         <w:t xml:space="preserve">El </w:t>
       </w:r>
       <w:r>
         <w:rPr>
           <w:rFonts w:ascii="Avenir Book" w:hAnsi="Avenir Book"/>
         </w:rPr>
-        <w:t>siguiente g</w:t>
-      </w:r>
-      <w:r>
-        <w:rPr>
-          <w:rFonts w:ascii="Avenir Book" w:hAnsi="Avenir Book"/>
-        </w:rPr>
-        <w:t xml:space="preserve">ráfico compara dos métricas por mes: la cantidad total de órdenes de mantenimiento correctivo y el número de órdenes que reportaron evidencia de plagas. Cada mes se representa con dos barras verticales </w:t>
-      </w:r>
-      <w:r>
-        <w:rPr>
-          <w:rFonts w:ascii="Avenir Book" w:hAnsi="Avenir Book"/>
-        </w:rPr>
-        <w:t>una al lado de la otra</w:t>
-      </w:r>
-      <w:r>
-        <w:rPr>
-          <w:rFonts w:ascii="Avenir Book" w:hAnsi="Avenir Book"/>
-        </w:rPr>
-        <w:t xml:space="preserve">, permitiendo una comparación visual directa entre el volumen total de trabajo y los casos que requirieron intervención por presencia de plagas. </w:t>
-      </w:r>
-    </w:p>
-    <w:p>
-      <w:r>
-        <w:t>{{correctivo_1_plot}}</w:t>
-      </w:r>
-    </w:p>
-    <w:p>
-      <w:r>
-        <w:t>{{correctivo_1_tabla}}</w:t>
-      </w:r>
-    </w:p>
-    <w:p/>
-    <w:p/>
-    <w:p/>
+        <w:t xml:space="preserve">siguiente </w:t>
+      </w:r>
+      <w:r>
+        <w:rPr>
+          <w:rFonts w:ascii="Avenir Book" w:hAnsi="Avenir Book"/>
+        </w:rPr>
+        <w:t>gráfico m</w:t>
+      </w:r>
+      <w:r>
+        <w:rPr>
+          <w:rFonts w:ascii="Avenir Book" w:hAnsi="Avenir Book"/>
+        </w:rPr>
+        <w:t xml:space="preserve">uestra </w:t>
+      </w:r>
+      <w:r>
+        <w:rPr>
+          <w:rFonts w:ascii="Avenir Book" w:hAnsi="Avenir Book"/>
+        </w:rPr>
+        <w:t xml:space="preserve">la evolución temporal del total de hallazgos </w:t>
+      </w:r>
+      <w:r>
+        <w:rPr>
+          <w:rFonts w:ascii="Avenir Book" w:hAnsi="Avenir Book"/>
+        </w:rPr>
+        <w:t xml:space="preserve">encontrados en órdenes correctivas. </w:t>
+      </w:r>
+      <w:r>
+        <w:rPr>
+          <w:rFonts w:ascii="Avenir Book" w:hAnsi="Avenir Book"/>
+        </w:rPr>
+        <w:t xml:space="preserve"> </w:t>
+      </w:r>
+      <w:r>
+        <w:rPr>
+          <w:rFonts w:ascii="Avenir Book" w:hAnsi="Avenir Book"/>
+        </w:rPr>
+        <w:t xml:space="preserve">Las baras representan el </w:t>
+      </w:r>
+      <w:r>
+        <w:rPr>
+          <w:rFonts w:ascii="Avenir Book" w:hAnsi="Avenir Book"/>
+        </w:rPr>
+        <w:t xml:space="preserve">volumen </w:t>
+      </w:r>
+      <w:r>
+        <w:rPr>
+          <w:rFonts w:ascii="Avenir Book" w:hAnsi="Avenir Book"/>
+        </w:rPr>
+        <w:t xml:space="preserve">total </w:t>
+      </w:r>
+      <w:r>
+        <w:rPr>
+          <w:rFonts w:ascii="Avenir Book" w:hAnsi="Avenir Book"/>
+        </w:rPr>
+        <w:t xml:space="preserve">mensual, mientras que la línea negra conecta los puntos de datos creando una trayectoria clara de la tendencia a lo largo del tiempo. </w:t>
+      </w:r>
+    </w:p>
+    <w:p>
+      <w:r>
+        <w:t>{{correctivo_2_plot}}</w:t>
+      </w:r>
+    </w:p>
+    <w:p>
+      <w:r>
+        <w:t>{{correctivo_2_tabla}}</w:t>
+      </w:r>
+    </w:p>
     <w:p>
       <w:pPr>
         <w:jc w:val="both"/>
@@ -2124,131 +2183,7 @@
         <w:rPr>
           <w:rFonts w:ascii="Avenir Book" w:hAnsi="Avenir Book"/>
         </w:rPr>
-        <w:t xml:space="preserve">El </w:t>
-      </w:r>
-      <w:r>
-        <w:rPr>
-          <w:rFonts w:ascii="Avenir Book" w:hAnsi="Avenir Book"/>
-        </w:rPr>
-        <w:t xml:space="preserve">siguiente </w:t>
-      </w:r>
-      <w:r>
-        <w:rPr>
-          <w:rFonts w:ascii="Avenir Book" w:hAnsi="Avenir Book"/>
-        </w:rPr>
-        <w:t>gráfico m</w:t>
-      </w:r>
-      <w:r>
-        <w:rPr>
-          <w:rFonts w:ascii="Avenir Book" w:hAnsi="Avenir Book"/>
-        </w:rPr>
-        <w:t xml:space="preserve">uestra </w:t>
-      </w:r>
-      <w:r>
-        <w:rPr>
-          <w:rFonts w:ascii="Avenir Book" w:hAnsi="Avenir Book"/>
-        </w:rPr>
-        <w:t xml:space="preserve">la evolución temporal del total de hallazgos </w:t>
-      </w:r>
-      <w:r>
-        <w:rPr>
-          <w:rFonts w:ascii="Avenir Book" w:hAnsi="Avenir Book"/>
-        </w:rPr>
-        <w:t xml:space="preserve">encontrados en órdenes correctivas. </w:t>
-      </w:r>
-      <w:r>
-        <w:rPr>
-          <w:rFonts w:ascii="Avenir Book" w:hAnsi="Avenir Book"/>
-        </w:rPr>
-        <w:t xml:space="preserve"> </w:t>
-      </w:r>
-      <w:r>
-        <w:rPr>
-          <w:rFonts w:ascii="Avenir Book" w:hAnsi="Avenir Book"/>
-        </w:rPr>
-        <w:t xml:space="preserve">Las baras representan el </w:t>
-      </w:r>
-      <w:r>
-        <w:rPr>
-          <w:rFonts w:ascii="Avenir Book" w:hAnsi="Avenir Book"/>
-        </w:rPr>
-        <w:t xml:space="preserve">volumen </w:t>
-      </w:r>
-      <w:r>
-        <w:rPr>
-          <w:rFonts w:ascii="Avenir Book" w:hAnsi="Avenir Book"/>
-        </w:rPr>
-        <w:t xml:space="preserve">total </w:t>
-      </w:r>
-      <w:r>
-        <w:rPr>
-          <w:rFonts w:ascii="Avenir Book" w:hAnsi="Avenir Book"/>
-        </w:rPr>
-        <w:t xml:space="preserve">mensual, mientras que la línea negra conecta los puntos de datos creando una trayectoria clara de la tendencia a lo largo del tiempo. </w:t>
-      </w:r>
-    </w:p>
-    <w:p>
-      <w:r>
-        <w:t>{{correctivo_2_plot}}</w:t>
-      </w:r>
-    </w:p>
-    <w:p>
-      <w:r>
-        <w:t>{{correctivo_2_tabla}}</w:t>
-      </w:r>
-    </w:p>
-    <w:p/>
-    <w:p/>
-    <w:p/>
-    <w:p/>
-    <w:p>
-      <w:pPr>
-        <w:jc w:val="both"/>
-        <w:rPr>
-          <w:rFonts w:ascii="Avenir Book" w:hAnsi="Avenir Book"/>
-        </w:rPr>
-      </w:pPr>
-      <w:r>
-        <w:rPr>
-          <w:rFonts w:ascii="Avenir Book" w:hAnsi="Avenir Book"/>
-        </w:rPr>
-        <w:t xml:space="preserve">El </w:t>
-      </w:r>
-      <w:r>
-        <w:rPr>
-          <w:rFonts w:ascii="Avenir Book" w:hAnsi="Avenir Book"/>
-        </w:rPr>
-        <w:t xml:space="preserve">siguiente </w:t>
-      </w:r>
-      <w:r>
-        <w:rPr>
-          <w:rFonts w:ascii="Avenir Book" w:hAnsi="Avenir Book"/>
-        </w:rPr>
-        <w:t>gráfico presenta una visualización que analiza el nivel de infestación detectado en las órdenes de mantenimiento correctiv</w:t>
-      </w:r>
-      <w:r>
-        <w:rPr>
-          <w:rFonts w:ascii="Avenir Book" w:hAnsi="Avenir Book"/>
-        </w:rPr>
-        <w:t>as</w:t>
-      </w:r>
-      <w:r>
-        <w:rPr>
-          <w:rFonts w:ascii="Avenir Book" w:hAnsi="Avenir Book"/>
-        </w:rPr>
-        <w:t xml:space="preserve"> del mes más reciente. Cada panel corresponde a una especie de plaga diferente y muestra la distribución de órdenes clasificadas en tres categorías: Alto, Medio y Bajo. La clasificación se determina comparando la cantidad de hallazgos reportados en cada orden con los valores de referencia establecidos en la tabla </w:t>
-      </w:r>
-      <w:r>
-        <w:rPr>
-          <w:rFonts w:ascii="Avenir Book" w:hAnsi="Avenir Book"/>
-        </w:rPr>
-        <w:t>de referencia</w:t>
-      </w:r>
-      <w:r>
-        <w:rPr>
-          <w:rFonts w:ascii="Avenir Book" w:hAnsi="Avenir Book"/>
-        </w:rPr>
-        <w:t>. Las órdenes sin evidencia de plagas se excluyen del gráfico para concentrar el análisis únicamente en situaciones que requieren intervención.</w:t>
+        <w:t>El siguiente gráfico presenta una visualización que analiza el nivel de infestación detectado en las órdenes de mantenimiento correctivas del mes más reciente. Cada panel corresponde a una especie de plaga diferente y muestra la distribución de órdenes clasificadas en tres categorías: Alto, Medio y Bajo. La clasificación se determina comparando la cantidad de hallazgos reportados en cada orden con los valores de referencia establecidos en la tabla de referencia. Las órdenes sin evidencia de plagas se excluyen del gráfico para concentrar el análisis únicamente en situaciones que requieren intervención.</w:t>
       </w:r>
     </w:p>
     <w:tbl>
@@ -2402,6 +2337,7 @@
               <w:rPr>
                 <w:rFonts w:ascii="Avenir Book" w:hAnsi="Avenir Book"/>
               </w:rPr>
+              <w:lastRenderedPageBreak/>
               <w:t>Cucaracha Americana</w:t>
             </w:r>
           </w:p>
@@ -2677,13 +2613,7 @@
               <w:rPr>
                 <w:rFonts w:ascii="Avenir Book" w:hAnsi="Avenir Book"/>
               </w:rPr>
-              <w:t>1-</w:t>
-            </w:r>
-            <w:r>
-              <w:rPr>
-                <w:rFonts w:ascii="Avenir Book" w:hAnsi="Avenir Book"/>
-              </w:rPr>
-              <w:t>5</w:t>
+              <w:t>1-5</w:t>
             </w:r>
           </w:p>
         </w:tc>
@@ -3165,7 +3095,6 @@
         <w:t>{{correctivo_3_tabla}}</w:t>
       </w:r>
     </w:p>
-    <w:p/>
     <w:p>
       <w:pPr>
         <w:jc w:val="both"/>
@@ -3226,12 +3155,6 @@
         <w:t>{{correctivo_4_tabla}}</w:t>
       </w:r>
     </w:p>
-    <w:p/>
-    <w:p/>
-    <w:p/>
-    <w:p/>
-    <w:p/>
-    <w:p/>
     <w:p/>
     <w:p>
       <w:pPr>
@@ -3567,6 +3490,7 @@
         <w:rPr>
           <w:rFonts w:ascii="Avenir Book" w:hAnsi="Avenir Book"/>
         </w:rPr>
+        <w:lastRenderedPageBreak/>
         <w:t>Sellar madrigueras</w:t>
       </w:r>
     </w:p>
@@ -3843,22 +3767,11 @@
             </w:r>
           </w:p>
           <w:p>
-            <w:r>
-              <w:lastRenderedPageBreak/>
-              <w:fldChar w:fldCharType="begin"/>
-            </w:r>
-            <w:r>
-              <w:instrText xml:space="preserve"> DOCVARIABLE "asesor" </w:instrText>
-            </w:r>
-            <w:r>
-              <w:fldChar w:fldCharType="separate"/>
-            </w:r>
-            <w:r>
-              <w:t>Fernando Q</w:t>
-            </w:r>
-            <w:r>
-              <w:fldChar w:fldCharType="end"/>
-            </w:r>
+            <w:fldSimple w:instr=" DOCVARIABLE &quot;asesor&quot; ">
+              <w:r>
+                <w:t>Fernando Q</w:t>
+              </w:r>
+            </w:fldSimple>
             <w:r>
               <w:t>uintero</w:t>
             </w:r>
@@ -3877,39 +3790,19 @@
             <w:r>
               <w:t xml:space="preserve">Celular:  </w:t>
             </w:r>
-            <w:r>
-              <w:fldChar w:fldCharType="begin"/>
-            </w:r>
-            <w:r>
-              <w:instrText xml:space="preserve"> DOCVARIABLE "cel_asesor" </w:instrText>
-            </w:r>
-            <w:r>
-              <w:fldChar w:fldCharType="separate"/>
-            </w:r>
-            <w:r>
-              <w:t>311 622 60 19</w:t>
-            </w:r>
-            <w:r>
-              <w:fldChar w:fldCharType="end"/>
-            </w:r>
+            <w:fldSimple w:instr=" DOCVARIABLE &quot;cel_asesor&quot; ">
+              <w:r>
+                <w:t>311 622 60 19</w:t>
+              </w:r>
+            </w:fldSimple>
             <w:r>
               <w:t xml:space="preserve">  -   310 469 50 50                                                                             e-mail: </w:t>
             </w:r>
-            <w:r>
-              <w:fldChar w:fldCharType="begin"/>
-            </w:r>
-            <w:r>
-              <w:instrText xml:space="preserve"> DOCVARIABLE "e_asesor" </w:instrText>
-            </w:r>
-            <w:r>
-              <w:fldChar w:fldCharType="separate"/>
-            </w:r>
-            <w:r>
-              <w:t>splagasmedellin@gmail.co</w:t>
-            </w:r>
-            <w:r>
-              <w:fldChar w:fldCharType="end"/>
-            </w:r>
+            <w:fldSimple w:instr=" DOCVARIABLE &quot;e_asesor&quot; ">
+              <w:r>
+                <w:t>splagasmedellin@gmail.co</w:t>
+              </w:r>
+            </w:fldSimple>
             <w:r>
               <w:t>m</w:t>
             </w:r>
@@ -3932,7 +3825,6 @@
                 <w:noProof/>
                 <w:lang w:val="en-US"/>
               </w:rPr>
-              <w:lastRenderedPageBreak/>
               <w:drawing>
                 <wp:anchor distT="0" distB="0" distL="114300" distR="114300" simplePos="0" relativeHeight="251659264" behindDoc="1" locked="0" layoutInCell="1" allowOverlap="1" wp14:anchorId="6AF3BE56" wp14:editId="69CA2514">
                   <wp:simplePos x="0" y="0"/>

</xml_diff>

<commit_message>
Actualizar la plantilla de Word con nuevas modificaciones
</commit_message>
<xml_diff>
--- a/Plantilla.docx
+++ b/Plantilla.docx
@@ -653,11 +653,11 @@
         <w:tblLook w:val="04A0" w:firstRow="1" w:lastRow="0" w:firstColumn="1" w:lastColumn="0" w:noHBand="0" w:noVBand="1"/>
       </w:tblPr>
       <w:tblGrid>
-        <w:gridCol w:w="1580"/>
-        <w:gridCol w:w="2526"/>
-        <w:gridCol w:w="315"/>
-        <w:gridCol w:w="2156"/>
-        <w:gridCol w:w="2439"/>
+        <w:gridCol w:w="1442"/>
+        <w:gridCol w:w="2512"/>
+        <w:gridCol w:w="283"/>
+        <w:gridCol w:w="1907"/>
+        <w:gridCol w:w="2872"/>
       </w:tblGrid>
       <w:tr>
         <w:tc>
@@ -886,6 +886,30 @@
                 <w:rFonts w:ascii="Avenir Book" w:hAnsi="Avenir Book"/>
               </w:rPr>
             </w:pPr>
+            <w:r>
+              <w:rPr>
+                <w:rFonts w:ascii="Avenir Book" w:hAnsi="Avenir Book"/>
+              </w:rPr>
+              <w:t>{{</w:t>
+            </w:r>
+            <w:r>
+              <w:rPr>
+                <w:rFonts w:ascii="Avenir Book" w:hAnsi="Avenir Book"/>
+              </w:rPr>
+              <w:t>porcentaje</w:t>
+            </w:r>
+            <w:r>
+              <w:rPr>
+                <w:rFonts w:ascii="Avenir Book" w:hAnsi="Avenir Book"/>
+              </w:rPr>
+              <w:t>_de_realizados}}</w:t>
+            </w:r>
+            <w:r>
+              <w:rPr>
+                <w:rFonts w:ascii="Avenir Book" w:hAnsi="Avenir Book"/>
+              </w:rPr>
+              <w:t>%</w:t>
+            </w:r>
           </w:p>
         </w:tc>
       </w:tr>
@@ -1247,7 +1271,6 @@
           <w:bCs/>
           <w:sz w:val="24"/>
         </w:rPr>
-        <w:lastRenderedPageBreak/>
         <w:t>Tabla de Contenido</w:t>
       </w:r>
     </w:p>
@@ -1631,7 +1654,14 @@
         <w:rPr>
           <w:rFonts w:ascii="Avenir Light" w:hAnsi="Avenir Light" w:cs="Times New Roman"/>
         </w:rPr>
-        <w:t>El siguiente gráfico muestra la evolución temporal del total de plagas eliminadas en órdenes preventivas. Las barras representan el volumen total mensual de todas las especies combinadas, mientras que la línea negra conecta los puntos de datos creando una trayectoria clara de la tendencia a lo largo del tiempo.</w:t>
+        <w:t xml:space="preserve">El siguiente gráfico muestra la evolución temporal del total de plagas eliminadas en órdenes preventivas. Las barras representan el volumen total mensual de todas las especies combinadas, </w:t>
+      </w:r>
+      <w:r>
+        <w:rPr>
+          <w:rFonts w:ascii="Avenir Light" w:hAnsi="Avenir Light" w:cs="Times New Roman"/>
+        </w:rPr>
+        <w:lastRenderedPageBreak/>
+        <w:t>mientras que la línea negra conecta los puntos de datos creando una trayectoria clara de la tendencia a lo largo del tiempo.</w:t>
       </w:r>
     </w:p>
     <w:p>
@@ -1639,7 +1669,6 @@
         <w:jc w:val="both"/>
       </w:pPr>
       <w:r>
-        <w:lastRenderedPageBreak/>
         <w:t>{{preventivos_3_plot}}</w:t>
       </w:r>
     </w:p>
@@ -1921,6 +1950,7 @@
     </w:p>
     <w:p>
       <w:r>
+        <w:lastRenderedPageBreak/>
         <w:t>{{lamparas_2_tabla}}</w:t>
       </w:r>
     </w:p>
@@ -1936,7 +1966,6 @@
         <w:rPr>
           <w:rFonts w:ascii="Avenir Book" w:hAnsi="Avenir Book"/>
         </w:rPr>
-        <w:lastRenderedPageBreak/>
         <w:t xml:space="preserve">El siguiente gráfico </w:t>
       </w:r>
       <w:r>
@@ -2224,6 +2253,7 @@
                 <w:b/>
                 <w:bCs/>
               </w:rPr>
+              <w:lastRenderedPageBreak/>
               <w:t>Valores de Referencia</w:t>
             </w:r>
           </w:p>
@@ -2337,7 +2367,6 @@
               <w:rPr>
                 <w:rFonts w:ascii="Avenir Book" w:hAnsi="Avenir Book"/>
               </w:rPr>
-              <w:lastRenderedPageBreak/>
               <w:t>Cucaracha Americana</w:t>
             </w:r>
           </w:p>
@@ -3457,6 +3486,7 @@
         <w:rPr>
           <w:rFonts w:ascii="Avenir Book" w:hAnsi="Avenir Book"/>
         </w:rPr>
+        <w:lastRenderedPageBreak/>
         <w:t>Cuidado y protección de los puntos de control, informar al personal de seguridad para proteger las cajas en el perímetro externo e informar a Serviplagas si se presentan novedades.</w:t>
       </w:r>
     </w:p>
@@ -3490,7 +3520,6 @@
         <w:rPr>
           <w:rFonts w:ascii="Avenir Book" w:hAnsi="Avenir Book"/>
         </w:rPr>
-        <w:lastRenderedPageBreak/>
         <w:t>Sellar madrigueras</w:t>
       </w:r>
     </w:p>

</xml_diff>

<commit_message>
Actualizar la plantilla de Word con marca de agua
</commit_message>
<xml_diff>
--- a/Plantilla.docx
+++ b/Plantilla.docx
@@ -1089,6 +1089,431 @@
               <w:t>}}</w:t>
             </w:r>
           </w:p>
+          <w:p>
+            <w:pPr>
+              <w:tabs>
+                <w:tab w:val="left" w:pos="952"/>
+              </w:tabs>
+              <w:jc w:val="both"/>
+              <w:rPr>
+                <w:rFonts w:ascii="Avenir Light" w:hAnsi="Avenir Light" w:cs="Times New Roman"/>
+              </w:rPr>
+            </w:pPr>
+          </w:p>
+          <w:p>
+            <w:pPr>
+              <w:tabs>
+                <w:tab w:val="left" w:pos="952"/>
+              </w:tabs>
+              <w:jc w:val="both"/>
+              <w:rPr>
+                <w:rFonts w:ascii="Avenir Light" w:hAnsi="Avenir Light" w:cs="Times New Roman"/>
+              </w:rPr>
+            </w:pPr>
+          </w:p>
+          <w:p>
+            <w:pPr>
+              <w:tabs>
+                <w:tab w:val="left" w:pos="952"/>
+              </w:tabs>
+              <w:jc w:val="both"/>
+              <w:rPr>
+                <w:rFonts w:ascii="Avenir Light" w:hAnsi="Avenir Light" w:cs="Times New Roman"/>
+                <w:lang w:val="es-ES"/>
+              </w:rPr>
+            </w:pPr>
+            <w:r>
+              <w:rPr>
+                <w:rFonts w:ascii="Avenir Light" w:hAnsi="Avenir Light" w:cs="Times New Roman"/>
+                <w:lang w:val="es-ES"/>
+              </w:rPr>
+              <w:t>S</w:t>
+            </w:r>
+            <w:r>
+              <w:rPr>
+                <w:rFonts w:ascii="Avenir Light" w:hAnsi="Avenir Light" w:cs="Times New Roman"/>
+                <w:lang w:val="es-ES"/>
+              </w:rPr>
+              <w:t>e llevaron a cabo los cuatro tipos de controles establecidos dentro del programa institucional, manteniendo una periodicidad mensual conforme al cronograma preventivo. Estas acciones incluyeron:</w:t>
+            </w:r>
+          </w:p>
+          <w:p>
+            <w:pPr>
+              <w:pStyle w:val="ListParagraph"/>
+              <w:numPr>
+                <w:ilvl w:val="0"/>
+                <w:numId w:val="6"/>
+              </w:numPr>
+              <w:tabs>
+                <w:tab w:val="left" w:pos="952"/>
+              </w:tabs>
+              <w:spacing w:before="200" w:after="200" w:line="276" w:lineRule="auto"/>
+              <w:jc w:val="both"/>
+              <w:rPr>
+                <w:rFonts w:ascii="Avenir Light" w:hAnsi="Avenir Light" w:cs="Times New Roman"/>
+                <w:lang w:val="es-ES"/>
+              </w:rPr>
+            </w:pPr>
+            <w:r>
+              <w:rPr>
+                <w:rFonts w:ascii="Avenir Light" w:hAnsi="Avenir Light" w:cs="Times New Roman"/>
+                <w:lang w:val="es-ES"/>
+              </w:rPr>
+              <w:t>Rondas preventivas mensuales en las áreas asistenciales y administrativas de los 17 bloques que conforman la institución, con el objetivo de reducir la presencia de insectos rastreros, voladores y roedores de menor importancia sanitaria.</w:t>
+            </w:r>
+          </w:p>
+          <w:p>
+            <w:pPr>
+              <w:pStyle w:val="ListParagraph"/>
+              <w:numPr>
+                <w:ilvl w:val="0"/>
+                <w:numId w:val="6"/>
+              </w:numPr>
+              <w:tabs>
+                <w:tab w:val="left" w:pos="952"/>
+              </w:tabs>
+              <w:spacing w:before="200" w:after="200" w:line="276" w:lineRule="auto"/>
+              <w:jc w:val="both"/>
+              <w:rPr>
+                <w:rFonts w:ascii="Avenir Light" w:hAnsi="Avenir Light" w:cs="Times New Roman"/>
+                <w:lang w:val="es-ES"/>
+              </w:rPr>
+            </w:pPr>
+            <w:r>
+              <w:rPr>
+                <w:rFonts w:ascii="Avenir Light" w:hAnsi="Avenir Light" w:cs="Times New Roman"/>
+                <w:lang w:val="es-ES"/>
+              </w:rPr>
+              <w:t>Inspección y mantenimiento de las estaciones de control de roedores y de las luminarias atrayentes para el control de insectos voladores.</w:t>
+            </w:r>
+          </w:p>
+          <w:p>
+            <w:pPr>
+              <w:pStyle w:val="ListParagraph"/>
+              <w:numPr>
+                <w:ilvl w:val="0"/>
+                <w:numId w:val="6"/>
+              </w:numPr>
+              <w:tabs>
+                <w:tab w:val="left" w:pos="952"/>
+              </w:tabs>
+              <w:spacing w:before="200" w:after="200" w:line="276" w:lineRule="auto"/>
+              <w:jc w:val="both"/>
+              <w:rPr>
+                <w:rFonts w:ascii="Avenir Light" w:hAnsi="Avenir Light" w:cs="Times New Roman"/>
+                <w:lang w:val="es-ES"/>
+              </w:rPr>
+            </w:pPr>
+            <w:r>
+              <w:rPr>
+                <w:rFonts w:ascii="Avenir Light" w:hAnsi="Avenir Light" w:cs="Times New Roman"/>
+                <w:lang w:val="es-ES"/>
+              </w:rPr>
+              <w:t>Limpieza y mantenimiento preventivo en áreas verdes, espacios comunes, sumideros y sistemas de alcantarillado, en articulación con el área de mantenimiento institucional.</w:t>
+            </w:r>
+          </w:p>
+          <w:p>
+            <w:pPr>
+              <w:pStyle w:val="ListParagraph"/>
+              <w:numPr>
+                <w:ilvl w:val="0"/>
+                <w:numId w:val="6"/>
+              </w:numPr>
+              <w:tabs>
+                <w:tab w:val="left" w:pos="952"/>
+              </w:tabs>
+              <w:spacing w:before="200" w:after="200" w:line="276" w:lineRule="auto"/>
+              <w:jc w:val="both"/>
+              <w:rPr>
+                <w:rFonts w:ascii="Avenir Light" w:hAnsi="Avenir Light" w:cs="Times New Roman"/>
+                <w:lang w:val="es-ES"/>
+              </w:rPr>
+            </w:pPr>
+            <w:r>
+              <w:rPr>
+                <w:rFonts w:ascii="Avenir Light" w:hAnsi="Avenir Light" w:cs="Times New Roman"/>
+                <w:lang w:val="es-ES"/>
+              </w:rPr>
+              <w:t>Atención oportuna de novedades y mantenimientos correctivos reportados mediante el formato oficial o a través del grupo de WhatsApp institucional, canal que ha permitido una respuesta inmediata a los reportes diarios.</w:t>
+            </w:r>
+          </w:p>
+          <w:p>
+            <w:pPr>
+              <w:tabs>
+                <w:tab w:val="left" w:pos="952"/>
+              </w:tabs>
+              <w:jc w:val="both"/>
+              <w:rPr>
+                <w:rFonts w:ascii="Avenir Light" w:hAnsi="Avenir Light" w:cs="Times New Roman"/>
+                <w:lang w:val="es-ES"/>
+              </w:rPr>
+            </w:pPr>
+            <w:r>
+              <w:rPr>
+                <w:rFonts w:ascii="Avenir Light" w:hAnsi="Avenir Light" w:cs="Times New Roman"/>
+                <w:lang w:val="es-ES"/>
+              </w:rPr>
+              <w:t>Las acciones preventivas y correctivas aplicadas han contribuido a mantener las condiciones sanitarias dentro de los parámetros exigidos para una institución de alta complejidad, con cobertura integral en todos los frentes del programa:</w:t>
+            </w:r>
+          </w:p>
+          <w:p>
+            <w:pPr>
+              <w:pStyle w:val="ListParagraph"/>
+              <w:numPr>
+                <w:ilvl w:val="0"/>
+                <w:numId w:val="7"/>
+              </w:numPr>
+              <w:tabs>
+                <w:tab w:val="left" w:pos="952"/>
+              </w:tabs>
+              <w:spacing w:before="200" w:after="200" w:line="276" w:lineRule="auto"/>
+              <w:jc w:val="both"/>
+              <w:rPr>
+                <w:rFonts w:ascii="Avenir Light" w:hAnsi="Avenir Light" w:cs="Times New Roman"/>
+                <w:lang w:val="es-ES"/>
+              </w:rPr>
+            </w:pPr>
+            <w:r>
+              <w:rPr>
+                <w:rFonts w:ascii="Avenir Light" w:hAnsi="Avenir Light" w:cs="Times New Roman"/>
+                <w:lang w:val="es-ES"/>
+              </w:rPr>
+              <w:t>Insectos rastreros</w:t>
+            </w:r>
+          </w:p>
+          <w:p>
+            <w:pPr>
+              <w:pStyle w:val="ListParagraph"/>
+              <w:numPr>
+                <w:ilvl w:val="0"/>
+                <w:numId w:val="7"/>
+              </w:numPr>
+              <w:tabs>
+                <w:tab w:val="left" w:pos="952"/>
+              </w:tabs>
+              <w:spacing w:before="200" w:after="200" w:line="276" w:lineRule="auto"/>
+              <w:jc w:val="both"/>
+              <w:rPr>
+                <w:rFonts w:ascii="Avenir Light" w:hAnsi="Avenir Light" w:cs="Times New Roman"/>
+                <w:lang w:val="es-ES"/>
+              </w:rPr>
+            </w:pPr>
+            <w:r>
+              <w:rPr>
+                <w:rFonts w:ascii="Avenir Light" w:hAnsi="Avenir Light" w:cs="Times New Roman"/>
+                <w:lang w:val="es-ES"/>
+              </w:rPr>
+              <w:t>Insectos voladores</w:t>
+            </w:r>
+          </w:p>
+          <w:p>
+            <w:pPr>
+              <w:pStyle w:val="ListParagraph"/>
+              <w:numPr>
+                <w:ilvl w:val="0"/>
+                <w:numId w:val="7"/>
+              </w:numPr>
+              <w:tabs>
+                <w:tab w:val="left" w:pos="952"/>
+              </w:tabs>
+              <w:spacing w:before="200" w:after="200" w:line="276" w:lineRule="auto"/>
+              <w:jc w:val="both"/>
+              <w:rPr>
+                <w:rFonts w:ascii="Avenir Light" w:hAnsi="Avenir Light" w:cs="Times New Roman"/>
+                <w:lang w:val="es-ES"/>
+              </w:rPr>
+            </w:pPr>
+            <w:r>
+              <w:rPr>
+                <w:rFonts w:ascii="Avenir Light" w:hAnsi="Avenir Light" w:cs="Times New Roman"/>
+                <w:lang w:val="es-ES"/>
+              </w:rPr>
+              <w:t>Roedores</w:t>
+            </w:r>
+          </w:p>
+          <w:p>
+            <w:pPr>
+              <w:pStyle w:val="ListParagraph"/>
+              <w:numPr>
+                <w:ilvl w:val="0"/>
+                <w:numId w:val="7"/>
+              </w:numPr>
+              <w:tabs>
+                <w:tab w:val="left" w:pos="952"/>
+              </w:tabs>
+              <w:spacing w:before="200" w:after="200" w:line="276" w:lineRule="auto"/>
+              <w:jc w:val="both"/>
+              <w:rPr>
+                <w:rFonts w:ascii="Avenir Light" w:hAnsi="Avenir Light" w:cs="Times New Roman"/>
+                <w:lang w:val="es-ES"/>
+              </w:rPr>
+            </w:pPr>
+            <w:r>
+              <w:rPr>
+                <w:rFonts w:ascii="Avenir Light" w:hAnsi="Avenir Light" w:cs="Times New Roman"/>
+                <w:lang w:val="es-ES"/>
+              </w:rPr>
+              <w:t>Vectores asociados al dengue</w:t>
+            </w:r>
+          </w:p>
+          <w:p>
+            <w:pPr>
+              <w:pStyle w:val="ListParagraph"/>
+              <w:numPr>
+                <w:ilvl w:val="0"/>
+                <w:numId w:val="7"/>
+              </w:numPr>
+              <w:tabs>
+                <w:tab w:val="left" w:pos="952"/>
+              </w:tabs>
+              <w:spacing w:before="200" w:after="200" w:line="276" w:lineRule="auto"/>
+              <w:jc w:val="both"/>
+              <w:rPr>
+                <w:rFonts w:ascii="Avenir Light" w:hAnsi="Avenir Light" w:cs="Times New Roman"/>
+                <w:lang w:val="es-ES"/>
+              </w:rPr>
+            </w:pPr>
+            <w:r>
+              <w:rPr>
+                <w:rFonts w:ascii="Avenir Light" w:hAnsi="Avenir Light" w:cs="Times New Roman"/>
+                <w:lang w:val="es-ES"/>
+              </w:rPr>
+              <w:t>Zonas comunes y áreas perimetrales</w:t>
+            </w:r>
+          </w:p>
+          <w:p>
+            <w:pPr>
+              <w:pStyle w:val="ListParagraph"/>
+              <w:tabs>
+                <w:tab w:val="left" w:pos="952"/>
+              </w:tabs>
+              <w:jc w:val="both"/>
+              <w:rPr>
+                <w:rFonts w:ascii="Avenir Light" w:hAnsi="Avenir Light" w:cs="Times New Roman"/>
+                <w:lang w:val="es-ES"/>
+              </w:rPr>
+            </w:pPr>
+          </w:p>
+          <w:p>
+            <w:pPr>
+              <w:tabs>
+                <w:tab w:val="left" w:pos="952"/>
+              </w:tabs>
+              <w:jc w:val="both"/>
+              <w:rPr>
+                <w:rFonts w:ascii="Avenir Light" w:hAnsi="Avenir Light" w:cs="Times New Roman"/>
+                <w:lang w:val="es-ES"/>
+              </w:rPr>
+            </w:pPr>
+            <w:r>
+              <w:rPr>
+                <w:rFonts w:ascii="Avenir Light" w:hAnsi="Avenir Light" w:cs="Times New Roman"/>
+                <w:lang w:val="es-ES"/>
+              </w:rPr>
+              <w:t>Cabe resaltar que la institución continúa fortaleciendo la implementación de barreras físicas y mejoras locativas, derivadas de los hallazgos de campo reportados en las inspecciones diarias, lo que garantiza la continuidad de las medidas de prevención y control dentro de los estándares sanitarios requeridos.</w:t>
+            </w:r>
+          </w:p>
+          <w:p>
+            <w:pPr>
+              <w:tabs>
+                <w:tab w:val="left" w:pos="952"/>
+              </w:tabs>
+              <w:jc w:val="both"/>
+              <w:rPr>
+                <w:rFonts w:ascii="Avenir Light" w:hAnsi="Avenir Light" w:cs="Times New Roman"/>
+                <w:lang w:val="es-ES"/>
+              </w:rPr>
+            </w:pPr>
+          </w:p>
+          <w:p>
+            <w:pPr>
+              <w:tabs>
+                <w:tab w:val="left" w:pos="952"/>
+              </w:tabs>
+              <w:jc w:val="both"/>
+              <w:rPr>
+                <w:rFonts w:ascii="Avenir Light" w:hAnsi="Avenir Light" w:cs="Times New Roman"/>
+                <w:lang w:val="es-ES"/>
+              </w:rPr>
+            </w:pPr>
+            <w:r>
+              <w:rPr>
+                <w:rFonts w:ascii="Avenir Light" w:hAnsi="Avenir Light" w:cs="Times New Roman"/>
+                <w:lang w:val="es-ES"/>
+              </w:rPr>
+              <w:t xml:space="preserve">Este es el análisis del mes de </w:t>
+            </w:r>
+            <w:r>
+              <w:rPr>
+                <w:rFonts w:ascii="Avenir Light" w:hAnsi="Avenir Light" w:cs="Times New Roman"/>
+                <w:b/>
+                <w:bCs/>
+                <w:lang w:val="es-ES"/>
+              </w:rPr>
+              <w:t>{{</w:t>
+            </w:r>
+            <w:r>
+              <w:rPr>
+                <w:rFonts w:ascii="Avenir Book" w:hAnsi="Avenir Book"/>
+                <w:b/>
+                <w:bCs/>
+              </w:rPr>
+              <w:t>mes_de_analisis</w:t>
+            </w:r>
+            <w:r>
+              <w:rPr>
+                <w:rFonts w:ascii="Avenir Book" w:hAnsi="Avenir Book"/>
+                <w:b/>
+                <w:bCs/>
+              </w:rPr>
+              <w:t>}}</w:t>
+            </w:r>
+            <w:r>
+              <w:rPr>
+                <w:rFonts w:ascii="Avenir Light" w:hAnsi="Avenir Light" w:cs="Times New Roman"/>
+                <w:b/>
+                <w:lang w:val="es-ES"/>
+              </w:rPr>
+              <w:t xml:space="preserve">. </w:t>
+            </w:r>
+            <w:r>
+              <w:rPr>
+                <w:rFonts w:ascii="Avenir Light" w:hAnsi="Avenir Light" w:cs="Times New Roman"/>
+                <w:lang w:val="es-ES"/>
+              </w:rPr>
+              <w:t>Con este informe analiza el nuevo ciclo de gestión (septiembre 2025 – agosto 2026), reafirmando el compromiso institucional con la prevención, la vigilancia continua y la mejora permanente del programa de control de plagas. A continuación, se presentan los aspectos más destacados y los principales hallazgos obtenidos durante el transcurso de este mes.</w:t>
+            </w:r>
+          </w:p>
+          <w:p>
+            <w:pPr>
+              <w:tabs>
+                <w:tab w:val="left" w:pos="952"/>
+              </w:tabs>
+              <w:jc w:val="both"/>
+              <w:rPr>
+                <w:rFonts w:ascii="Avenir Light" w:hAnsi="Avenir Light" w:cs="Times New Roman"/>
+                <w:lang w:val="es-ES"/>
+              </w:rPr>
+            </w:pPr>
+          </w:p>
+          <w:p>
+            <w:pPr>
+              <w:tabs>
+                <w:tab w:val="left" w:pos="952"/>
+              </w:tabs>
+              <w:jc w:val="both"/>
+              <w:rPr>
+                <w:rFonts w:ascii="Avenir Light" w:hAnsi="Avenir Light" w:cs="Times New Roman"/>
+              </w:rPr>
+            </w:pPr>
+            <w:r>
+              <w:rPr>
+                <w:rFonts w:ascii="Avenir Light" w:hAnsi="Avenir Light" w:cs="Times New Roman"/>
+                <w:lang w:val="es-ES"/>
+              </w:rPr>
+              <w:t>NOTA 1*: Se adjuntan a este informe, todos los formatos de consolidados, novedades por área de aplicación, recomendaciones de correctivos y mantenimientos y análisis por área controlada.</w:t>
+            </w:r>
+          </w:p>
         </w:tc>
       </w:tr>
     </w:tbl>
@@ -1285,6 +1710,8 @@
         <w:jc w:val="both"/>
         <w:rPr>
           <w:rFonts w:ascii="Avenir Light" w:hAnsi="Avenir Light" w:cs="Times New Roman"/>
+          <w:b/>
+          <w:bCs/>
           <w:sz w:val="24"/>
           <w:lang w:val="es-ES"/>
         </w:rPr>
@@ -1292,6 +1719,8 @@
       <w:r>
         <w:rPr>
           <w:rFonts w:ascii="Avenir Light" w:hAnsi="Avenir Light" w:cs="Times New Roman"/>
+          <w:b/>
+          <w:bCs/>
           <w:sz w:val="24"/>
           <w:lang w:val="es-ES"/>
         </w:rPr>
@@ -1309,6 +1738,8 @@
         <w:jc w:val="both"/>
         <w:rPr>
           <w:rFonts w:ascii="Avenir Light" w:hAnsi="Avenir Light" w:cs="Times New Roman"/>
+          <w:b/>
+          <w:bCs/>
           <w:sz w:val="24"/>
           <w:lang w:val="es-ES"/>
         </w:rPr>
@@ -1316,6 +1747,8 @@
       <w:r>
         <w:rPr>
           <w:rFonts w:ascii="Avenir Light" w:hAnsi="Avenir Light" w:cs="Times New Roman"/>
+          <w:b/>
+          <w:bCs/>
           <w:sz w:val="24"/>
           <w:lang w:val="es-ES"/>
         </w:rPr>
@@ -1333,6 +1766,8 @@
         <w:jc w:val="both"/>
         <w:rPr>
           <w:rFonts w:ascii="Avenir Light" w:hAnsi="Avenir Light" w:cs="Times New Roman"/>
+          <w:b/>
+          <w:bCs/>
           <w:sz w:val="24"/>
           <w:lang w:val="es-ES"/>
         </w:rPr>
@@ -1340,9 +1775,12 @@
       <w:r>
         <w:rPr>
           <w:rFonts w:ascii="Avenir Light" w:hAnsi="Avenir Light" w:cs="Times New Roman"/>
+          <w:b/>
+          <w:bCs/>
           <w:sz w:val="24"/>
           <w:lang w:val="es-ES"/>
         </w:rPr>
+        <w:lastRenderedPageBreak/>
         <w:t>Registro control de insectos voladores. Consolidado mensual y tendencia. LAMPARAS</w:t>
       </w:r>
     </w:p>
@@ -1357,6 +1795,8 @@
         <w:jc w:val="both"/>
         <w:rPr>
           <w:rFonts w:ascii="Avenir Light" w:hAnsi="Avenir Light" w:cs="Times New Roman"/>
+          <w:b/>
+          <w:bCs/>
           <w:sz w:val="24"/>
           <w:lang w:val="es-ES"/>
         </w:rPr>
@@ -1364,6 +1804,8 @@
       <w:r>
         <w:rPr>
           <w:rFonts w:ascii="Avenir Light" w:hAnsi="Avenir Light" w:cs="Times New Roman"/>
+          <w:b/>
+          <w:bCs/>
           <w:sz w:val="24"/>
           <w:lang w:val="es-ES"/>
         </w:rPr>
@@ -1381,6 +1823,8 @@
         <w:jc w:val="both"/>
         <w:rPr>
           <w:rFonts w:ascii="Avenir Light" w:hAnsi="Avenir Light" w:cs="Times New Roman"/>
+          <w:b/>
+          <w:bCs/>
           <w:sz w:val="24"/>
           <w:lang w:val="es-ES"/>
         </w:rPr>
@@ -1388,6 +1832,8 @@
       <w:r>
         <w:rPr>
           <w:rFonts w:ascii="Avenir Light" w:hAnsi="Avenir Light" w:cs="Times New Roman"/>
+          <w:b/>
+          <w:bCs/>
           <w:sz w:val="24"/>
           <w:lang w:val="es-ES"/>
         </w:rPr>
@@ -1405,6 +1851,8 @@
         <w:jc w:val="both"/>
         <w:rPr>
           <w:rFonts w:ascii="Avenir Light" w:hAnsi="Avenir Light" w:cs="Times New Roman"/>
+          <w:b/>
+          <w:bCs/>
           <w:sz w:val="24"/>
           <w:lang w:val="es-ES"/>
         </w:rPr>
@@ -1412,28 +1860,12 @@
       <w:r>
         <w:rPr>
           <w:rFonts w:ascii="Avenir Light" w:hAnsi="Avenir Light" w:cs="Times New Roman"/>
+          <w:b/>
+          <w:bCs/>
           <w:sz w:val="24"/>
           <w:lang w:val="es-ES"/>
         </w:rPr>
-        <w:t>Informe de Zonas comunes (</w:t>
-      </w:r>
-      <w:proofErr w:type="spellStart"/>
-      <w:r>
-        <w:rPr>
-          <w:rFonts w:ascii="Avenir Light" w:hAnsi="Avenir Light" w:cs="Times New Roman"/>
-          <w:sz w:val="24"/>
-          <w:lang w:val="es-ES"/>
-        </w:rPr>
-        <w:t>Desnidado</w:t>
-      </w:r>
-      <w:proofErr w:type="spellEnd"/>
-      <w:r>
-        <w:rPr>
-          <w:rFonts w:ascii="Avenir Light" w:hAnsi="Avenir Light" w:cs="Times New Roman"/>
-          <w:sz w:val="24"/>
-          <w:lang w:val="es-ES"/>
-        </w:rPr>
-        <w:t>, motomochila, zonas verdes, cajas de aguas negras…)</w:t>
+        <w:t>Informe de Zonas comunes (Desnidado, motomochila, zonas verdes, cajas de aguas negras…)</w:t>
       </w:r>
     </w:p>
     <w:p>
@@ -1447,6 +1879,8 @@
         <w:jc w:val="both"/>
         <w:rPr>
           <w:rFonts w:ascii="Avenir Light" w:hAnsi="Avenir Light" w:cs="Times New Roman"/>
+          <w:b/>
+          <w:bCs/>
           <w:sz w:val="24"/>
           <w:lang w:val="es-ES"/>
         </w:rPr>
@@ -1454,6 +1888,8 @@
       <w:r>
         <w:rPr>
           <w:rFonts w:ascii="Avenir Light" w:hAnsi="Avenir Light" w:cs="Times New Roman"/>
+          <w:b/>
+          <w:bCs/>
           <w:sz w:val="24"/>
           <w:lang w:val="es-ES"/>
         </w:rPr>
@@ -1471,6 +1907,8 @@
         <w:jc w:val="both"/>
         <w:rPr>
           <w:rFonts w:ascii="Avenir Light" w:hAnsi="Avenir Light" w:cs="Times New Roman"/>
+          <w:b/>
+          <w:bCs/>
           <w:sz w:val="24"/>
           <w:lang w:val="es-ES"/>
         </w:rPr>
@@ -1478,6 +1916,8 @@
       <w:r>
         <w:rPr>
           <w:rFonts w:ascii="Avenir Light" w:hAnsi="Avenir Light" w:cs="Times New Roman"/>
+          <w:b/>
+          <w:bCs/>
           <w:sz w:val="24"/>
           <w:lang w:val="es-ES"/>
         </w:rPr>
@@ -1495,6 +1935,8 @@
         <w:jc w:val="both"/>
         <w:rPr>
           <w:rFonts w:ascii="Avenir Light" w:hAnsi="Avenir Light" w:cs="Times New Roman"/>
+          <w:b/>
+          <w:bCs/>
           <w:sz w:val="24"/>
           <w:lang w:val="es-ES"/>
         </w:rPr>
@@ -1502,6 +1944,8 @@
       <w:r>
         <w:rPr>
           <w:rFonts w:ascii="Avenir Light" w:hAnsi="Avenir Light" w:cs="Times New Roman"/>
+          <w:b/>
+          <w:bCs/>
           <w:sz w:val="24"/>
           <w:lang w:val="es-ES"/>
         </w:rPr>
@@ -1517,6 +1961,8 @@
         </w:numPr>
         <w:rPr>
           <w:rFonts w:ascii="Avenir Light" w:hAnsi="Avenir Light" w:cs="Times New Roman"/>
+          <w:b/>
+          <w:bCs/>
           <w:sz w:val="24"/>
           <w:lang w:val="es-ES"/>
         </w:rPr>
@@ -1524,6 +1970,8 @@
       <w:r>
         <w:rPr>
           <w:rFonts w:ascii="Avenir Light" w:hAnsi="Avenir Light" w:cs="Times New Roman"/>
+          <w:b/>
+          <w:bCs/>
           <w:sz w:val="24"/>
           <w:lang w:val="es-ES"/>
         </w:rPr>
@@ -1535,23 +1983,33 @@
         <w:rPr>
           <w:b/>
           <w:bCs/>
-        </w:rPr>
-      </w:pPr>
-    </w:p>
-    <w:p>
-      <w:pPr>
-        <w:jc w:val="center"/>
+          <w:sz w:val="24"/>
+          <w:szCs w:val="24"/>
+        </w:rPr>
+      </w:pPr>
+    </w:p>
+    <w:p>
+      <w:pPr>
+        <w:rPr>
+          <w:sz w:val="24"/>
+          <w:szCs w:val="24"/>
+        </w:rPr>
+      </w:pPr>
+      <w:r>
         <w:rPr>
           <w:b/>
           <w:bCs/>
-        </w:rPr>
-      </w:pPr>
-    </w:p>
-    <w:p>
+          <w:sz w:val="24"/>
+          <w:szCs w:val="24"/>
+        </w:rPr>
+        <w:t xml:space="preserve">1. </w:t>
+      </w:r>
       <w:r>
         <w:rPr>
           <w:b/>
           <w:bCs/>
+          <w:sz w:val="24"/>
+          <w:szCs w:val="24"/>
         </w:rPr>
         <w:t>Registro control de insectos rastreros. PREVENTIVOS</w:t>
       </w:r>
@@ -1654,14 +2112,7 @@
         <w:rPr>
           <w:rFonts w:ascii="Avenir Light" w:hAnsi="Avenir Light" w:cs="Times New Roman"/>
         </w:rPr>
-        <w:t xml:space="preserve">El siguiente gráfico muestra la evolución temporal del total de plagas eliminadas en órdenes preventivas. Las barras representan el volumen total mensual de todas las especies combinadas, </w:t>
-      </w:r>
-      <w:r>
-        <w:rPr>
-          <w:rFonts w:ascii="Avenir Light" w:hAnsi="Avenir Light" w:cs="Times New Roman"/>
-        </w:rPr>
-        <w:lastRenderedPageBreak/>
-        <w:t>mientras que la línea negra conecta los puntos de datos creando una trayectoria clara de la tendencia a lo largo del tiempo.</w:t>
+        <w:t>El siguiente gráfico muestra la evolución temporal del total de plagas eliminadas en órdenes preventivas. Las barras representan el volumen total mensual de todas las especies combinadas, mientras que la línea negra conecta los puntos de datos creando una trayectoria clara de la tendencia a lo largo del tiempo.</w:t>
       </w:r>
     </w:p>
     <w:p>
@@ -1685,10 +2136,28 @@
       </w:pPr>
     </w:p>
     <w:p>
+      <w:pPr>
+        <w:rPr>
+          <w:sz w:val="24"/>
+          <w:szCs w:val="24"/>
+        </w:rPr>
+      </w:pPr>
       <w:r>
         <w:rPr>
           <w:b/>
           <w:bCs/>
+          <w:sz w:val="24"/>
+          <w:szCs w:val="24"/>
+        </w:rPr>
+        <w:lastRenderedPageBreak/>
+        <w:t xml:space="preserve">2. </w:t>
+      </w:r>
+      <w:r>
+        <w:rPr>
+          <w:b/>
+          <w:bCs/>
+          <w:sz w:val="24"/>
+          <w:szCs w:val="24"/>
         </w:rPr>
         <w:t>Registro control de roedores. CAJAS</w:t>
       </w:r>
@@ -1797,67 +2266,80 @@
         <w:rPr>
           <w:b/>
           <w:bCs/>
+          <w:sz w:val="24"/>
+          <w:szCs w:val="24"/>
         </w:rPr>
       </w:pPr>
       <w:r>
         <w:rPr>
           <w:b/>
           <w:bCs/>
-        </w:rPr>
-        <w:t>Registro control de insectos voladores. Consolidado mensual y tendencia. LAMPARAS</w:t>
-      </w:r>
-    </w:p>
-    <w:p>
-      <w:pPr>
-        <w:jc w:val="both"/>
-        <w:rPr>
-          <w:rFonts w:ascii="Avenir Book" w:hAnsi="Avenir Book"/>
-        </w:rPr>
-      </w:pPr>
-      <w:r>
-        <w:rPr>
-          <w:rFonts w:ascii="Avenir Book" w:hAnsi="Avenir Book"/>
-        </w:rPr>
-        <w:t xml:space="preserve">El siguiente gráfico desglosa el estado de las lámparas por categoría a lo largo del tiempo. Cada </w:t>
-      </w:r>
-      <w:r>
-        <w:rPr>
-          <w:rFonts w:ascii="Avenir Book" w:hAnsi="Avenir Book"/>
-        </w:rPr>
-        <w:t>subgráfico</w:t>
-      </w:r>
-      <w:r>
-        <w:rPr>
-          <w:rFonts w:ascii="Avenir Book" w:hAnsi="Avenir Book"/>
-        </w:rPr>
-        <w:t xml:space="preserve"> corresponde a un estado diferente de la lámpara (Buena potencia, Deteriorada, Apagada, etc.) y muestra su evolución mensual mediante barras que representan la cantidad y una línea de tendencia con marcadores. </w:t>
-      </w:r>
-    </w:p>
-    <w:p>
-      <w:r>
-        <w:t>{{lamparas_1_plot}}</w:t>
-      </w:r>
-    </w:p>
-    <w:p>
-      <w:r>
-        <w:t>{{lamparas_1_tabla}}</w:t>
-      </w:r>
-    </w:p>
-    <w:p>
-      <w:pPr>
-        <w:jc w:val="both"/>
-      </w:pPr>
-      <w:r>
-        <w:rPr>
-          <w:rFonts w:ascii="Avenir Book" w:hAnsi="Avenir Book"/>
-        </w:rPr>
-        <w:t xml:space="preserve">El siguiente gráfico presenta una visualización de dispersión con burbujas que muestra el estado de las lámparas por área en </w:t>
-      </w:r>
-      <w:r>
-        <w:rPr>
-          <w:rFonts w:ascii="Avenir Book" w:hAnsi="Avenir Book"/>
+          <w:sz w:val="24"/>
+          <w:szCs w:val="24"/>
+        </w:rPr>
+        <w:t xml:space="preserve">3. </w:t>
+      </w:r>
+      <w:r>
+        <w:rPr>
           <w:b/>
           <w:bCs/>
+          <w:sz w:val="24"/>
+          <w:szCs w:val="24"/>
+        </w:rPr>
+        <w:t>Registro control de insectos voladores. Consolidado mensual y tendencia. LAMPARAS</w:t>
+      </w:r>
+    </w:p>
+    <w:p>
+      <w:pPr>
+        <w:jc w:val="both"/>
+        <w:rPr>
+          <w:rFonts w:ascii="Avenir Book" w:hAnsi="Avenir Book"/>
+        </w:rPr>
+      </w:pPr>
+      <w:r>
+        <w:rPr>
+          <w:rFonts w:ascii="Avenir Book" w:hAnsi="Avenir Book"/>
+        </w:rPr>
+        <w:t xml:space="preserve">El siguiente gráfico desglosa el estado de las lámparas por categoría a lo largo del tiempo. Cada </w:t>
+      </w:r>
+      <w:r>
+        <w:rPr>
+          <w:rFonts w:ascii="Avenir Book" w:hAnsi="Avenir Book"/>
+        </w:rPr>
+        <w:t>subgráfico</w:t>
+      </w:r>
+      <w:r>
+        <w:rPr>
+          <w:rFonts w:ascii="Avenir Book" w:hAnsi="Avenir Book"/>
+        </w:rPr>
+        <w:t xml:space="preserve"> corresponde a un estado diferente de la lámpara (Buena potencia, Deteriorada, Apagada, etc.) y muestra su evolución mensual mediante barras que representan la cantidad y una línea de tendencia con marcadores. </w:t>
+      </w:r>
+    </w:p>
+    <w:p>
+      <w:r>
+        <w:t>{{lamparas_1_plot}}</w:t>
+      </w:r>
+    </w:p>
+    <w:p>
+      <w:r>
+        <w:t>{{lamparas_1_tabla}}</w:t>
+      </w:r>
+    </w:p>
+    <w:p>
+      <w:pPr>
+        <w:jc w:val="both"/>
+      </w:pPr>
+      <w:r>
+        <w:rPr>
+          <w:rFonts w:ascii="Avenir Book" w:hAnsi="Avenir Book"/>
+        </w:rPr>
+        <w:t xml:space="preserve">El siguiente gráfico presenta una visualización de dispersión con burbujas que muestra el estado de las lámparas por área en </w:t>
+      </w:r>
+      <w:r>
+        <w:rPr>
+          <w:rFonts w:ascii="Avenir Book" w:hAnsi="Avenir Book"/>
+          <w:b/>
+          <w:bCs/>
         </w:rPr>
         <w:t>el mes más reciente</w:t>
       </w:r>
@@ -1950,47 +2432,53 @@
     </w:p>
     <w:p>
       <w:r>
+        <w:t>{{lamparas_2_tabla}}</w:t>
+      </w:r>
+    </w:p>
+    <w:p/>
+    <w:p>
+      <w:pPr>
+        <w:jc w:val="both"/>
+        <w:rPr>
+          <w:rFonts w:ascii="Avenir Book" w:hAnsi="Avenir Book"/>
+        </w:rPr>
+      </w:pPr>
+      <w:r>
+        <w:rPr>
+          <w:rFonts w:ascii="Avenir Book" w:hAnsi="Avenir Book"/>
+        </w:rPr>
+        <w:t xml:space="preserve">El siguiente gráfico </w:t>
+      </w:r>
+      <w:r>
+        <w:rPr>
+          <w:rFonts w:ascii="Avenir Book" w:hAnsi="Avenir Book"/>
+        </w:rPr>
+        <w:t>muestra</w:t>
+      </w:r>
+      <w:r>
+        <w:rPr>
+          <w:rFonts w:ascii="Avenir Book" w:hAnsi="Avenir Book"/>
+        </w:rPr>
+        <w:t xml:space="preserve"> las capturas por especie a lo largo del tiempo. Cada </w:t>
+      </w:r>
+      <w:r>
+        <w:rPr>
+          <w:rFonts w:ascii="Avenir Book" w:hAnsi="Avenir Book"/>
+        </w:rPr>
+        <w:t>subgráfico</w:t>
+      </w:r>
+      <w:r>
+        <w:rPr>
+          <w:rFonts w:ascii="Avenir Book" w:hAnsi="Avenir Book"/>
+        </w:rPr>
+        <w:t xml:space="preserve"> corresponde a una especie diferente capturada por las lámparas y muestra su evolución mensual </w:t>
+      </w:r>
+      <w:r>
+        <w:rPr>
+          <w:rFonts w:ascii="Avenir Book" w:hAnsi="Avenir Book"/>
+        </w:rPr>
         <w:lastRenderedPageBreak/>
-        <w:t>{{lamparas_2_tabla}}</w:t>
-      </w:r>
-    </w:p>
-    <w:p/>
-    <w:p>
-      <w:pPr>
-        <w:jc w:val="both"/>
-        <w:rPr>
-          <w:rFonts w:ascii="Avenir Book" w:hAnsi="Avenir Book"/>
-        </w:rPr>
-      </w:pPr>
-      <w:r>
-        <w:rPr>
-          <w:rFonts w:ascii="Avenir Book" w:hAnsi="Avenir Book"/>
-        </w:rPr>
-        <w:t xml:space="preserve">El siguiente gráfico </w:t>
-      </w:r>
-      <w:r>
-        <w:rPr>
-          <w:rFonts w:ascii="Avenir Book" w:hAnsi="Avenir Book"/>
-        </w:rPr>
-        <w:t>muestra</w:t>
-      </w:r>
-      <w:r>
-        <w:rPr>
-          <w:rFonts w:ascii="Avenir Book" w:hAnsi="Avenir Book"/>
-        </w:rPr>
-        <w:t xml:space="preserve"> las capturas por especie a lo largo del tiempo. Cada </w:t>
-      </w:r>
-      <w:r>
-        <w:rPr>
-          <w:rFonts w:ascii="Avenir Book" w:hAnsi="Avenir Book"/>
-        </w:rPr>
-        <w:t>subgráfico</w:t>
-      </w:r>
-      <w:r>
-        <w:rPr>
-          <w:rFonts w:ascii="Avenir Book" w:hAnsi="Avenir Book"/>
-        </w:rPr>
-        <w:t xml:space="preserve"> corresponde a una especie diferente capturada por las lámparas y muestra su evolución mensual mediante barras que representan el volumen de capturas y una línea de tendencia</w:t>
+        <w:t>mediante barras que representan el volumen de capturas y una línea de tendencia</w:t>
       </w:r>
       <w:r>
         <w:rPr>
@@ -2083,12 +2571,25 @@
         <w:rPr>
           <w:b/>
           <w:bCs/>
+          <w:sz w:val="24"/>
+          <w:szCs w:val="24"/>
         </w:rPr>
       </w:pPr>
       <w:r>
         <w:rPr>
           <w:b/>
           <w:bCs/>
+          <w:sz w:val="24"/>
+          <w:szCs w:val="24"/>
+        </w:rPr>
+        <w:t xml:space="preserve">4. </w:t>
+      </w:r>
+      <w:r>
+        <w:rPr>
+          <w:b/>
+          <w:bCs/>
+          <w:sz w:val="24"/>
+          <w:szCs w:val="24"/>
         </w:rPr>
         <w:t>Registro control de órdenes de mantenimiento y seguimiento. CORRECTIVOS</w:t>
       </w:r>
@@ -2253,7 +2754,6 @@
                 <w:b/>
                 <w:bCs/>
               </w:rPr>
-              <w:lastRenderedPageBreak/>
               <w:t>Valores de Referencia</w:t>
             </w:r>
           </w:p>
@@ -2537,6 +3037,7 @@
               <w:rPr>
                 <w:rFonts w:ascii="Avenir Book" w:hAnsi="Avenir Book"/>
               </w:rPr>
+              <w:lastRenderedPageBreak/>
               <w:t>Hormigas</w:t>
             </w:r>
           </w:p>
@@ -3190,19 +3691,223 @@
         <w:rPr>
           <w:b/>
           <w:bCs/>
+          <w:sz w:val="24"/>
+          <w:szCs w:val="24"/>
         </w:rPr>
       </w:pPr>
       <w:r>
         <w:rPr>
           <w:b/>
           <w:bCs/>
-        </w:rPr>
-        <w:t>Recomendaciones</w:t>
+          <w:sz w:val="24"/>
+          <w:szCs w:val="24"/>
+        </w:rPr>
+        <w:t>5</w:t>
       </w:r>
       <w:r>
         <w:rPr>
           <w:b/>
           <w:bCs/>
+          <w:sz w:val="24"/>
+          <w:szCs w:val="24"/>
+        </w:rPr>
+        <w:t>. Control Mensual al hospital Infantil. PLAN DE CHOQUE</w:t>
+      </w:r>
+    </w:p>
+    <w:p>
+      <w:pPr>
+        <w:rPr>
+          <w:b/>
+          <w:bCs/>
+          <w:sz w:val="24"/>
+          <w:szCs w:val="24"/>
+        </w:rPr>
+      </w:pPr>
+    </w:p>
+    <w:p>
+      <w:pPr>
+        <w:rPr>
+          <w:b/>
+          <w:bCs/>
+          <w:sz w:val="24"/>
+          <w:szCs w:val="24"/>
+        </w:rPr>
+      </w:pPr>
+    </w:p>
+    <w:p>
+      <w:pPr>
+        <w:rPr>
+          <w:b/>
+          <w:bCs/>
+          <w:sz w:val="24"/>
+          <w:szCs w:val="24"/>
+        </w:rPr>
+      </w:pPr>
+      <w:r>
+        <w:rPr>
+          <w:b/>
+          <w:bCs/>
+          <w:sz w:val="24"/>
+          <w:szCs w:val="24"/>
+        </w:rPr>
+        <w:t>6.</w:t>
+      </w:r>
+      <w:r>
+        <w:rPr>
+          <w:b/>
+          <w:bCs/>
+          <w:sz w:val="24"/>
+          <w:szCs w:val="24"/>
+        </w:rPr>
+        <w:t xml:space="preserve"> Informe de Zonas comunes (Desnidado, motomochila, zonas verdes, cajas</w:t>
+      </w:r>
+      <w:r>
+        <w:rPr>
+          <w:b/>
+          <w:bCs/>
+          <w:sz w:val="24"/>
+          <w:szCs w:val="24"/>
+        </w:rPr>
+        <w:t xml:space="preserve"> </w:t>
+      </w:r>
+      <w:r>
+        <w:rPr>
+          <w:b/>
+          <w:bCs/>
+          <w:sz w:val="24"/>
+          <w:szCs w:val="24"/>
+        </w:rPr>
+        <w:t xml:space="preserve">de aguas negras…)  </w:t>
+      </w:r>
+    </w:p>
+    <w:p>
+      <w:pPr>
+        <w:rPr>
+          <w:b/>
+          <w:bCs/>
+          <w:sz w:val="24"/>
+          <w:szCs w:val="24"/>
+        </w:rPr>
+      </w:pPr>
+    </w:p>
+    <w:p>
+      <w:pPr>
+        <w:rPr>
+          <w:b/>
+          <w:bCs/>
+          <w:sz w:val="24"/>
+          <w:szCs w:val="24"/>
+        </w:rPr>
+      </w:pPr>
+      <w:r>
+        <w:rPr>
+          <w:b/>
+          <w:bCs/>
+          <w:sz w:val="24"/>
+          <w:szCs w:val="24"/>
+        </w:rPr>
+        <w:t>7</w:t>
+      </w:r>
+      <w:r>
+        <w:rPr>
+          <w:b/>
+          <w:bCs/>
+          <w:sz w:val="24"/>
+          <w:szCs w:val="24"/>
+        </w:rPr>
+        <w:t>.</w:t>
+      </w:r>
+      <w:r>
+        <w:rPr>
+          <w:b/>
+          <w:bCs/>
+          <w:sz w:val="24"/>
+          <w:szCs w:val="24"/>
+        </w:rPr>
+        <w:t xml:space="preserve"> </w:t>
+      </w:r>
+      <w:r>
+        <w:rPr>
+          <w:b/>
+          <w:bCs/>
+          <w:sz w:val="24"/>
+          <w:szCs w:val="24"/>
+        </w:rPr>
+        <w:t>Informe Dengue</w:t>
+      </w:r>
+    </w:p>
+    <w:p>
+      <w:pPr>
+        <w:rPr>
+          <w:b/>
+          <w:bCs/>
+          <w:sz w:val="24"/>
+          <w:szCs w:val="24"/>
+        </w:rPr>
+      </w:pPr>
+      <w:r>
+        <w:rPr>
+          <w:b/>
+          <w:bCs/>
+          <w:sz w:val="24"/>
+          <w:szCs w:val="24"/>
+        </w:rPr>
+        <w:t>8</w:t>
+      </w:r>
+      <w:r>
+        <w:rPr>
+          <w:b/>
+          <w:bCs/>
+          <w:sz w:val="24"/>
+          <w:szCs w:val="24"/>
+        </w:rPr>
+        <w:t>. Registro Fotográfico</w:t>
+      </w:r>
+    </w:p>
+    <w:p>
+      <w:pPr>
+        <w:rPr>
+          <w:b/>
+          <w:bCs/>
+        </w:rPr>
+      </w:pPr>
+    </w:p>
+    <w:p/>
+    <w:p/>
+    <w:p/>
+    <w:p>
+      <w:pPr>
+        <w:rPr>
+          <w:b/>
+          <w:bCs/>
+          <w:sz w:val="24"/>
+          <w:szCs w:val="24"/>
+        </w:rPr>
+      </w:pPr>
+      <w:r>
+        <w:rPr>
+          <w:b/>
+          <w:bCs/>
+          <w:sz w:val="24"/>
+          <w:szCs w:val="24"/>
+        </w:rPr>
+        <w:t xml:space="preserve">9. </w:t>
+      </w:r>
+      <w:r>
+        <w:rPr>
+          <w:b/>
+          <w:bCs/>
+          <w:sz w:val="24"/>
+          <w:szCs w:val="24"/>
+        </w:rPr>
+        <w:t>Recomendaciones</w:t>
+      </w:r>
+      <w:r>
+        <w:rPr>
+          <w:b/>
+          <w:bCs/>
+          <w:sz w:val="24"/>
+          <w:szCs w:val="24"/>
         </w:rPr>
         <w:t xml:space="preserve"> Generales</w:t>
       </w:r>
@@ -3222,6 +3927,7 @@
         <w:rPr>
           <w:rFonts w:ascii="Avenir Book" w:hAnsi="Avenir Book"/>
         </w:rPr>
+        <w:lastRenderedPageBreak/>
         <w:t>Sellar fisuras y grietas que permitan el anidamiento de plagas en áreas que se requieran.</w:t>
       </w:r>
     </w:p>
@@ -3486,7 +4192,6 @@
         <w:rPr>
           <w:rFonts w:ascii="Avenir Book" w:hAnsi="Avenir Book"/>
         </w:rPr>
-        <w:lastRenderedPageBreak/>
         <w:t>Cuidado y protección de los puntos de control, informar al personal de seguridad para proteger las cajas en el perímetro externo e informar a Serviplagas si se presentan novedades.</w:t>
       </w:r>
     </w:p>
@@ -3932,7 +4637,12 @@
       </w:pPr>
     </w:p>
     <w:sectPr>
-      <w:footerReference w:type="default" r:id="rId11"/>
+      <w:headerReference w:type="even" r:id="rId11"/>
+      <w:headerReference w:type="default" r:id="rId12"/>
+      <w:footerReference w:type="even" r:id="rId13"/>
+      <w:footerReference w:type="default" r:id="rId14"/>
+      <w:headerReference w:type="first" r:id="rId15"/>
+      <w:footerReference w:type="first" r:id="rId16"/>
       <w:pgSz w:w="11906" w:h="16838"/>
       <w:pgMar w:top="1440" w:right="1440" w:bottom="1440" w:left="1440" w:header="708" w:footer="708" w:gutter="0"/>
       <w:cols w:space="708"/>
@@ -3968,6 +4678,16 @@
 </file>
 
 <file path=word/footer1.xml><?xml version="1.0" encoding="utf-8"?>
+<w:ftr xmlns:wpc="http://schemas.microsoft.com/office/word/2010/wordprocessingCanvas" xmlns:cx="http://schemas.microsoft.com/office/drawing/2014/chartex" xmlns:cx1="http://schemas.microsoft.com/office/drawing/2015/9/8/chartex" xmlns:cx2="http://schemas.microsoft.com/office/drawing/2015/10/21/chartex" xmlns:cx3="http://schemas.microsoft.com/office/drawing/2016/5/9/chartex" xmlns:cx4="http://schemas.microsoft.com/office/drawing/2016/5/10/chartex" xmlns:cx5="http://schemas.microsoft.com/office/drawing/2016/5/11/chartex" xmlns:cx6="http://schemas.microsoft.com/office/drawing/2016/5/12/chartex" xmlns:cx7="http://schemas.microsoft.com/office/drawing/2016/5/13/chartex" xmlns:cx8="http://schemas.microsoft.com/office/drawing/2016/5/14/chartex" xmlns:mc="http://schemas.openxmlformats.org/markup-compatibility/2006" xmlns:aink="http://schemas.microsoft.com/office/drawing/2016/ink" xmlns:am3d="http://schemas.microsoft.com/office/drawing/2017/model3d" xmlns:o="urn:schemas-microsoft-com:office:office" xmlns:oel="http://schemas.microsoft.com/office/2019/extlst" xmlns:r="http://schemas.openxmlformats.org/officeDocument/2006/relationships" xmlns:m="http://schemas.openxmlformats.org/officeDocument/2006/math" xmlns:v="urn:schemas-microsoft-com:vml" xmlns:wp14="http://schemas.microsoft.com/office/word/2010/wordprocessingDrawing" xmlns:wp="http://schemas.openxmlformats.org/drawingml/2006/wordprocessingDrawing" xmlns:w10="urn:schemas-microsoft-com:office:word" xmlns:w="http://schemas.openxmlformats.org/wordprocessingml/2006/main" xmlns:w14="http://schemas.microsoft.com/office/word/2010/wordml" xmlns:w15="http://schemas.microsoft.com/office/word/2012/wordml" xmlns:w16cex="http://schemas.microsoft.com/office/word/2018/wordml/cex" xmlns:w16cid="http://schemas.microsoft.com/office/word/2016/wordml/cid" xmlns:w16="http://schemas.microsoft.com/office/word/2018/wordml" xmlns:w16du="http://schemas.microsoft.com/office/word/2023/wordml/word16du" xmlns:w16sdtdh="http://schemas.microsoft.com/office/word/2020/wordml/sdtdatahash" xmlns:w16sdtfl="http://schemas.microsoft.com/office/word/2024/wordml/sdtformatlock" xmlns:w16se="http://schemas.microsoft.com/office/word/2015/wordml/symex" xmlns:wpg="http://schemas.microsoft.com/office/word/2010/wordprocessingGroup" xmlns:wpi="http://schemas.microsoft.com/office/word/2010/wordprocessingInk" xmlns:wne="http://schemas.microsoft.com/office/word/2006/wordml" xmlns:wps="http://schemas.microsoft.com/office/word/2010/wordprocessingShape" mc:Ignorable="w14 w15 w16se w16cid w16 w16cex w16sdtdh w16sdtfl w16du wp14">
+  <w:p>
+    <w:pPr>
+      <w:pStyle w:val="Footer"/>
+    </w:pPr>
+  </w:p>
+</w:ftr>
+</file>
+
+<file path=word/footer2.xml><?xml version="1.0" encoding="utf-8"?>
 <w:ftr xmlns:wpc="http://schemas.microsoft.com/office/word/2010/wordprocessingCanvas" xmlns:cx="http://schemas.microsoft.com/office/drawing/2014/chartex" xmlns:cx1="http://schemas.microsoft.com/office/drawing/2015/9/8/chartex" xmlns:cx2="http://schemas.microsoft.com/office/drawing/2015/10/21/chartex" xmlns:cx3="http://schemas.microsoft.com/office/drawing/2016/5/9/chartex" xmlns:cx4="http://schemas.microsoft.com/office/drawing/2016/5/10/chartex" xmlns:cx5="http://schemas.microsoft.com/office/drawing/2016/5/11/chartex" xmlns:cx6="http://schemas.microsoft.com/office/drawing/2016/5/12/chartex" xmlns:cx7="http://schemas.microsoft.com/office/drawing/2016/5/13/chartex" xmlns:cx8="http://schemas.microsoft.com/office/drawing/2016/5/14/chartex" xmlns:mc="http://schemas.openxmlformats.org/markup-compatibility/2006" xmlns:aink="http://schemas.microsoft.com/office/drawing/2016/ink" xmlns:am3d="http://schemas.microsoft.com/office/drawing/2017/model3d" xmlns:o="urn:schemas-microsoft-com:office:office" xmlns:oel="http://schemas.microsoft.com/office/2019/extlst" xmlns:r="http://schemas.openxmlformats.org/officeDocument/2006/relationships" xmlns:m="http://schemas.openxmlformats.org/officeDocument/2006/math" xmlns:v="urn:schemas-microsoft-com:vml" xmlns:wp14="http://schemas.microsoft.com/office/word/2010/wordprocessingDrawing" xmlns:wp="http://schemas.openxmlformats.org/drawingml/2006/wordprocessingDrawing" xmlns:w10="urn:schemas-microsoft-com:office:word" xmlns:w="http://schemas.openxmlformats.org/wordprocessingml/2006/main" xmlns:w14="http://schemas.microsoft.com/office/word/2010/wordml" xmlns:w15="http://schemas.microsoft.com/office/word/2012/wordml" xmlns:w16cex="http://schemas.microsoft.com/office/word/2018/wordml/cex" xmlns:w16cid="http://schemas.microsoft.com/office/word/2016/wordml/cid" xmlns:w16="http://schemas.microsoft.com/office/word/2018/wordml" xmlns:w16du="http://schemas.microsoft.com/office/word/2023/wordml/word16du" xmlns:w16sdtdh="http://schemas.microsoft.com/office/word/2020/wordml/sdtdatahash" xmlns:w16sdtfl="http://schemas.microsoft.com/office/word/2024/wordml/sdtformatlock" xmlns:w16se="http://schemas.microsoft.com/office/word/2015/wordml/symex" xmlns:wpg="http://schemas.microsoft.com/office/word/2010/wordprocessingGroup" xmlns:wpi="http://schemas.microsoft.com/office/word/2010/wordprocessingInk" xmlns:wne="http://schemas.microsoft.com/office/word/2006/wordml" xmlns:wps="http://schemas.microsoft.com/office/word/2010/wordprocessingShape" mc:Ignorable="w14 w15 w16se w16cid w16 w16cex w16sdtdh w16sdtfl w16du wp14">
   <w:p>
     <w:pPr>
@@ -4032,6 +4752,16 @@
 </w:ftr>
 </file>
 
+<file path=word/footer3.xml><?xml version="1.0" encoding="utf-8"?>
+<w:ftr xmlns:wpc="http://schemas.microsoft.com/office/word/2010/wordprocessingCanvas" xmlns:cx="http://schemas.microsoft.com/office/drawing/2014/chartex" xmlns:cx1="http://schemas.microsoft.com/office/drawing/2015/9/8/chartex" xmlns:cx2="http://schemas.microsoft.com/office/drawing/2015/10/21/chartex" xmlns:cx3="http://schemas.microsoft.com/office/drawing/2016/5/9/chartex" xmlns:cx4="http://schemas.microsoft.com/office/drawing/2016/5/10/chartex" xmlns:cx5="http://schemas.microsoft.com/office/drawing/2016/5/11/chartex" xmlns:cx6="http://schemas.microsoft.com/office/drawing/2016/5/12/chartex" xmlns:cx7="http://schemas.microsoft.com/office/drawing/2016/5/13/chartex" xmlns:cx8="http://schemas.microsoft.com/office/drawing/2016/5/14/chartex" xmlns:mc="http://schemas.openxmlformats.org/markup-compatibility/2006" xmlns:aink="http://schemas.microsoft.com/office/drawing/2016/ink" xmlns:am3d="http://schemas.microsoft.com/office/drawing/2017/model3d" xmlns:o="urn:schemas-microsoft-com:office:office" xmlns:oel="http://schemas.microsoft.com/office/2019/extlst" xmlns:r="http://schemas.openxmlformats.org/officeDocument/2006/relationships" xmlns:m="http://schemas.openxmlformats.org/officeDocument/2006/math" xmlns:v="urn:schemas-microsoft-com:vml" xmlns:wp14="http://schemas.microsoft.com/office/word/2010/wordprocessingDrawing" xmlns:wp="http://schemas.openxmlformats.org/drawingml/2006/wordprocessingDrawing" xmlns:w10="urn:schemas-microsoft-com:office:word" xmlns:w="http://schemas.openxmlformats.org/wordprocessingml/2006/main" xmlns:w14="http://schemas.microsoft.com/office/word/2010/wordml" xmlns:w15="http://schemas.microsoft.com/office/word/2012/wordml" xmlns:w16cex="http://schemas.microsoft.com/office/word/2018/wordml/cex" xmlns:w16cid="http://schemas.microsoft.com/office/word/2016/wordml/cid" xmlns:w16="http://schemas.microsoft.com/office/word/2018/wordml" xmlns:w16du="http://schemas.microsoft.com/office/word/2023/wordml/word16du" xmlns:w16sdtdh="http://schemas.microsoft.com/office/word/2020/wordml/sdtdatahash" xmlns:w16sdtfl="http://schemas.microsoft.com/office/word/2024/wordml/sdtformatlock" xmlns:w16se="http://schemas.microsoft.com/office/word/2015/wordml/symex" xmlns:wpg="http://schemas.microsoft.com/office/word/2010/wordprocessingGroup" xmlns:wpi="http://schemas.microsoft.com/office/word/2010/wordprocessingInk" xmlns:wne="http://schemas.microsoft.com/office/word/2006/wordml" xmlns:wps="http://schemas.microsoft.com/office/word/2010/wordprocessingShape" mc:Ignorable="w14 w15 w16se w16cid w16 w16cex w16sdtdh w16sdtfl w16du wp14">
+  <w:p>
+    <w:pPr>
+      <w:pStyle w:val="Footer"/>
+    </w:pPr>
+  </w:p>
+</w:ftr>
+</file>
+
 <file path=word/footnotes.xml><?xml version="1.0" encoding="utf-8"?>
 <w:footnotes xmlns:wpc="http://schemas.microsoft.com/office/word/2010/wordprocessingCanvas" xmlns:cx="http://schemas.microsoft.com/office/drawing/2014/chartex" xmlns:cx1="http://schemas.microsoft.com/office/drawing/2015/9/8/chartex" xmlns:cx2="http://schemas.microsoft.com/office/drawing/2015/10/21/chartex" xmlns:cx3="http://schemas.microsoft.com/office/drawing/2016/5/9/chartex" xmlns:cx4="http://schemas.microsoft.com/office/drawing/2016/5/10/chartex" xmlns:cx5="http://schemas.microsoft.com/office/drawing/2016/5/11/chartex" xmlns:cx6="http://schemas.microsoft.com/office/drawing/2016/5/12/chartex" xmlns:cx7="http://schemas.microsoft.com/office/drawing/2016/5/13/chartex" xmlns:cx8="http://schemas.microsoft.com/office/drawing/2016/5/14/chartex" xmlns:mc="http://schemas.openxmlformats.org/markup-compatibility/2006" xmlns:aink="http://schemas.microsoft.com/office/drawing/2016/ink" xmlns:am3d="http://schemas.microsoft.com/office/drawing/2017/model3d" xmlns:o="urn:schemas-microsoft-com:office:office" xmlns:oel="http://schemas.microsoft.com/office/2019/extlst" xmlns:r="http://schemas.openxmlformats.org/officeDocument/2006/relationships" xmlns:m="http://schemas.openxmlformats.org/officeDocument/2006/math" xmlns:v="urn:schemas-microsoft-com:vml" xmlns:wp14="http://schemas.microsoft.com/office/word/2010/wordprocessingDrawing" xmlns:wp="http://schemas.openxmlformats.org/drawingml/2006/wordprocessingDrawing" xmlns:w10="urn:schemas-microsoft-com:office:word" xmlns:w="http://schemas.openxmlformats.org/wordprocessingml/2006/main" xmlns:w14="http://schemas.microsoft.com/office/word/2010/wordml" xmlns:w15="http://schemas.microsoft.com/office/word/2012/wordml" xmlns:w16cex="http://schemas.microsoft.com/office/word/2018/wordml/cex" xmlns:w16cid="http://schemas.microsoft.com/office/word/2016/wordml/cid" xmlns:w16="http://schemas.microsoft.com/office/word/2018/wordml" xmlns:w16du="http://schemas.microsoft.com/office/word/2023/wordml/word16du" xmlns:w16sdtdh="http://schemas.microsoft.com/office/word/2020/wordml/sdtdatahash" xmlns:w16sdtfl="http://schemas.microsoft.com/office/word/2024/wordml/sdtformatlock" xmlns:w16se="http://schemas.microsoft.com/office/word/2015/wordml/symex" xmlns:wpg="http://schemas.microsoft.com/office/word/2010/wordprocessingGroup" xmlns:wpi="http://schemas.microsoft.com/office/word/2010/wordprocessingInk" xmlns:wne="http://schemas.microsoft.com/office/word/2006/wordml" xmlns:wps="http://schemas.microsoft.com/office/word/2010/wordprocessingShape" mc:Ignorable="w14 w15 w16se w16cid w16 w16cex w16sdtdh w16sdtfl w16du wp14">
   <w:footnote w:type="separator" w:id="-1">
@@ -4055,6 +4785,123 @@
     </w:p>
   </w:footnote>
 </w:footnotes>
+</file>
+
+<file path=word/header1.xml><?xml version="1.0" encoding="utf-8"?>
+<w:hdr xmlns:wpc="http://schemas.microsoft.com/office/word/2010/wordprocessingCanvas" xmlns:cx="http://schemas.microsoft.com/office/drawing/2014/chartex" xmlns:cx1="http://schemas.microsoft.com/office/drawing/2015/9/8/chartex" xmlns:cx2="http://schemas.microsoft.com/office/drawing/2015/10/21/chartex" xmlns:cx3="http://schemas.microsoft.com/office/drawing/2016/5/9/chartex" xmlns:cx4="http://schemas.microsoft.com/office/drawing/2016/5/10/chartex" xmlns:cx5="http://schemas.microsoft.com/office/drawing/2016/5/11/chartex" xmlns:cx6="http://schemas.microsoft.com/office/drawing/2016/5/12/chartex" xmlns:cx7="http://schemas.microsoft.com/office/drawing/2016/5/13/chartex" xmlns:cx8="http://schemas.microsoft.com/office/drawing/2016/5/14/chartex" xmlns:mc="http://schemas.openxmlformats.org/markup-compatibility/2006" xmlns:aink="http://schemas.microsoft.com/office/drawing/2016/ink" xmlns:am3d="http://schemas.microsoft.com/office/drawing/2017/model3d" xmlns:o="urn:schemas-microsoft-com:office:office" xmlns:oel="http://schemas.microsoft.com/office/2019/extlst" xmlns:r="http://schemas.openxmlformats.org/officeDocument/2006/relationships" xmlns:m="http://schemas.openxmlformats.org/officeDocument/2006/math" xmlns:v="urn:schemas-microsoft-com:vml" xmlns:wp14="http://schemas.microsoft.com/office/word/2010/wordprocessingDrawing" xmlns:wp="http://schemas.openxmlformats.org/drawingml/2006/wordprocessingDrawing" xmlns:w10="urn:schemas-microsoft-com:office:word" xmlns:w="http://schemas.openxmlformats.org/wordprocessingml/2006/main" xmlns:w14="http://schemas.microsoft.com/office/word/2010/wordml" xmlns:w15="http://schemas.microsoft.com/office/word/2012/wordml" xmlns:w16cex="http://schemas.microsoft.com/office/word/2018/wordml/cex" xmlns:w16cid="http://schemas.microsoft.com/office/word/2016/wordml/cid" xmlns:w16="http://schemas.microsoft.com/office/word/2018/wordml" xmlns:w16du="http://schemas.microsoft.com/office/word/2023/wordml/word16du" xmlns:w16sdtdh="http://schemas.microsoft.com/office/word/2020/wordml/sdtdatahash" xmlns:w16sdtfl="http://schemas.microsoft.com/office/word/2024/wordml/sdtformatlock" xmlns:w16se="http://schemas.microsoft.com/office/word/2015/wordml/symex" xmlns:wpg="http://schemas.microsoft.com/office/word/2010/wordprocessingGroup" xmlns:wpi="http://schemas.microsoft.com/office/word/2010/wordprocessingInk" xmlns:wne="http://schemas.microsoft.com/office/word/2006/wordml" xmlns:wps="http://schemas.microsoft.com/office/word/2010/wordprocessingShape" mc:Ignorable="w14 w15 w16se w16cid w16 w16cex w16sdtdh w16sdtfl w16du wp14">
+  <w:p>
+    <w:pPr>
+      <w:pStyle w:val="Header"/>
+    </w:pPr>
+    <w:r>
+      <w:rPr>
+        <w:noProof/>
+      </w:rPr>
+      <w:pict w14:anchorId="3C8A2A3E">
+        <v:shapetype id="_x0000_t75" coordsize="21600,21600" o:spt="75" o:preferrelative="t" path="m@4@5l@4@11@9@11@9@5xe" filled="f" stroked="f">
+          <v:stroke joinstyle="miter"/>
+          <v:formulas>
+            <v:f eqn="if lineDrawn pixelLineWidth 0"/>
+            <v:f eqn="sum @0 1 0"/>
+            <v:f eqn="sum 0 0 @1"/>
+            <v:f eqn="prod @2 1 2"/>
+            <v:f eqn="prod @3 21600 pixelWidth"/>
+            <v:f eqn="prod @3 21600 pixelHeight"/>
+            <v:f eqn="sum @0 0 1"/>
+            <v:f eqn="prod @6 1 2"/>
+            <v:f eqn="prod @7 21600 pixelWidth"/>
+            <v:f eqn="sum @8 21600 0"/>
+            <v:f eqn="prod @7 21600 pixelHeight"/>
+            <v:f eqn="sum @10 21600 0"/>
+          </v:formulas>
+          <v:path o:extrusionok="f" gradientshapeok="t" o:connecttype="rect"/>
+          <o:lock v:ext="edit" aspectratio="t"/>
+        </v:shapetype>
+        <v:shape id="WordPictureWatermark760247019" o:spid="_x0000_s1027" type="#_x0000_t75" alt="" style="position:absolute;margin-left:0;margin-top:0;width:450.65pt;height:461.85pt;z-index:-251653120;mso-wrap-edited:f;mso-width-percent:0;mso-height-percent:0;mso-position-horizontal:center;mso-position-horizontal-relative:margin;mso-position-vertical:center;mso-position-vertical-relative:margin;mso-width-percent:0;mso-height-percent:0" o:allowincell="f">
+          <v:imagedata r:id="rId1" o:title="original_iso9001-codigo" gain="19661f" blacklevel="22938f"/>
+        </v:shape>
+      </w:pict>
+    </w:r>
+  </w:p>
+</w:hdr>
+</file>
+
+<file path=word/header2.xml><?xml version="1.0" encoding="utf-8"?>
+<w:hdr xmlns:wpc="http://schemas.microsoft.com/office/word/2010/wordprocessingCanvas" xmlns:cx="http://schemas.microsoft.com/office/drawing/2014/chartex" xmlns:cx1="http://schemas.microsoft.com/office/drawing/2015/9/8/chartex" xmlns:cx2="http://schemas.microsoft.com/office/drawing/2015/10/21/chartex" xmlns:cx3="http://schemas.microsoft.com/office/drawing/2016/5/9/chartex" xmlns:cx4="http://schemas.microsoft.com/office/drawing/2016/5/10/chartex" xmlns:cx5="http://schemas.microsoft.com/office/drawing/2016/5/11/chartex" xmlns:cx6="http://schemas.microsoft.com/office/drawing/2016/5/12/chartex" xmlns:cx7="http://schemas.microsoft.com/office/drawing/2016/5/13/chartex" xmlns:cx8="http://schemas.microsoft.com/office/drawing/2016/5/14/chartex" xmlns:mc="http://schemas.openxmlformats.org/markup-compatibility/2006" xmlns:aink="http://schemas.microsoft.com/office/drawing/2016/ink" xmlns:am3d="http://schemas.microsoft.com/office/drawing/2017/model3d" xmlns:o="urn:schemas-microsoft-com:office:office" xmlns:oel="http://schemas.microsoft.com/office/2019/extlst" xmlns:r="http://schemas.openxmlformats.org/officeDocument/2006/relationships" xmlns:m="http://schemas.openxmlformats.org/officeDocument/2006/math" xmlns:v="urn:schemas-microsoft-com:vml" xmlns:wp14="http://schemas.microsoft.com/office/word/2010/wordprocessingDrawing" xmlns:wp="http://schemas.openxmlformats.org/drawingml/2006/wordprocessingDrawing" xmlns:w10="urn:schemas-microsoft-com:office:word" xmlns:w="http://schemas.openxmlformats.org/wordprocessingml/2006/main" xmlns:w14="http://schemas.microsoft.com/office/word/2010/wordml" xmlns:w15="http://schemas.microsoft.com/office/word/2012/wordml" xmlns:w16cex="http://schemas.microsoft.com/office/word/2018/wordml/cex" xmlns:w16cid="http://schemas.microsoft.com/office/word/2016/wordml/cid" xmlns:w16="http://schemas.microsoft.com/office/word/2018/wordml" xmlns:w16du="http://schemas.microsoft.com/office/word/2023/wordml/word16du" xmlns:w16sdtdh="http://schemas.microsoft.com/office/word/2020/wordml/sdtdatahash" xmlns:w16sdtfl="http://schemas.microsoft.com/office/word/2024/wordml/sdtformatlock" xmlns:w16se="http://schemas.microsoft.com/office/word/2015/wordml/symex" xmlns:wpg="http://schemas.microsoft.com/office/word/2010/wordprocessingGroup" xmlns:wpi="http://schemas.microsoft.com/office/word/2010/wordprocessingInk" xmlns:wne="http://schemas.microsoft.com/office/word/2006/wordml" xmlns:wps="http://schemas.microsoft.com/office/word/2010/wordprocessingShape" mc:Ignorable="w14 w15 w16se w16cid w16 w16cex w16sdtdh w16sdtfl w16du wp14">
+  <w:p>
+    <w:pPr>
+      <w:pStyle w:val="Header"/>
+    </w:pPr>
+    <w:r>
+      <w:rPr>
+        <w:noProof/>
+      </w:rPr>
+      <w:pict w14:anchorId="03D70D74">
+        <v:shapetype id="_x0000_t75" coordsize="21600,21600" o:spt="75" o:preferrelative="t" path="m@4@5l@4@11@9@11@9@5xe" filled="f" stroked="f">
+          <v:stroke joinstyle="miter"/>
+          <v:formulas>
+            <v:f eqn="if lineDrawn pixelLineWidth 0"/>
+            <v:f eqn="sum @0 1 0"/>
+            <v:f eqn="sum 0 0 @1"/>
+            <v:f eqn="prod @2 1 2"/>
+            <v:f eqn="prod @3 21600 pixelWidth"/>
+            <v:f eqn="prod @3 21600 pixelHeight"/>
+            <v:f eqn="sum @0 0 1"/>
+            <v:f eqn="prod @6 1 2"/>
+            <v:f eqn="prod @7 21600 pixelWidth"/>
+            <v:f eqn="sum @8 21600 0"/>
+            <v:f eqn="prod @7 21600 pixelHeight"/>
+            <v:f eqn="sum @10 21600 0"/>
+          </v:formulas>
+          <v:path o:extrusionok="f" gradientshapeok="t" o:connecttype="rect"/>
+          <o:lock v:ext="edit" aspectratio="t"/>
+        </v:shapetype>
+        <v:shape id="WordPictureWatermark760247020" o:spid="_x0000_s1026" type="#_x0000_t75" alt="" style="position:absolute;margin-left:0;margin-top:0;width:450.65pt;height:461.85pt;z-index:-251650048;mso-wrap-edited:f;mso-width-percent:0;mso-height-percent:0;mso-position-horizontal:center;mso-position-horizontal-relative:margin;mso-position-vertical:center;mso-position-vertical-relative:margin;mso-width-percent:0;mso-height-percent:0" o:allowincell="f">
+          <v:imagedata r:id="rId1" o:title="original_iso9001-codigo" gain="19661f" blacklevel="22938f"/>
+        </v:shape>
+      </w:pict>
+    </w:r>
+  </w:p>
+</w:hdr>
+</file>
+
+<file path=word/header3.xml><?xml version="1.0" encoding="utf-8"?>
+<w:hdr xmlns:wpc="http://schemas.microsoft.com/office/word/2010/wordprocessingCanvas" xmlns:cx="http://schemas.microsoft.com/office/drawing/2014/chartex" xmlns:cx1="http://schemas.microsoft.com/office/drawing/2015/9/8/chartex" xmlns:cx2="http://schemas.microsoft.com/office/drawing/2015/10/21/chartex" xmlns:cx3="http://schemas.microsoft.com/office/drawing/2016/5/9/chartex" xmlns:cx4="http://schemas.microsoft.com/office/drawing/2016/5/10/chartex" xmlns:cx5="http://schemas.microsoft.com/office/drawing/2016/5/11/chartex" xmlns:cx6="http://schemas.microsoft.com/office/drawing/2016/5/12/chartex" xmlns:cx7="http://schemas.microsoft.com/office/drawing/2016/5/13/chartex" xmlns:cx8="http://schemas.microsoft.com/office/drawing/2016/5/14/chartex" xmlns:mc="http://schemas.openxmlformats.org/markup-compatibility/2006" xmlns:aink="http://schemas.microsoft.com/office/drawing/2016/ink" xmlns:am3d="http://schemas.microsoft.com/office/drawing/2017/model3d" xmlns:o="urn:schemas-microsoft-com:office:office" xmlns:oel="http://schemas.microsoft.com/office/2019/extlst" xmlns:r="http://schemas.openxmlformats.org/officeDocument/2006/relationships" xmlns:m="http://schemas.openxmlformats.org/officeDocument/2006/math" xmlns:v="urn:schemas-microsoft-com:vml" xmlns:wp14="http://schemas.microsoft.com/office/word/2010/wordprocessingDrawing" xmlns:wp="http://schemas.openxmlformats.org/drawingml/2006/wordprocessingDrawing" xmlns:w10="urn:schemas-microsoft-com:office:word" xmlns:w="http://schemas.openxmlformats.org/wordprocessingml/2006/main" xmlns:w14="http://schemas.microsoft.com/office/word/2010/wordml" xmlns:w15="http://schemas.microsoft.com/office/word/2012/wordml" xmlns:w16cex="http://schemas.microsoft.com/office/word/2018/wordml/cex" xmlns:w16cid="http://schemas.microsoft.com/office/word/2016/wordml/cid" xmlns:w16="http://schemas.microsoft.com/office/word/2018/wordml" xmlns:w16du="http://schemas.microsoft.com/office/word/2023/wordml/word16du" xmlns:w16sdtdh="http://schemas.microsoft.com/office/word/2020/wordml/sdtdatahash" xmlns:w16sdtfl="http://schemas.microsoft.com/office/word/2024/wordml/sdtformatlock" xmlns:w16se="http://schemas.microsoft.com/office/word/2015/wordml/symex" xmlns:wpg="http://schemas.microsoft.com/office/word/2010/wordprocessingGroup" xmlns:wpi="http://schemas.microsoft.com/office/word/2010/wordprocessingInk" xmlns:wne="http://schemas.microsoft.com/office/word/2006/wordml" xmlns:wps="http://schemas.microsoft.com/office/word/2010/wordprocessingShape" mc:Ignorable="w14 w15 w16se w16cid w16 w16cex w16sdtdh w16sdtfl w16du wp14">
+  <w:p>
+    <w:pPr>
+      <w:pStyle w:val="Header"/>
+    </w:pPr>
+    <w:r>
+      <w:rPr>
+        <w:noProof/>
+      </w:rPr>
+      <w:pict w14:anchorId="6E34170A">
+        <v:shapetype id="_x0000_t75" coordsize="21600,21600" o:spt="75" o:preferrelative="t" path="m@4@5l@4@11@9@11@9@5xe" filled="f" stroked="f">
+          <v:stroke joinstyle="miter"/>
+          <v:formulas>
+            <v:f eqn="if lineDrawn pixelLineWidth 0"/>
+            <v:f eqn="sum @0 1 0"/>
+            <v:f eqn="sum 0 0 @1"/>
+            <v:f eqn="prod @2 1 2"/>
+            <v:f eqn="prod @3 21600 pixelWidth"/>
+            <v:f eqn="prod @3 21600 pixelHeight"/>
+            <v:f eqn="sum @0 0 1"/>
+            <v:f eqn="prod @6 1 2"/>
+            <v:f eqn="prod @7 21600 pixelWidth"/>
+            <v:f eqn="sum @8 21600 0"/>
+            <v:f eqn="prod @7 21600 pixelHeight"/>
+            <v:f eqn="sum @10 21600 0"/>
+          </v:formulas>
+          <v:path o:extrusionok="f" gradientshapeok="t" o:connecttype="rect"/>
+          <o:lock v:ext="edit" aspectratio="t"/>
+        </v:shapetype>
+        <v:shape id="WordPictureWatermark760247018" o:spid="_x0000_s1025" type="#_x0000_t75" alt="" style="position:absolute;margin-left:0;margin-top:0;width:450.65pt;height:461.85pt;z-index:-251656192;mso-wrap-edited:f;mso-width-percent:0;mso-height-percent:0;mso-position-horizontal:center;mso-position-horizontal-relative:margin;mso-position-vertical:center;mso-position-vertical-relative:margin;mso-width-percent:0;mso-height-percent:0" o:allowincell="f">
+          <v:imagedata r:id="rId1" o:title="original_iso9001-codigo" gain="19661f" blacklevel="22938f"/>
+        </v:shape>
+      </w:pict>
+    </w:r>
+  </w:p>
+</w:hdr>
 </file>
 
 <file path=word/numbering.xml><?xml version="1.0" encoding="utf-8"?>
@@ -4355,6 +5202,119 @@
     </w:lvl>
   </w:abstractNum>
   <w:abstractNum w:abstractNumId="3" w15:restartNumberingAfterBreak="0">
+    <w:nsid w:val="573318D2"/>
+    <w:multiLevelType w:val="hybridMultilevel"/>
+    <w:tmpl w:val="E5BCF90C"/>
+    <w:lvl w:ilvl="0" w:tplc="04090001">
+      <w:start w:val="1"/>
+      <w:numFmt w:val="bullet"/>
+      <w:lvlText w:val=""/>
+      <w:lvlJc w:val="left"/>
+      <w:pPr>
+        <w:ind w:left="720" w:hanging="360"/>
+      </w:pPr>
+      <w:rPr>
+        <w:rFonts w:ascii="Symbol" w:hAnsi="Symbol" w:hint="default"/>
+      </w:rPr>
+    </w:lvl>
+    <w:lvl w:ilvl="1" w:tplc="04090003" w:tentative="1">
+      <w:start w:val="1"/>
+      <w:numFmt w:val="bullet"/>
+      <w:lvlText w:val="o"/>
+      <w:lvlJc w:val="left"/>
+      <w:pPr>
+        <w:ind w:left="1440" w:hanging="360"/>
+      </w:pPr>
+      <w:rPr>
+        <w:rFonts w:ascii="Courier New" w:hAnsi="Courier New" w:cs="Courier New" w:hint="default"/>
+      </w:rPr>
+    </w:lvl>
+    <w:lvl w:ilvl="2" w:tplc="04090005" w:tentative="1">
+      <w:start w:val="1"/>
+      <w:numFmt w:val="bullet"/>
+      <w:lvlText w:val=""/>
+      <w:lvlJc w:val="left"/>
+      <w:pPr>
+        <w:ind w:left="2160" w:hanging="360"/>
+      </w:pPr>
+      <w:rPr>
+        <w:rFonts w:ascii="Wingdings" w:hAnsi="Wingdings" w:hint="default"/>
+      </w:rPr>
+    </w:lvl>
+    <w:lvl w:ilvl="3" w:tplc="04090001" w:tentative="1">
+      <w:start w:val="1"/>
+      <w:numFmt w:val="bullet"/>
+      <w:lvlText w:val=""/>
+      <w:lvlJc w:val="left"/>
+      <w:pPr>
+        <w:ind w:left="2880" w:hanging="360"/>
+      </w:pPr>
+      <w:rPr>
+        <w:rFonts w:ascii="Symbol" w:hAnsi="Symbol" w:hint="default"/>
+      </w:rPr>
+    </w:lvl>
+    <w:lvl w:ilvl="4" w:tplc="04090003" w:tentative="1">
+      <w:start w:val="1"/>
+      <w:numFmt w:val="bullet"/>
+      <w:lvlText w:val="o"/>
+      <w:lvlJc w:val="left"/>
+      <w:pPr>
+        <w:ind w:left="3600" w:hanging="360"/>
+      </w:pPr>
+      <w:rPr>
+        <w:rFonts w:ascii="Courier New" w:hAnsi="Courier New" w:cs="Courier New" w:hint="default"/>
+      </w:rPr>
+    </w:lvl>
+    <w:lvl w:ilvl="5" w:tplc="04090005" w:tentative="1">
+      <w:start w:val="1"/>
+      <w:numFmt w:val="bullet"/>
+      <w:lvlText w:val=""/>
+      <w:lvlJc w:val="left"/>
+      <w:pPr>
+        <w:ind w:left="4320" w:hanging="360"/>
+      </w:pPr>
+      <w:rPr>
+        <w:rFonts w:ascii="Wingdings" w:hAnsi="Wingdings" w:hint="default"/>
+      </w:rPr>
+    </w:lvl>
+    <w:lvl w:ilvl="6" w:tplc="04090001" w:tentative="1">
+      <w:start w:val="1"/>
+      <w:numFmt w:val="bullet"/>
+      <w:lvlText w:val=""/>
+      <w:lvlJc w:val="left"/>
+      <w:pPr>
+        <w:ind w:left="5040" w:hanging="360"/>
+      </w:pPr>
+      <w:rPr>
+        <w:rFonts w:ascii="Symbol" w:hAnsi="Symbol" w:hint="default"/>
+      </w:rPr>
+    </w:lvl>
+    <w:lvl w:ilvl="7" w:tplc="04090003" w:tentative="1">
+      <w:start w:val="1"/>
+      <w:numFmt w:val="bullet"/>
+      <w:lvlText w:val="o"/>
+      <w:lvlJc w:val="left"/>
+      <w:pPr>
+        <w:ind w:left="5760" w:hanging="360"/>
+      </w:pPr>
+      <w:rPr>
+        <w:rFonts w:ascii="Courier New" w:hAnsi="Courier New" w:cs="Courier New" w:hint="default"/>
+      </w:rPr>
+    </w:lvl>
+    <w:lvl w:ilvl="8" w:tplc="04090005" w:tentative="1">
+      <w:start w:val="1"/>
+      <w:numFmt w:val="bullet"/>
+      <w:lvlText w:val=""/>
+      <w:lvlJc w:val="left"/>
+      <w:pPr>
+        <w:ind w:left="6480" w:hanging="360"/>
+      </w:pPr>
+      <w:rPr>
+        <w:rFonts w:ascii="Wingdings" w:hAnsi="Wingdings" w:hint="default"/>
+      </w:rPr>
+    </w:lvl>
+  </w:abstractNum>
+  <w:abstractNum w:abstractNumId="4" w15:restartNumberingAfterBreak="0">
     <w:nsid w:val="5DCF27DE"/>
     <w:multiLevelType w:val="hybridMultilevel"/>
     <w:tmpl w:val="4CC6CDD2"/>
@@ -4443,7 +5403,120 @@
       </w:pPr>
     </w:lvl>
   </w:abstractNum>
-  <w:abstractNum w:abstractNumId="4" w15:restartNumberingAfterBreak="0">
+  <w:abstractNum w:abstractNumId="5" w15:restartNumberingAfterBreak="0">
+    <w:nsid w:val="5F296D3D"/>
+    <w:multiLevelType w:val="hybridMultilevel"/>
+    <w:tmpl w:val="17E4F9FC"/>
+    <w:lvl w:ilvl="0" w:tplc="04090001">
+      <w:start w:val="1"/>
+      <w:numFmt w:val="bullet"/>
+      <w:lvlText w:val=""/>
+      <w:lvlJc w:val="left"/>
+      <w:pPr>
+        <w:ind w:left="720" w:hanging="360"/>
+      </w:pPr>
+      <w:rPr>
+        <w:rFonts w:ascii="Symbol" w:hAnsi="Symbol" w:hint="default"/>
+      </w:rPr>
+    </w:lvl>
+    <w:lvl w:ilvl="1" w:tplc="04090003" w:tentative="1">
+      <w:start w:val="1"/>
+      <w:numFmt w:val="bullet"/>
+      <w:lvlText w:val="o"/>
+      <w:lvlJc w:val="left"/>
+      <w:pPr>
+        <w:ind w:left="1440" w:hanging="360"/>
+      </w:pPr>
+      <w:rPr>
+        <w:rFonts w:ascii="Courier New" w:hAnsi="Courier New" w:cs="Courier New" w:hint="default"/>
+      </w:rPr>
+    </w:lvl>
+    <w:lvl w:ilvl="2" w:tplc="04090005" w:tentative="1">
+      <w:start w:val="1"/>
+      <w:numFmt w:val="bullet"/>
+      <w:lvlText w:val=""/>
+      <w:lvlJc w:val="left"/>
+      <w:pPr>
+        <w:ind w:left="2160" w:hanging="360"/>
+      </w:pPr>
+      <w:rPr>
+        <w:rFonts w:ascii="Wingdings" w:hAnsi="Wingdings" w:hint="default"/>
+      </w:rPr>
+    </w:lvl>
+    <w:lvl w:ilvl="3" w:tplc="04090001" w:tentative="1">
+      <w:start w:val="1"/>
+      <w:numFmt w:val="bullet"/>
+      <w:lvlText w:val=""/>
+      <w:lvlJc w:val="left"/>
+      <w:pPr>
+        <w:ind w:left="2880" w:hanging="360"/>
+      </w:pPr>
+      <w:rPr>
+        <w:rFonts w:ascii="Symbol" w:hAnsi="Symbol" w:hint="default"/>
+      </w:rPr>
+    </w:lvl>
+    <w:lvl w:ilvl="4" w:tplc="04090003" w:tentative="1">
+      <w:start w:val="1"/>
+      <w:numFmt w:val="bullet"/>
+      <w:lvlText w:val="o"/>
+      <w:lvlJc w:val="left"/>
+      <w:pPr>
+        <w:ind w:left="3600" w:hanging="360"/>
+      </w:pPr>
+      <w:rPr>
+        <w:rFonts w:ascii="Courier New" w:hAnsi="Courier New" w:cs="Courier New" w:hint="default"/>
+      </w:rPr>
+    </w:lvl>
+    <w:lvl w:ilvl="5" w:tplc="04090005" w:tentative="1">
+      <w:start w:val="1"/>
+      <w:numFmt w:val="bullet"/>
+      <w:lvlText w:val=""/>
+      <w:lvlJc w:val="left"/>
+      <w:pPr>
+        <w:ind w:left="4320" w:hanging="360"/>
+      </w:pPr>
+      <w:rPr>
+        <w:rFonts w:ascii="Wingdings" w:hAnsi="Wingdings" w:hint="default"/>
+      </w:rPr>
+    </w:lvl>
+    <w:lvl w:ilvl="6" w:tplc="04090001" w:tentative="1">
+      <w:start w:val="1"/>
+      <w:numFmt w:val="bullet"/>
+      <w:lvlText w:val=""/>
+      <w:lvlJc w:val="left"/>
+      <w:pPr>
+        <w:ind w:left="5040" w:hanging="360"/>
+      </w:pPr>
+      <w:rPr>
+        <w:rFonts w:ascii="Symbol" w:hAnsi="Symbol" w:hint="default"/>
+      </w:rPr>
+    </w:lvl>
+    <w:lvl w:ilvl="7" w:tplc="04090003" w:tentative="1">
+      <w:start w:val="1"/>
+      <w:numFmt w:val="bullet"/>
+      <w:lvlText w:val="o"/>
+      <w:lvlJc w:val="left"/>
+      <w:pPr>
+        <w:ind w:left="5760" w:hanging="360"/>
+      </w:pPr>
+      <w:rPr>
+        <w:rFonts w:ascii="Courier New" w:hAnsi="Courier New" w:cs="Courier New" w:hint="default"/>
+      </w:rPr>
+    </w:lvl>
+    <w:lvl w:ilvl="8" w:tplc="04090005" w:tentative="1">
+      <w:start w:val="1"/>
+      <w:numFmt w:val="bullet"/>
+      <w:lvlText w:val=""/>
+      <w:lvlJc w:val="left"/>
+      <w:pPr>
+        <w:ind w:left="6480" w:hanging="360"/>
+      </w:pPr>
+      <w:rPr>
+        <w:rFonts w:ascii="Wingdings" w:hAnsi="Wingdings" w:hint="default"/>
+      </w:rPr>
+    </w:lvl>
+  </w:abstractNum>
+  <w:abstractNum w:abstractNumId="6" w15:restartNumberingAfterBreak="0">
     <w:nsid w:val="716157F2"/>
     <w:multiLevelType w:val="hybridMultilevel"/>
     <w:tmpl w:val="60842886"/>
@@ -4539,9 +5612,15 @@
     <w:abstractNumId w:val="2"/>
   </w:num>
   <w:num w:numId="4" w16cid:durableId="224727757">
+    <w:abstractNumId w:val="6"/>
+  </w:num>
+  <w:num w:numId="5" w16cid:durableId="283122262">
     <w:abstractNumId w:val="4"/>
   </w:num>
-  <w:num w:numId="5" w16cid:durableId="283122262">
+  <w:num w:numId="6" w16cid:durableId="1706560086">
+    <w:abstractNumId w:val="5"/>
+  </w:num>
+  <w:num w:numId="7" w16cid:durableId="2059669307">
     <w:abstractNumId w:val="3"/>
   </w:num>
 </w:numbering>

</xml_diff>

<commit_message>
Actualizar la plantilla de Word para agregar placeholder de numero_de_bloques
</commit_message>
<xml_diff>
--- a/Plantilla.docx
+++ b/Plantilla.docx
@@ -1159,7 +1159,35 @@
                 <w:rFonts w:ascii="Avenir Light" w:hAnsi="Avenir Light" w:cs="Times New Roman"/>
                 <w:lang w:val="es-ES"/>
               </w:rPr>
-              <w:t>Rondas preventivas mensuales en las áreas asistenciales y administrativas de los 17 bloques que conforman la institución, con el objetivo de reducir la presencia de insectos rastreros, voladores y roedores de menor importancia sanitaria.</w:t>
+              <w:t xml:space="preserve">Rondas preventivas mensuales en las áreas asistenciales y administrativas de </w:t>
+            </w:r>
+            <w:r>
+              <w:rPr>
+                <w:rFonts w:ascii="Avenir Light" w:hAnsi="Avenir Light" w:cs="Times New Roman"/>
+                <w:lang w:val="es-ES"/>
+              </w:rPr>
+              <w:t>{{</w:t>
+            </w:r>
+            <w:r>
+              <w:rPr>
+                <w:rFonts w:ascii="Avenir Light" w:hAnsi="Avenir Light" w:cs="Times New Roman"/>
+                <w:lang w:val="es-ES"/>
+              </w:rPr>
+              <w:t>numero_de_bloques</w:t>
+            </w:r>
+            <w:r>
+              <w:rPr>
+                <w:rFonts w:ascii="Avenir Light" w:hAnsi="Avenir Light" w:cs="Times New Roman"/>
+                <w:lang w:val="es-ES"/>
+              </w:rPr>
+              <w:t xml:space="preserve">}} </w:t>
+            </w:r>
+            <w:r>
+              <w:rPr>
+                <w:rFonts w:ascii="Avenir Light" w:hAnsi="Avenir Light" w:cs="Times New Roman"/>
+                <w:lang w:val="es-ES"/>
+              </w:rPr>
+              <w:t>que conforman la institución, con el objetivo de reducir la presencia de insectos rastreros, voladores y roedores de menor importancia sanitaria.</w:t>
             </w:r>
           </w:p>
           <w:p>
@@ -1458,15 +1486,7 @@
                 <w:b/>
                 <w:bCs/>
               </w:rPr>
-              <w:t>mes_de_analisis</w:t>
-            </w:r>
-            <w:r>
-              <w:rPr>
-                <w:rFonts w:ascii="Avenir Book" w:hAnsi="Avenir Book"/>
-                <w:b/>
-                <w:bCs/>
-              </w:rPr>
-              <w:t>}}</w:t>
+              <w:t>mes_de_analisis}}</w:t>
             </w:r>
             <w:r>
               <w:rPr>
@@ -3702,17 +3722,18 @@
           <w:sz w:val="24"/>
           <w:szCs w:val="24"/>
         </w:rPr>
-        <w:t>5</w:t>
-      </w:r>
-      <w:r>
+        <w:t>5. Control Mensual al hospital Infantil. PLAN DE CHOQUE</w:t>
+      </w:r>
+    </w:p>
+    <w:p>
+      <w:pPr>
         <w:rPr>
           <w:b/>
           <w:bCs/>
           <w:sz w:val="24"/>
           <w:szCs w:val="24"/>
         </w:rPr>
-        <w:t>. Control Mensual al hospital Infantil. PLAN DE CHOQUE</w:t>
-      </w:r>
+      </w:pPr>
     </w:p>
     <w:p>
       <w:pPr>
@@ -3733,34 +3754,35 @@
           <w:szCs w:val="24"/>
         </w:rPr>
       </w:pPr>
-    </w:p>
-    <w:p>
-      <w:pPr>
+      <w:r>
         <w:rPr>
           <w:b/>
           <w:bCs/>
           <w:sz w:val="24"/>
           <w:szCs w:val="24"/>
         </w:rPr>
-      </w:pPr>
-      <w:r>
+        <w:t xml:space="preserve">6. Informe de Zonas comunes (Desnidado, motomochila, zonas verdes, cajas de aguas negras…)  </w:t>
+      </w:r>
+    </w:p>
+    <w:p>
+      <w:pPr>
         <w:rPr>
           <w:b/>
           <w:bCs/>
           <w:sz w:val="24"/>
           <w:szCs w:val="24"/>
         </w:rPr>
-        <w:t>6.</w:t>
-      </w:r>
-      <w:r>
+      </w:pPr>
+    </w:p>
+    <w:p>
+      <w:pPr>
         <w:rPr>
           <w:b/>
           <w:bCs/>
           <w:sz w:val="24"/>
           <w:szCs w:val="24"/>
         </w:rPr>
-        <w:t xml:space="preserve"> Informe de Zonas comunes (Desnidado, motomochila, zonas verdes, cajas</w:t>
-      </w:r>
+      </w:pPr>
       <w:r>
         <w:rPr>
           <w:b/>
@@ -3768,100 +3790,26 @@
           <w:sz w:val="24"/>
           <w:szCs w:val="24"/>
         </w:rPr>
-        <w:t xml:space="preserve"> </w:t>
-      </w:r>
-      <w:r>
+        <w:t>7. Informe Dengue</w:t>
+      </w:r>
+    </w:p>
+    <w:p>
+      <w:pPr>
         <w:rPr>
           <w:b/>
           <w:bCs/>
           <w:sz w:val="24"/>
           <w:szCs w:val="24"/>
         </w:rPr>
-        <w:t xml:space="preserve">de aguas negras…)  </w:t>
-      </w:r>
-    </w:p>
-    <w:p>
-      <w:pPr>
+      </w:pPr>
+      <w:r>
         <w:rPr>
           <w:b/>
           <w:bCs/>
           <w:sz w:val="24"/>
           <w:szCs w:val="24"/>
         </w:rPr>
-      </w:pPr>
-    </w:p>
-    <w:p>
-      <w:pPr>
-        <w:rPr>
-          <w:b/>
-          <w:bCs/>
-          <w:sz w:val="24"/>
-          <w:szCs w:val="24"/>
-        </w:rPr>
-      </w:pPr>
-      <w:r>
-        <w:rPr>
-          <w:b/>
-          <w:bCs/>
-          <w:sz w:val="24"/>
-          <w:szCs w:val="24"/>
-        </w:rPr>
-        <w:t>7</w:t>
-      </w:r>
-      <w:r>
-        <w:rPr>
-          <w:b/>
-          <w:bCs/>
-          <w:sz w:val="24"/>
-          <w:szCs w:val="24"/>
-        </w:rPr>
-        <w:t>.</w:t>
-      </w:r>
-      <w:r>
-        <w:rPr>
-          <w:b/>
-          <w:bCs/>
-          <w:sz w:val="24"/>
-          <w:szCs w:val="24"/>
-        </w:rPr>
-        <w:t xml:space="preserve"> </w:t>
-      </w:r>
-      <w:r>
-        <w:rPr>
-          <w:b/>
-          <w:bCs/>
-          <w:sz w:val="24"/>
-          <w:szCs w:val="24"/>
-        </w:rPr>
-        <w:t>Informe Dengue</w:t>
-      </w:r>
-    </w:p>
-    <w:p>
-      <w:pPr>
-        <w:rPr>
-          <w:b/>
-          <w:bCs/>
-          <w:sz w:val="24"/>
-          <w:szCs w:val="24"/>
-        </w:rPr>
-      </w:pPr>
-      <w:r>
-        <w:rPr>
-          <w:b/>
-          <w:bCs/>
-          <w:sz w:val="24"/>
-          <w:szCs w:val="24"/>
-        </w:rPr>
-        <w:t>8</w:t>
-      </w:r>
-      <w:r>
-        <w:rPr>
-          <w:b/>
-          <w:bCs/>
-          <w:sz w:val="24"/>
-          <w:szCs w:val="24"/>
-        </w:rPr>
-        <w:t>. Registro Fotográfico</w:t>
+        <w:t>8. Registro Fotográfico</w:t>
       </w:r>
     </w:p>
     <w:p>
@@ -4501,11 +4449,21 @@
             </w:r>
           </w:p>
           <w:p>
-            <w:fldSimple w:instr=" DOCVARIABLE &quot;asesor&quot; ">
-              <w:r>
-                <w:t>Fernando Q</w:t>
-              </w:r>
-            </w:fldSimple>
+            <w:r>
+              <w:fldChar w:fldCharType="begin"/>
+            </w:r>
+            <w:r>
+              <w:instrText xml:space="preserve"> DOCVARIABLE "asesor" </w:instrText>
+            </w:r>
+            <w:r>
+              <w:fldChar w:fldCharType="separate"/>
+            </w:r>
+            <w:r>
+              <w:t>Fernando Q</w:t>
+            </w:r>
+            <w:r>
+              <w:fldChar w:fldCharType="end"/>
+            </w:r>
             <w:r>
               <w:t>uintero</w:t>
             </w:r>
@@ -4524,19 +4482,39 @@
             <w:r>
               <w:t xml:space="preserve">Celular:  </w:t>
             </w:r>
-            <w:fldSimple w:instr=" DOCVARIABLE &quot;cel_asesor&quot; ">
-              <w:r>
-                <w:t>311 622 60 19</w:t>
-              </w:r>
-            </w:fldSimple>
+            <w:r>
+              <w:fldChar w:fldCharType="begin"/>
+            </w:r>
+            <w:r>
+              <w:instrText xml:space="preserve"> DOCVARIABLE "cel_asesor" </w:instrText>
+            </w:r>
+            <w:r>
+              <w:fldChar w:fldCharType="separate"/>
+            </w:r>
+            <w:r>
+              <w:t>311 622 60 19</w:t>
+            </w:r>
+            <w:r>
+              <w:fldChar w:fldCharType="end"/>
+            </w:r>
             <w:r>
               <w:t xml:space="preserve">  -   310 469 50 50                                                                             e-mail: </w:t>
             </w:r>
-            <w:fldSimple w:instr=" DOCVARIABLE &quot;e_asesor&quot; ">
-              <w:r>
-                <w:t>splagasmedellin@gmail.co</w:t>
-              </w:r>
-            </w:fldSimple>
+            <w:r>
+              <w:fldChar w:fldCharType="begin"/>
+            </w:r>
+            <w:r>
+              <w:instrText xml:space="preserve"> DOCVARIABLE "e_asesor" </w:instrText>
+            </w:r>
+            <w:r>
+              <w:fldChar w:fldCharType="separate"/>
+            </w:r>
+            <w:r>
+              <w:t>splagasmedellin@gmail.co</w:t>
+            </w:r>
+            <w:r>
+              <w:fldChar w:fldCharType="end"/>
+            </w:r>
             <w:r>
               <w:t>m</w:t>
             </w:r>
@@ -4797,7 +4775,7 @@
       <w:rPr>
         <w:noProof/>
       </w:rPr>
-      <w:pict w14:anchorId="3C8A2A3E">
+      <w:pict w14:anchorId="18CC30CF">
         <v:shapetype id="_x0000_t75" coordsize="21600,21600" o:spt="75" o:preferrelative="t" path="m@4@5l@4@11@9@11@9@5xe" filled="f" stroked="f">
           <v:stroke joinstyle="miter"/>
           <v:formulas>
@@ -4819,6 +4797,7 @@
         </v:shapetype>
         <v:shape id="WordPictureWatermark760247019" o:spid="_x0000_s1027" type="#_x0000_t75" alt="" style="position:absolute;margin-left:0;margin-top:0;width:450.65pt;height:461.85pt;z-index:-251653120;mso-wrap-edited:f;mso-width-percent:0;mso-height-percent:0;mso-position-horizontal:center;mso-position-horizontal-relative:margin;mso-position-vertical:center;mso-position-vertical-relative:margin;mso-width-percent:0;mso-height-percent:0" o:allowincell="f">
           <v:imagedata r:id="rId1" o:title="original_iso9001-codigo" gain="19661f" blacklevel="22938f"/>
+          <w10:wrap anchorx="margin" anchory="margin"/>
         </v:shape>
       </w:pict>
     </w:r>
@@ -4836,7 +4815,7 @@
       <w:rPr>
         <w:noProof/>
       </w:rPr>
-      <w:pict w14:anchorId="03D70D74">
+      <w:pict w14:anchorId="18DC5489">
         <v:shapetype id="_x0000_t75" coordsize="21600,21600" o:spt="75" o:preferrelative="t" path="m@4@5l@4@11@9@11@9@5xe" filled="f" stroked="f">
           <v:stroke joinstyle="miter"/>
           <v:formulas>
@@ -4858,6 +4837,7 @@
         </v:shapetype>
         <v:shape id="WordPictureWatermark760247020" o:spid="_x0000_s1026" type="#_x0000_t75" alt="" style="position:absolute;margin-left:0;margin-top:0;width:450.65pt;height:461.85pt;z-index:-251650048;mso-wrap-edited:f;mso-width-percent:0;mso-height-percent:0;mso-position-horizontal:center;mso-position-horizontal-relative:margin;mso-position-vertical:center;mso-position-vertical-relative:margin;mso-width-percent:0;mso-height-percent:0" o:allowincell="f">
           <v:imagedata r:id="rId1" o:title="original_iso9001-codigo" gain="19661f" blacklevel="22938f"/>
+          <w10:wrap anchorx="margin" anchory="margin"/>
         </v:shape>
       </w:pict>
     </w:r>
@@ -4875,7 +4855,7 @@
       <w:rPr>
         <w:noProof/>
       </w:rPr>
-      <w:pict w14:anchorId="6E34170A">
+      <w:pict w14:anchorId="7A85CDDE">
         <v:shapetype id="_x0000_t75" coordsize="21600,21600" o:spt="75" o:preferrelative="t" path="m@4@5l@4@11@9@11@9@5xe" filled="f" stroked="f">
           <v:stroke joinstyle="miter"/>
           <v:formulas>
@@ -4897,6 +4877,7 @@
         </v:shapetype>
         <v:shape id="WordPictureWatermark760247018" o:spid="_x0000_s1025" type="#_x0000_t75" alt="" style="position:absolute;margin-left:0;margin-top:0;width:450.65pt;height:461.85pt;z-index:-251656192;mso-wrap-edited:f;mso-width-percent:0;mso-height-percent:0;mso-position-horizontal:center;mso-position-horizontal-relative:margin;mso-position-vertical:center;mso-position-vertical-relative:margin;mso-width-percent:0;mso-height-percent:0" o:allowincell="f">
           <v:imagedata r:id="rId1" o:title="original_iso9001-codigo" gain="19661f" blacklevel="22938f"/>
+          <w10:wrap anchorx="margin" anchory="margin"/>
         </v:shape>
       </w:pict>
     </w:r>

</xml_diff>

<commit_message>
Actualizar la plantilla de Word para agregar analisis de Roedores por sede
</commit_message>
<xml_diff>
--- a/Plantilla.docx
+++ b/Plantilla.docx
@@ -2220,8 +2220,31 @@
       </w:r>
     </w:p>
     <w:p>
-      <w:r>
+      <w:pPr>
+        <w:rPr>
+          <w:rFonts w:ascii="Avenir Book" w:hAnsi="Avenir Book"/>
+        </w:rPr>
+      </w:pPr>
+      <w:r>
+        <w:rPr>
+          <w:rFonts w:ascii="Avenir Book" w:hAnsi="Avenir Book"/>
+        </w:rPr>
         <w:t>{{roedores_1_tabla}}</w:t>
+      </w:r>
+    </w:p>
+    <w:p>
+      <w:pPr>
+        <w:jc w:val="both"/>
+        <w:rPr>
+          <w:rFonts w:ascii="Avenir Book" w:hAnsi="Avenir Book"/>
+        </w:rPr>
+      </w:pPr>
+      <w:r>
+        <w:rPr>
+          <w:rFonts w:ascii="Avenir Book" w:hAnsi="Avenir Book"/>
+          <w:highlight w:val="yellow"/>
+        </w:rPr>
+        <w:t>{{analisis_roedores}}</w:t>
       </w:r>
     </w:p>
     <w:p>
@@ -2249,19 +2272,13 @@
         <w:rPr>
           <w:rFonts w:ascii="Avenir Book" w:hAnsi="Avenir Book"/>
         </w:rPr>
-        <w:t xml:space="preserve">. </w:t>
-      </w:r>
-      <w:r>
-        <w:rPr>
-          <w:rFonts w:ascii="Avenir Book" w:hAnsi="Avenir Book"/>
-        </w:rPr>
-        <w:t>La</w:t>
-      </w:r>
-      <w:r>
-        <w:rPr>
-          <w:rFonts w:ascii="Avenir Book" w:hAnsi="Avenir Book"/>
-        </w:rPr>
-        <w:t xml:space="preserve"> línea negra conecta los puntos de datos creando una trayectoria clara de la tendencia a lo largo del tiempo, permitiendo evaluar la presión de roedores y la efectividad del programa de control.</w:t>
+        <w:t>. La línea negra conecta</w:t>
+      </w:r>
+      <w:r>
+        <w:rPr>
+          <w:rFonts w:ascii="Avenir Book" w:hAnsi="Avenir Book"/>
+        </w:rPr>
+        <w:t xml:space="preserve"> los puntos de datos creando una trayectoria clara de la tendencia a lo largo del tiempo, permitiendo evaluar la presión de roedores y la efectividad del programa de control.</w:t>
       </w:r>
     </w:p>
     <w:p>
@@ -2467,6 +2484,7 @@
         <w:rPr>
           <w:rFonts w:ascii="Avenir Book" w:hAnsi="Avenir Book"/>
         </w:rPr>
+        <w:lastRenderedPageBreak/>
         <w:t xml:space="preserve">El siguiente gráfico </w:t>
       </w:r>
       <w:r>
@@ -2491,14 +2509,7 @@
         <w:rPr>
           <w:rFonts w:ascii="Avenir Book" w:hAnsi="Avenir Book"/>
         </w:rPr>
-        <w:t xml:space="preserve"> corresponde a una especie diferente capturada por las lámparas y muestra su evolución mensual </w:t>
-      </w:r>
-      <w:r>
-        <w:rPr>
-          <w:rFonts w:ascii="Avenir Book" w:hAnsi="Avenir Book"/>
-        </w:rPr>
-        <w:lastRenderedPageBreak/>
-        <w:t>mediante barras que representan el volumen de capturas y una línea de tendencia</w:t>
+        <w:t xml:space="preserve"> corresponde a una especie diferente capturada por las lámparas y muestra su evolución mensual mediante barras que representan el volumen de capturas y una línea de tendencia</w:t>
       </w:r>
       <w:r>
         <w:rPr>
@@ -2887,6 +2898,7 @@
               <w:rPr>
                 <w:rFonts w:ascii="Avenir Book" w:hAnsi="Avenir Book"/>
               </w:rPr>
+              <w:lastRenderedPageBreak/>
               <w:t>Cucaracha Americana</w:t>
             </w:r>
           </w:p>
@@ -3057,7 +3069,6 @@
               <w:rPr>
                 <w:rFonts w:ascii="Avenir Book" w:hAnsi="Avenir Book"/>
               </w:rPr>
-              <w:lastRenderedPageBreak/>
               <w:t>Hormigas</w:t>
             </w:r>
           </w:p>
@@ -3811,18 +3822,10 @@
         </w:rPr>
         <w:t>8. Registro Fotográfico</w:t>
       </w:r>
-    </w:p>
-    <w:p>
-      <w:pPr>
-        <w:rPr>
-          <w:b/>
-          <w:bCs/>
-        </w:rPr>
-      </w:pPr>
-    </w:p>
-    <w:p/>
-    <w:p/>
-    <w:p/>
+      <w:r>
+        <w:t xml:space="preserve"> </w:t>
+      </w:r>
+    </w:p>
     <w:p>
       <w:pPr>
         <w:rPr>
@@ -3840,6 +3843,47 @@
           <w:szCs w:val="24"/>
         </w:rPr>
         <w:t xml:space="preserve">9. </w:t>
+      </w:r>
+      <w:r>
+        <w:rPr>
+          <w:b/>
+          <w:bCs/>
+          <w:sz w:val="24"/>
+          <w:szCs w:val="24"/>
+        </w:rPr>
+        <w:t>Recomendaciones específicas</w:t>
+      </w:r>
+    </w:p>
+    <w:p/>
+    <w:p/>
+    <w:p/>
+    <w:p>
+      <w:pPr>
+        <w:rPr>
+          <w:b/>
+          <w:bCs/>
+          <w:sz w:val="24"/>
+          <w:szCs w:val="24"/>
+        </w:rPr>
+      </w:pPr>
+      <w:r>
+        <w:rPr>
+          <w:b/>
+          <w:bCs/>
+          <w:sz w:val="24"/>
+          <w:szCs w:val="24"/>
+        </w:rPr>
+        <w:lastRenderedPageBreak/>
+        <w:t>10</w:t>
+      </w:r>
+      <w:r>
+        <w:rPr>
+          <w:b/>
+          <w:bCs/>
+          <w:sz w:val="24"/>
+          <w:szCs w:val="24"/>
+        </w:rPr>
+        <w:t xml:space="preserve">. </w:t>
       </w:r>
       <w:r>
         <w:rPr>
@@ -3875,7 +3919,6 @@
         <w:rPr>
           <w:rFonts w:ascii="Avenir Book" w:hAnsi="Avenir Book"/>
         </w:rPr>
-        <w:lastRenderedPageBreak/>
         <w:t>Sellar fisuras y grietas que permitan el anidamiento de plagas en áreas que se requieran.</w:t>
       </w:r>
     </w:p>
@@ -4480,6 +4523,7 @@
           </w:p>
           <w:p>
             <w:r>
+              <w:lastRenderedPageBreak/>
               <w:t xml:space="preserve">Celular:  </w:t>
             </w:r>
             <w:r>
@@ -4537,6 +4581,7 @@
                 <w:noProof/>
                 <w:lang w:val="en-US"/>
               </w:rPr>
+              <w:lastRenderedPageBreak/>
               <w:drawing>
                 <wp:anchor distT="0" distB="0" distL="114300" distR="114300" simplePos="0" relativeHeight="251659264" behindDoc="1" locked="0" layoutInCell="1" allowOverlap="1" wp14:anchorId="6AF3BE56" wp14:editId="69CA2514">
                   <wp:simplePos x="0" y="0"/>
@@ -4775,7 +4820,7 @@
       <w:rPr>
         <w:noProof/>
       </w:rPr>
-      <w:pict w14:anchorId="18CC30CF">
+      <w:pict w14:anchorId="2C98A258">
         <v:shapetype id="_x0000_t75" coordsize="21600,21600" o:spt="75" o:preferrelative="t" path="m@4@5l@4@11@9@11@9@5xe" filled="f" stroked="f">
           <v:stroke joinstyle="miter"/>
           <v:formulas>
@@ -4815,7 +4860,7 @@
       <w:rPr>
         <w:noProof/>
       </w:rPr>
-      <w:pict w14:anchorId="18DC5489">
+      <w:pict w14:anchorId="42034BB6">
         <v:shapetype id="_x0000_t75" coordsize="21600,21600" o:spt="75" o:preferrelative="t" path="m@4@5l@4@11@9@11@9@5xe" filled="f" stroked="f">
           <v:stroke joinstyle="miter"/>
           <v:formulas>
@@ -4855,7 +4900,7 @@
       <w:rPr>
         <w:noProof/>
       </w:rPr>
-      <w:pict w14:anchorId="7A85CDDE">
+      <w:pict w14:anchorId="2962F1AC">
         <v:shapetype id="_x0000_t75" coordsize="21600,21600" o:spt="75" o:preferrelative="t" path="m@4@5l@4@11@9@11@9@5xe" filled="f" stroked="f">
           <v:stroke joinstyle="miter"/>
           <v:formulas>
@@ -4974,6 +5019,119 @@
     </w:lvl>
   </w:abstractNum>
   <w:abstractNum w:abstractNumId="1" w15:restartNumberingAfterBreak="0">
+    <w:nsid w:val="2AFC4BD7"/>
+    <w:multiLevelType w:val="hybridMultilevel"/>
+    <w:tmpl w:val="5D920142"/>
+    <w:lvl w:ilvl="0" w:tplc="0409000D">
+      <w:start w:val="1"/>
+      <w:numFmt w:val="bullet"/>
+      <w:lvlText w:val=""/>
+      <w:lvlJc w:val="left"/>
+      <w:pPr>
+        <w:ind w:left="720" w:hanging="360"/>
+      </w:pPr>
+      <w:rPr>
+        <w:rFonts w:ascii="Wingdings" w:hAnsi="Wingdings" w:hint="default"/>
+      </w:rPr>
+    </w:lvl>
+    <w:lvl w:ilvl="1" w:tplc="04090003" w:tentative="1">
+      <w:start w:val="1"/>
+      <w:numFmt w:val="bullet"/>
+      <w:lvlText w:val="o"/>
+      <w:lvlJc w:val="left"/>
+      <w:pPr>
+        <w:ind w:left="1440" w:hanging="360"/>
+      </w:pPr>
+      <w:rPr>
+        <w:rFonts w:ascii="Courier New" w:hAnsi="Courier New" w:cs="Courier New" w:hint="default"/>
+      </w:rPr>
+    </w:lvl>
+    <w:lvl w:ilvl="2" w:tplc="04090005" w:tentative="1">
+      <w:start w:val="1"/>
+      <w:numFmt w:val="bullet"/>
+      <w:lvlText w:val=""/>
+      <w:lvlJc w:val="left"/>
+      <w:pPr>
+        <w:ind w:left="2160" w:hanging="360"/>
+      </w:pPr>
+      <w:rPr>
+        <w:rFonts w:ascii="Wingdings" w:hAnsi="Wingdings" w:hint="default"/>
+      </w:rPr>
+    </w:lvl>
+    <w:lvl w:ilvl="3" w:tplc="04090001" w:tentative="1">
+      <w:start w:val="1"/>
+      <w:numFmt w:val="bullet"/>
+      <w:lvlText w:val=""/>
+      <w:lvlJc w:val="left"/>
+      <w:pPr>
+        <w:ind w:left="2880" w:hanging="360"/>
+      </w:pPr>
+      <w:rPr>
+        <w:rFonts w:ascii="Symbol" w:hAnsi="Symbol" w:hint="default"/>
+      </w:rPr>
+    </w:lvl>
+    <w:lvl w:ilvl="4" w:tplc="04090003" w:tentative="1">
+      <w:start w:val="1"/>
+      <w:numFmt w:val="bullet"/>
+      <w:lvlText w:val="o"/>
+      <w:lvlJc w:val="left"/>
+      <w:pPr>
+        <w:ind w:left="3600" w:hanging="360"/>
+      </w:pPr>
+      <w:rPr>
+        <w:rFonts w:ascii="Courier New" w:hAnsi="Courier New" w:cs="Courier New" w:hint="default"/>
+      </w:rPr>
+    </w:lvl>
+    <w:lvl w:ilvl="5" w:tplc="04090005" w:tentative="1">
+      <w:start w:val="1"/>
+      <w:numFmt w:val="bullet"/>
+      <w:lvlText w:val=""/>
+      <w:lvlJc w:val="left"/>
+      <w:pPr>
+        <w:ind w:left="4320" w:hanging="360"/>
+      </w:pPr>
+      <w:rPr>
+        <w:rFonts w:ascii="Wingdings" w:hAnsi="Wingdings" w:hint="default"/>
+      </w:rPr>
+    </w:lvl>
+    <w:lvl w:ilvl="6" w:tplc="04090001" w:tentative="1">
+      <w:start w:val="1"/>
+      <w:numFmt w:val="bullet"/>
+      <w:lvlText w:val=""/>
+      <w:lvlJc w:val="left"/>
+      <w:pPr>
+        <w:ind w:left="5040" w:hanging="360"/>
+      </w:pPr>
+      <w:rPr>
+        <w:rFonts w:ascii="Symbol" w:hAnsi="Symbol" w:hint="default"/>
+      </w:rPr>
+    </w:lvl>
+    <w:lvl w:ilvl="7" w:tplc="04090003" w:tentative="1">
+      <w:start w:val="1"/>
+      <w:numFmt w:val="bullet"/>
+      <w:lvlText w:val="o"/>
+      <w:lvlJc w:val="left"/>
+      <w:pPr>
+        <w:ind w:left="5760" w:hanging="360"/>
+      </w:pPr>
+      <w:rPr>
+        <w:rFonts w:ascii="Courier New" w:hAnsi="Courier New" w:cs="Courier New" w:hint="default"/>
+      </w:rPr>
+    </w:lvl>
+    <w:lvl w:ilvl="8" w:tplc="04090005" w:tentative="1">
+      <w:start w:val="1"/>
+      <w:numFmt w:val="bullet"/>
+      <w:lvlText w:val=""/>
+      <w:lvlJc w:val="left"/>
+      <w:pPr>
+        <w:ind w:left="6480" w:hanging="360"/>
+      </w:pPr>
+      <w:rPr>
+        <w:rFonts w:ascii="Wingdings" w:hAnsi="Wingdings" w:hint="default"/>
+      </w:rPr>
+    </w:lvl>
+  </w:abstractNum>
+  <w:abstractNum w:abstractNumId="2" w15:restartNumberingAfterBreak="0">
     <w:nsid w:val="39E65BBC"/>
     <w:multiLevelType w:val="multilevel"/>
     <w:tmpl w:val="08090025"/>
@@ -5068,7 +5226,7 @@
       </w:pPr>
     </w:lvl>
   </w:abstractNum>
-  <w:abstractNum w:abstractNumId="2" w15:restartNumberingAfterBreak="0">
+  <w:abstractNum w:abstractNumId="3" w15:restartNumberingAfterBreak="0">
     <w:nsid w:val="4DB31909"/>
     <w:multiLevelType w:val="hybridMultilevel"/>
     <w:tmpl w:val="24BC8F76"/>
@@ -5182,7 +5340,7 @@
       </w:rPr>
     </w:lvl>
   </w:abstractNum>
-  <w:abstractNum w:abstractNumId="3" w15:restartNumberingAfterBreak="0">
+  <w:abstractNum w:abstractNumId="4" w15:restartNumberingAfterBreak="0">
     <w:nsid w:val="573318D2"/>
     <w:multiLevelType w:val="hybridMultilevel"/>
     <w:tmpl w:val="E5BCF90C"/>
@@ -5295,7 +5453,7 @@
       </w:rPr>
     </w:lvl>
   </w:abstractNum>
-  <w:abstractNum w:abstractNumId="4" w15:restartNumberingAfterBreak="0">
+  <w:abstractNum w:abstractNumId="5" w15:restartNumberingAfterBreak="0">
     <w:nsid w:val="5DCF27DE"/>
     <w:multiLevelType w:val="hybridMultilevel"/>
     <w:tmpl w:val="4CC6CDD2"/>
@@ -5384,7 +5542,7 @@
       </w:pPr>
     </w:lvl>
   </w:abstractNum>
-  <w:abstractNum w:abstractNumId="5" w15:restartNumberingAfterBreak="0">
+  <w:abstractNum w:abstractNumId="6" w15:restartNumberingAfterBreak="0">
     <w:nsid w:val="5F296D3D"/>
     <w:multiLevelType w:val="hybridMultilevel"/>
     <w:tmpl w:val="17E4F9FC"/>
@@ -5497,7 +5655,7 @@
       </w:rPr>
     </w:lvl>
   </w:abstractNum>
-  <w:abstractNum w:abstractNumId="6" w15:restartNumberingAfterBreak="0">
+  <w:abstractNum w:abstractNumId="7" w15:restartNumberingAfterBreak="0">
     <w:nsid w:val="716157F2"/>
     <w:multiLevelType w:val="hybridMultilevel"/>
     <w:tmpl w:val="60842886"/>
@@ -5587,22 +5745,25 @@
     <w:abstractNumId w:val="0"/>
   </w:num>
   <w:num w:numId="2" w16cid:durableId="1645503912">
-    <w:abstractNumId w:val="1"/>
+    <w:abstractNumId w:val="2"/>
   </w:num>
   <w:num w:numId="3" w16cid:durableId="974795223">
-    <w:abstractNumId w:val="2"/>
+    <w:abstractNumId w:val="3"/>
   </w:num>
   <w:num w:numId="4" w16cid:durableId="224727757">
+    <w:abstractNumId w:val="7"/>
+  </w:num>
+  <w:num w:numId="5" w16cid:durableId="283122262">
+    <w:abstractNumId w:val="5"/>
+  </w:num>
+  <w:num w:numId="6" w16cid:durableId="1706560086">
     <w:abstractNumId w:val="6"/>
   </w:num>
-  <w:num w:numId="5" w16cid:durableId="283122262">
+  <w:num w:numId="7" w16cid:durableId="2059669307">
     <w:abstractNumId w:val="4"/>
   </w:num>
-  <w:num w:numId="6" w16cid:durableId="1706560086">
-    <w:abstractNumId w:val="5"/>
-  </w:num>
-  <w:num w:numId="7" w16cid:durableId="2059669307">
-    <w:abstractNumId w:val="3"/>
+  <w:num w:numId="8" w16cid:durableId="1864900139">
+    <w:abstractNumId w:val="1"/>
   </w:num>
 </w:numbering>
 </file>

</xml_diff>

<commit_message>
Actualizar la plantilla de Word para reflejar los cambios en el análisis de roedores
</commit_message>
<xml_diff>
--- a/Plantilla.docx
+++ b/Plantilla.docx
@@ -2123,6 +2123,48 @@
     </w:p>
     <w:p>
       <w:pPr>
+        <w:rPr>
+          <w:rFonts w:ascii="Avenir Book" w:hAnsi="Avenir Book"/>
+        </w:rPr>
+      </w:pPr>
+      <w:r>
+        <w:rPr>
+          <w:rFonts w:ascii="Avenir Book" w:hAnsi="Avenir Book"/>
+          <w:highlight w:val="yellow"/>
+        </w:rPr>
+        <w:t>{{</w:t>
+      </w:r>
+      <w:r>
+        <w:rPr>
+          <w:rFonts w:ascii="Avenir Book" w:hAnsi="Avenir Book"/>
+          <w:highlight w:val="yellow"/>
+        </w:rPr>
+        <w:t>analisi</w:t>
+      </w:r>
+      <w:r>
+        <w:rPr>
+          <w:rFonts w:ascii="Avenir Book" w:hAnsi="Avenir Book"/>
+          <w:highlight w:val="yellow"/>
+        </w:rPr>
+        <w:t>s_</w:t>
+      </w:r>
+      <w:r>
+        <w:rPr>
+          <w:rFonts w:ascii="Avenir Book" w:hAnsi="Avenir Book"/>
+          <w:highlight w:val="yellow"/>
+        </w:rPr>
+        <w:t>preventivos</w:t>
+      </w:r>
+      <w:r>
+        <w:rPr>
+          <w:rFonts w:ascii="Avenir Book" w:hAnsi="Avenir Book"/>
+          <w:highlight w:val="yellow"/>
+        </w:rPr>
+        <w:t>}}</w:t>
+      </w:r>
+    </w:p>
+    <w:p>
+      <w:pPr>
         <w:jc w:val="both"/>
         <w:rPr>
           <w:rFonts w:ascii="Avenir Light" w:hAnsi="Avenir Light" w:cs="Times New Roman"/>
@@ -2169,7 +2211,6 @@
           <w:sz w:val="24"/>
           <w:szCs w:val="24"/>
         </w:rPr>
-        <w:lastRenderedPageBreak/>
         <w:t xml:space="preserve">2. </w:t>
       </w:r>
       <w:r>
@@ -2234,7 +2275,6 @@
     </w:p>
     <w:p>
       <w:pPr>
-        <w:jc w:val="both"/>
         <w:rPr>
           <w:rFonts w:ascii="Avenir Book" w:hAnsi="Avenir Book"/>
         </w:rPr>
@@ -2365,12 +2405,61 @@
     <w:p>
       <w:pPr>
         <w:jc w:val="both"/>
-      </w:pPr>
-      <w:r>
-        <w:rPr>
-          <w:rFonts w:ascii="Avenir Book" w:hAnsi="Avenir Book"/>
-        </w:rPr>
-        <w:t xml:space="preserve">El siguiente gráfico presenta una visualización de dispersión con burbujas que muestra el estado de las lámparas por área en </w:t>
+        <w:rPr>
+          <w:rFonts w:ascii="Avenir Book" w:hAnsi="Avenir Book"/>
+        </w:rPr>
+      </w:pPr>
+      <w:r>
+        <w:rPr>
+          <w:rFonts w:ascii="Avenir Book" w:hAnsi="Avenir Book"/>
+          <w:highlight w:val="yellow"/>
+        </w:rPr>
+        <w:t>{{</w:t>
+      </w:r>
+      <w:r>
+        <w:rPr>
+          <w:rFonts w:ascii="Avenir Book" w:hAnsi="Avenir Book"/>
+          <w:highlight w:val="yellow"/>
+        </w:rPr>
+        <w:t>analisis</w:t>
+      </w:r>
+      <w:r>
+        <w:rPr>
+          <w:rFonts w:ascii="Avenir Book" w:hAnsi="Avenir Book"/>
+          <w:highlight w:val="yellow"/>
+        </w:rPr>
+        <w:t>_</w:t>
+      </w:r>
+      <w:r>
+        <w:rPr>
+          <w:rFonts w:ascii="Avenir Book" w:hAnsi="Avenir Book"/>
+          <w:highlight w:val="yellow"/>
+        </w:rPr>
+        <w:t>lamparas</w:t>
+      </w:r>
+      <w:r>
+        <w:rPr>
+          <w:rFonts w:ascii="Avenir Book" w:hAnsi="Avenir Book"/>
+          <w:highlight w:val="yellow"/>
+        </w:rPr>
+        <w:t>}}</w:t>
+      </w:r>
+    </w:p>
+    <w:p>
+      <w:pPr>
+        <w:jc w:val="both"/>
+      </w:pPr>
+      <w:r>
+        <w:rPr>
+          <w:rFonts w:ascii="Avenir Book" w:hAnsi="Avenir Book"/>
+        </w:rPr>
+        <w:t>El siguiente gráfico presenta una visualización de dispersión con burbujas que muestra el estado de las lámparas por área en</w:t>
+      </w:r>
+      <w:r>
+        <w:rPr>
+          <w:rFonts w:ascii="Avenir Book" w:hAnsi="Avenir Book"/>
+        </w:rPr>
+        <w:t xml:space="preserve"> </w:t>
       </w:r>
       <w:r>
         <w:rPr>
@@ -2484,7 +2573,6 @@
         <w:rPr>
           <w:rFonts w:ascii="Avenir Book" w:hAnsi="Avenir Book"/>
         </w:rPr>
-        <w:lastRenderedPageBreak/>
         <w:t xml:space="preserve">El siguiente gráfico </w:t>
       </w:r>
       <w:r>
@@ -2810,6 +2898,7 @@
               <w:rPr>
                 <w:rFonts w:ascii="Avenir Book" w:hAnsi="Avenir Book"/>
               </w:rPr>
+              <w:lastRenderedPageBreak/>
               <w:t>Plaga</w:t>
             </w:r>
           </w:p>
@@ -2898,7 +2987,6 @@
               <w:rPr>
                 <w:rFonts w:ascii="Avenir Book" w:hAnsi="Avenir Book"/>
               </w:rPr>
-              <w:lastRenderedPageBreak/>
               <w:t>Cucaracha Americana</w:t>
             </w:r>
           </w:p>
@@ -3738,6 +3826,88 @@
     </w:p>
     <w:p>
       <w:pPr>
+        <w:spacing w:before="0"/>
+        <w:jc w:val="both"/>
+        <w:rPr>
+          <w:rFonts w:ascii="Avenir Light" w:hAnsi="Avenir Light" w:cs="Times New Roman"/>
+          <w:szCs w:val="24"/>
+          <w:highlight w:val="yellow"/>
+          <w:lang w:val="es-ES"/>
+        </w:rPr>
+      </w:pPr>
+      <w:r>
+        <w:rPr>
+          <w:rFonts w:ascii="Avenir Light" w:hAnsi="Avenir Light" w:cs="Times New Roman"/>
+          <w:szCs w:val="24"/>
+          <w:highlight w:val="yellow"/>
+          <w:lang w:val="es-ES"/>
+        </w:rPr>
+        <w:t>Se realizó el apoyo al plan de choque al hospital infantil BLOQUE 11 durante los miércoles del mes (de manera quincenal) y se envió formato modelo de informe y registro fotográfico posterior.</w:t>
+      </w:r>
+    </w:p>
+    <w:p>
+      <w:pPr>
+        <w:spacing w:before="0"/>
+        <w:jc w:val="both"/>
+        <w:rPr>
+          <w:rFonts w:ascii="Avenir Light" w:hAnsi="Avenir Light" w:cs="Times New Roman"/>
+          <w:szCs w:val="24"/>
+          <w:highlight w:val="yellow"/>
+          <w:lang w:val="es-ES"/>
+        </w:rPr>
+      </w:pPr>
+      <w:r>
+        <w:rPr>
+          <w:rFonts w:ascii="Avenir Light" w:hAnsi="Avenir Light" w:cs="Times New Roman"/>
+          <w:b/>
+          <w:szCs w:val="24"/>
+          <w:highlight w:val="yellow"/>
+          <w:lang w:val="es-ES"/>
+        </w:rPr>
+        <w:t>PRIMERA SEMANA</w:t>
+      </w:r>
+      <w:r>
+        <w:rPr>
+          <w:rFonts w:ascii="Avenir Light" w:hAnsi="Avenir Light" w:cs="Times New Roman"/>
+          <w:szCs w:val="24"/>
+          <w:highlight w:val="yellow"/>
+          <w:lang w:val="es-ES"/>
+        </w:rPr>
+        <w:t>: 15 DE DICIEMBRE= Resumen: "Se realiza el plan de choque en todas las áreas mencionadas del bloque 11 infantil, se asperja, se inspecciona, se monitoriza y no se evidencia plaga alguna, límites tolerables".</w:t>
+      </w:r>
+    </w:p>
+    <w:p>
+      <w:pPr>
+        <w:spacing w:before="0"/>
+        <w:jc w:val="both"/>
+        <w:rPr>
+          <w:rFonts w:ascii="Avenir Light" w:hAnsi="Avenir Light" w:cs="Times New Roman"/>
+          <w:szCs w:val="24"/>
+          <w:lang w:val="es-ES"/>
+        </w:rPr>
+      </w:pPr>
+      <w:r>
+        <w:rPr>
+          <w:rFonts w:ascii="Avenir Light" w:hAnsi="Avenir Light" w:cs="Times New Roman"/>
+          <w:b/>
+          <w:szCs w:val="24"/>
+          <w:highlight w:val="yellow"/>
+          <w:lang w:val="es-ES"/>
+        </w:rPr>
+        <w:t>SEGUNDA SEMANA</w:t>
+      </w:r>
+      <w:r>
+        <w:rPr>
+          <w:rFonts w:ascii="Avenir Light" w:hAnsi="Avenir Light" w:cs="Times New Roman"/>
+          <w:szCs w:val="24"/>
+          <w:highlight w:val="yellow"/>
+          <w:lang w:val="es-ES"/>
+        </w:rPr>
+        <w:t>: 30 DE DICIEMBRE= Resumen: "Se realiza el plan de choque en todas las áreas mencionadas del bloque 11 infantil, se asperja, se inspecciona, se monitoriza y no se evidencia plaga alguna, límites tolerables".</w:t>
+      </w:r>
+    </w:p>
+    <w:p>
+      <w:pPr>
         <w:rPr>
           <w:b/>
           <w:bCs/>
@@ -3748,6 +3918,25 @@
     </w:p>
     <w:p>
       <w:pPr>
+        <w:spacing w:before="0"/>
+        <w:rPr>
+          <w:rFonts w:ascii="Avenir Light" w:hAnsi="Avenir Light" w:cs="Times New Roman"/>
+          <w:szCs w:val="24"/>
+          <w:lang w:val="es-ES"/>
+        </w:rPr>
+      </w:pPr>
+      <w:r>
+        <w:rPr>
+          <w:rFonts w:ascii="Avenir Light" w:hAnsi="Avenir Light" w:cs="Times New Roman"/>
+          <w:szCs w:val="24"/>
+          <w:highlight w:val="yellow"/>
+          <w:lang w:val="es-ES"/>
+        </w:rPr>
+        <w:t>Adjuntamos algunas evidencias de plan de choque al hospital infantil…</w:t>
+      </w:r>
+    </w:p>
+    <w:p>
+      <w:pPr>
         <w:rPr>
           <w:b/>
           <w:bCs/>
@@ -3765,25 +3954,26 @@
           <w:szCs w:val="24"/>
         </w:rPr>
       </w:pPr>
-      <w:r>
+    </w:p>
+    <w:p>
+      <w:pPr>
         <w:rPr>
           <w:b/>
           <w:bCs/>
           <w:sz w:val="24"/>
           <w:szCs w:val="24"/>
         </w:rPr>
-        <w:t xml:space="preserve">6. Informe de Zonas comunes (Desnidado, motomochila, zonas verdes, cajas de aguas negras…)  </w:t>
-      </w:r>
-    </w:p>
-    <w:p>
-      <w:pPr>
+      </w:pPr>
+      <w:r>
         <w:rPr>
           <w:b/>
           <w:bCs/>
           <w:sz w:val="24"/>
           <w:szCs w:val="24"/>
         </w:rPr>
-      </w:pPr>
+        <w:lastRenderedPageBreak/>
+        <w:t xml:space="preserve">6. Informe de Zonas comunes (Desnidado, motomochila, zonas verdes, cajas de aguas negras…)  </w:t>
+      </w:r>
     </w:p>
     <w:p>
       <w:pPr>
@@ -3794,56 +3984,57 @@
           <w:szCs w:val="24"/>
         </w:rPr>
       </w:pPr>
-      <w:r>
+    </w:p>
+    <w:p>
+      <w:pPr>
         <w:rPr>
           <w:b/>
           <w:bCs/>
           <w:sz w:val="24"/>
           <w:szCs w:val="24"/>
         </w:rPr>
-        <w:t>7. Informe Dengue</w:t>
-      </w:r>
-    </w:p>
-    <w:p>
-      <w:pPr>
+      </w:pPr>
+      <w:r>
         <w:rPr>
           <w:b/>
           <w:bCs/>
           <w:sz w:val="24"/>
           <w:szCs w:val="24"/>
         </w:rPr>
-      </w:pPr>
-      <w:r>
+        <w:t>7. Informe Dengue</w:t>
+      </w:r>
+    </w:p>
+    <w:p>
+      <w:pPr>
         <w:rPr>
           <w:b/>
           <w:bCs/>
           <w:sz w:val="24"/>
           <w:szCs w:val="24"/>
         </w:rPr>
-        <w:t>8. Registro Fotográfico</w:t>
-      </w:r>
-      <w:r>
-        <w:t xml:space="preserve"> </w:t>
-      </w:r>
-    </w:p>
-    <w:p>
-      <w:pPr>
+      </w:pPr>
+      <w:r>
         <w:rPr>
           <w:b/>
           <w:bCs/>
           <w:sz w:val="24"/>
           <w:szCs w:val="24"/>
         </w:rPr>
-      </w:pPr>
-      <w:r>
+        <w:t>8. Registro Fotográfico</w:t>
+      </w:r>
+      <w:r>
+        <w:t xml:space="preserve"> </w:t>
+      </w:r>
+    </w:p>
+    <w:p>
+      <w:pPr>
         <w:rPr>
           <w:b/>
           <w:bCs/>
           <w:sz w:val="24"/>
           <w:szCs w:val="24"/>
         </w:rPr>
-        <w:t xml:space="preserve">9. </w:t>
-      </w:r>
+      </w:pPr>
       <w:r>
         <w:rPr>
           <w:b/>
@@ -3851,29 +4042,37 @@
           <w:sz w:val="24"/>
           <w:szCs w:val="24"/>
         </w:rPr>
-        <w:t>Recomendaciones específicas</w:t>
-      </w:r>
-    </w:p>
-    <w:p/>
-    <w:p/>
-    <w:p/>
-    <w:p>
-      <w:pPr>
+        <w:t xml:space="preserve">9. </w:t>
+      </w:r>
+      <w:r>
         <w:rPr>
           <w:b/>
           <w:bCs/>
           <w:sz w:val="24"/>
           <w:szCs w:val="24"/>
         </w:rPr>
-      </w:pPr>
-      <w:r>
+        <w:t>Recomendaciones específicas</w:t>
+      </w:r>
+    </w:p>
+    <w:p/>
+    <w:p/>
+    <w:p/>
+    <w:p>
+      <w:pPr>
         <w:rPr>
           <w:b/>
           <w:bCs/>
           <w:sz w:val="24"/>
           <w:szCs w:val="24"/>
         </w:rPr>
-        <w:lastRenderedPageBreak/>
+      </w:pPr>
+      <w:r>
+        <w:rPr>
+          <w:b/>
+          <w:bCs/>
+          <w:sz w:val="24"/>
+          <w:szCs w:val="24"/>
+        </w:rPr>
         <w:t>10</w:t>
       </w:r>
       <w:r>
@@ -4381,6 +4580,7 @@
         <w:rPr>
           <w:rFonts w:ascii="Avenir Book" w:hAnsi="Avenir Book"/>
         </w:rPr>
+        <w:lastRenderedPageBreak/>
         <w:t>“No alimentar a las palomas”</w:t>
       </w:r>
     </w:p>
@@ -4492,21 +4692,11 @@
             </w:r>
           </w:p>
           <w:p>
-            <w:r>
-              <w:fldChar w:fldCharType="begin"/>
-            </w:r>
-            <w:r>
-              <w:instrText xml:space="preserve"> DOCVARIABLE "asesor" </w:instrText>
-            </w:r>
-            <w:r>
-              <w:fldChar w:fldCharType="separate"/>
-            </w:r>
-            <w:r>
-              <w:t>Fernando Q</w:t>
-            </w:r>
-            <w:r>
-              <w:fldChar w:fldCharType="end"/>
-            </w:r>
+            <w:fldSimple w:instr=" DOCVARIABLE &quot;asesor&quot; ">
+              <w:r>
+                <w:t>Fernando Q</w:t>
+              </w:r>
+            </w:fldSimple>
             <w:r>
               <w:t>uintero</w:t>
             </w:r>
@@ -4523,42 +4713,21 @@
           </w:p>
           <w:p>
             <w:r>
-              <w:lastRenderedPageBreak/>
               <w:t xml:space="preserve">Celular:  </w:t>
             </w:r>
-            <w:r>
-              <w:fldChar w:fldCharType="begin"/>
-            </w:r>
-            <w:r>
-              <w:instrText xml:space="preserve"> DOCVARIABLE "cel_asesor" </w:instrText>
-            </w:r>
-            <w:r>
-              <w:fldChar w:fldCharType="separate"/>
-            </w:r>
-            <w:r>
-              <w:t>311 622 60 19</w:t>
-            </w:r>
-            <w:r>
-              <w:fldChar w:fldCharType="end"/>
-            </w:r>
+            <w:fldSimple w:instr=" DOCVARIABLE &quot;cel_asesor&quot; ">
+              <w:r>
+                <w:t>311 622 60 19</w:t>
+              </w:r>
+            </w:fldSimple>
             <w:r>
               <w:t xml:space="preserve">  -   310 469 50 50                                                                             e-mail: </w:t>
             </w:r>
-            <w:r>
-              <w:fldChar w:fldCharType="begin"/>
-            </w:r>
-            <w:r>
-              <w:instrText xml:space="preserve"> DOCVARIABLE "e_asesor" </w:instrText>
-            </w:r>
-            <w:r>
-              <w:fldChar w:fldCharType="separate"/>
-            </w:r>
-            <w:r>
-              <w:t>splagasmedellin@gmail.co</w:t>
-            </w:r>
-            <w:r>
-              <w:fldChar w:fldCharType="end"/>
-            </w:r>
+            <w:fldSimple w:instr=" DOCVARIABLE &quot;e_asesor&quot; ">
+              <w:r>
+                <w:t>splagasmedellin@gmail.co</w:t>
+              </w:r>
+            </w:fldSimple>
             <w:r>
               <w:t>m</w:t>
             </w:r>
@@ -4581,7 +4750,6 @@
                 <w:noProof/>
                 <w:lang w:val="en-US"/>
               </w:rPr>
-              <w:lastRenderedPageBreak/>
               <w:drawing>
                 <wp:anchor distT="0" distB="0" distL="114300" distR="114300" simplePos="0" relativeHeight="251659264" behindDoc="1" locked="0" layoutInCell="1" allowOverlap="1" wp14:anchorId="6AF3BE56" wp14:editId="69CA2514">
                   <wp:simplePos x="0" y="0"/>
@@ -4820,7 +4988,7 @@
       <w:rPr>
         <w:noProof/>
       </w:rPr>
-      <w:pict w14:anchorId="2C98A258">
+      <w:pict w14:anchorId="62F81B00">
         <v:shapetype id="_x0000_t75" coordsize="21600,21600" o:spt="75" o:preferrelative="t" path="m@4@5l@4@11@9@11@9@5xe" filled="f" stroked="f">
           <v:stroke joinstyle="miter"/>
           <v:formulas>
@@ -4860,7 +5028,7 @@
       <w:rPr>
         <w:noProof/>
       </w:rPr>
-      <w:pict w14:anchorId="42034BB6">
+      <w:pict w14:anchorId="26C3783A">
         <v:shapetype id="_x0000_t75" coordsize="21600,21600" o:spt="75" o:preferrelative="t" path="m@4@5l@4@11@9@11@9@5xe" filled="f" stroked="f">
           <v:stroke joinstyle="miter"/>
           <v:formulas>
@@ -4900,7 +5068,7 @@
       <w:rPr>
         <w:noProof/>
       </w:rPr>
-      <w:pict w14:anchorId="2962F1AC">
+      <w:pict w14:anchorId="3C16B37B">
         <v:shapetype id="_x0000_t75" coordsize="21600,21600" o:spt="75" o:preferrelative="t" path="m@4@5l@4@11@9@11@9@5xe" filled="f" stroked="f">
           <v:stroke joinstyle="miter"/>
           <v:formulas>

</xml_diff>

<commit_message>
Actualizar la plantilla de Word para incluir nuevas variables
</commit_message>
<xml_diff>
--- a/Plantilla.docx
+++ b/Plantilla.docx
@@ -4006,6 +4006,35 @@
     </w:p>
     <w:p>
       <w:pPr>
+        <w:jc w:val="both"/>
+        <w:rPr>
+          <w:rFonts w:ascii="Avenir Book" w:hAnsi="Avenir Book"/>
+        </w:rPr>
+      </w:pPr>
+      <w:r>
+        <w:rPr>
+          <w:rFonts w:ascii="Avenir Book" w:hAnsi="Avenir Book"/>
+          <w:highlight w:val="yellow"/>
+        </w:rPr>
+        <w:t>{{</w:t>
+      </w:r>
+      <w:r>
+        <w:rPr>
+          <w:rFonts w:ascii="Avenir Book" w:hAnsi="Avenir Book"/>
+          <w:highlight w:val="yellow"/>
+        </w:rPr>
+        <w:t>analisis_dengue</w:t>
+      </w:r>
+      <w:r>
+        <w:rPr>
+          <w:rFonts w:ascii="Avenir Book" w:hAnsi="Avenir Book"/>
+          <w:highlight w:val="yellow"/>
+        </w:rPr>
+        <w:t>}}</w:t>
+      </w:r>
+    </w:p>
+    <w:p>
+      <w:pPr>
         <w:rPr>
           <w:b/>
           <w:bCs/>
@@ -4025,6 +4054,16 @@
       <w:r>
         <w:t xml:space="preserve"> </w:t>
       </w:r>
+    </w:p>
+    <w:p>
+      <w:pPr>
+        <w:rPr>
+          <w:b/>
+          <w:bCs/>
+          <w:sz w:val="24"/>
+          <w:szCs w:val="24"/>
+        </w:rPr>
+      </w:pPr>
     </w:p>
     <w:p>
       <w:pPr>
@@ -4514,6 +4553,7 @@
         <w:rPr>
           <w:rFonts w:ascii="Avenir Book" w:hAnsi="Avenir Book"/>
         </w:rPr>
+        <w:lastRenderedPageBreak/>
         <w:t>Reubicar lámparas existentes para exteriores en sitios estratégicos.</w:t>
       </w:r>
     </w:p>
@@ -4580,7 +4620,6 @@
         <w:rPr>
           <w:rFonts w:ascii="Avenir Book" w:hAnsi="Avenir Book"/>
         </w:rPr>
-        <w:lastRenderedPageBreak/>
         <w:t>“No alimentar a las palomas”</w:t>
       </w:r>
     </w:p>
@@ -4988,7 +5027,7 @@
       <w:rPr>
         <w:noProof/>
       </w:rPr>
-      <w:pict w14:anchorId="62F81B00">
+      <w:pict w14:anchorId="140ADDE5">
         <v:shapetype id="_x0000_t75" coordsize="21600,21600" o:spt="75" o:preferrelative="t" path="m@4@5l@4@11@9@11@9@5xe" filled="f" stroked="f">
           <v:stroke joinstyle="miter"/>
           <v:formulas>
@@ -5028,7 +5067,7 @@
       <w:rPr>
         <w:noProof/>
       </w:rPr>
-      <w:pict w14:anchorId="26C3783A">
+      <w:pict w14:anchorId="0A1F1872">
         <v:shapetype id="_x0000_t75" coordsize="21600,21600" o:spt="75" o:preferrelative="t" path="m@4@5l@4@11@9@11@9@5xe" filled="f" stroked="f">
           <v:stroke joinstyle="miter"/>
           <v:formulas>
@@ -5068,7 +5107,7 @@
       <w:rPr>
         <w:noProof/>
       </w:rPr>
-      <w:pict w14:anchorId="3C16B37B">
+      <w:pict w14:anchorId="6C279A0B">
         <v:shapetype id="_x0000_t75" coordsize="21600,21600" o:spt="75" o:preferrelative="t" path="m@4@5l@4@11@9@11@9@5xe" filled="f" stroked="f">
           <v:stroke joinstyle="miter"/>
           <v:formulas>

</xml_diff>

<commit_message>
actualizar alineación de algunos campos en la plantilla
</commit_message>
<xml_diff>
--- a/Plantilla.docx
+++ b/Plantilla.docx
@@ -2404,7 +2404,6 @@
     </w:p>
     <w:p>
       <w:pPr>
-        <w:jc w:val="both"/>
         <w:rPr>
           <w:rFonts w:ascii="Avenir Book" w:hAnsi="Avenir Book"/>
         </w:rPr>
@@ -2414,35 +2413,7 @@
           <w:rFonts w:ascii="Avenir Book" w:hAnsi="Avenir Book"/>
           <w:highlight w:val="yellow"/>
         </w:rPr>
-        <w:t>{{</w:t>
-      </w:r>
-      <w:r>
-        <w:rPr>
-          <w:rFonts w:ascii="Avenir Book" w:hAnsi="Avenir Book"/>
-          <w:highlight w:val="yellow"/>
-        </w:rPr>
-        <w:t>analisis</w:t>
-      </w:r>
-      <w:r>
-        <w:rPr>
-          <w:rFonts w:ascii="Avenir Book" w:hAnsi="Avenir Book"/>
-          <w:highlight w:val="yellow"/>
-        </w:rPr>
-        <w:t>_</w:t>
-      </w:r>
-      <w:r>
-        <w:rPr>
-          <w:rFonts w:ascii="Avenir Book" w:hAnsi="Avenir Book"/>
-          <w:highlight w:val="yellow"/>
-        </w:rPr>
-        <w:t>lamparas</w:t>
-      </w:r>
-      <w:r>
-        <w:rPr>
-          <w:rFonts w:ascii="Avenir Book" w:hAnsi="Avenir Book"/>
-          <w:highlight w:val="yellow"/>
-        </w:rPr>
-        <w:t>}}</w:t>
+        <w:t>{{analisis_lamparas}}</w:t>
       </w:r>
     </w:p>
     <w:p>
@@ -4006,7 +3977,6 @@
     </w:p>
     <w:p>
       <w:pPr>
-        <w:jc w:val="both"/>
         <w:rPr>
           <w:rFonts w:ascii="Avenir Book" w:hAnsi="Avenir Book"/>
         </w:rPr>
@@ -5027,7 +4997,7 @@
       <w:rPr>
         <w:noProof/>
       </w:rPr>
-      <w:pict w14:anchorId="140ADDE5">
+      <w:pict w14:anchorId="4CE68A2C">
         <v:shapetype id="_x0000_t75" coordsize="21600,21600" o:spt="75" o:preferrelative="t" path="m@4@5l@4@11@9@11@9@5xe" filled="f" stroked="f">
           <v:stroke joinstyle="miter"/>
           <v:formulas>
@@ -5067,7 +5037,7 @@
       <w:rPr>
         <w:noProof/>
       </w:rPr>
-      <w:pict w14:anchorId="0A1F1872">
+      <w:pict w14:anchorId="00B3C328">
         <v:shapetype id="_x0000_t75" coordsize="21600,21600" o:spt="75" o:preferrelative="t" path="m@4@5l@4@11@9@11@9@5xe" filled="f" stroked="f">
           <v:stroke joinstyle="miter"/>
           <v:formulas>
@@ -5107,7 +5077,7 @@
       <w:rPr>
         <w:noProof/>
       </w:rPr>
-      <w:pict w14:anchorId="6C279A0B">
+      <w:pict w14:anchorId="36CD7DC5">
         <v:shapetype id="_x0000_t75" coordsize="21600,21600" o:spt="75" o:preferrelative="t" path="m@4@5l@4@11@9@11@9@5xe" filled="f" stroked="f">
           <v:stroke joinstyle="miter"/>
           <v:formulas>

</xml_diff>

<commit_message>
cambio pequeño de formato en plantilla
</commit_message>
<xml_diff>
--- a/Plantilla.docx
+++ b/Plantilla.docx
@@ -1846,6 +1846,7 @@
           <w:b/>
           <w:bCs/>
           <w:sz w:val="24"/>
+          <w:highlight w:val="yellow"/>
           <w:lang w:val="es-ES"/>
         </w:rPr>
       </w:pPr>
@@ -1855,6 +1856,7 @@
           <w:b/>
           <w:bCs/>
           <w:sz w:val="24"/>
+          <w:highlight w:val="yellow"/>
           <w:lang w:val="es-ES"/>
         </w:rPr>
         <w:t>Control Mensual al hospital Infantil. PLAN DE CHOQUE</w:t>
@@ -4997,7 +4999,7 @@
       <w:rPr>
         <w:noProof/>
       </w:rPr>
-      <w:pict w14:anchorId="4CE68A2C">
+      <w:pict w14:anchorId="269EF0EE">
         <v:shapetype id="_x0000_t75" coordsize="21600,21600" o:spt="75" o:preferrelative="t" path="m@4@5l@4@11@9@11@9@5xe" filled="f" stroked="f">
           <v:stroke joinstyle="miter"/>
           <v:formulas>
@@ -5037,7 +5039,7 @@
       <w:rPr>
         <w:noProof/>
       </w:rPr>
-      <w:pict w14:anchorId="00B3C328">
+      <w:pict w14:anchorId="4D87CEAD">
         <v:shapetype id="_x0000_t75" coordsize="21600,21600" o:spt="75" o:preferrelative="t" path="m@4@5l@4@11@9@11@9@5xe" filled="f" stroked="f">
           <v:stroke joinstyle="miter"/>
           <v:formulas>
@@ -5077,7 +5079,7 @@
       <w:rPr>
         <w:noProof/>
       </w:rPr>
-      <w:pict w14:anchorId="36CD7DC5">
+      <w:pict w14:anchorId="5C77C5BE">
         <v:shapetype id="_x0000_t75" coordsize="21600,21600" o:spt="75" o:preferrelative="t" path="m@4@5l@4@11@9@11@9@5xe" filled="f" stroked="f">
           <v:stroke joinstyle="miter"/>
           <v:formulas>

</xml_diff>

<commit_message>
Actualizar la plantilla de Word
</commit_message>
<xml_diff>
--- a/Plantilla.docx
+++ b/Plantilla.docx
@@ -2194,39 +2194,6 @@
     </w:p>
     <w:p>
       <w:pPr>
-        <w:pBdr>
-          <w:bottom w:val="single" w:sz="6" w:space="1" w:color="auto"/>
-        </w:pBdr>
-      </w:pPr>
-    </w:p>
-    <w:p>
-      <w:pPr>
-        <w:rPr>
-          <w:sz w:val="24"/>
-          <w:szCs w:val="24"/>
-        </w:rPr>
-      </w:pPr>
-      <w:r>
-        <w:rPr>
-          <w:b/>
-          <w:bCs/>
-          <w:sz w:val="24"/>
-          <w:szCs w:val="24"/>
-        </w:rPr>
-        <w:t xml:space="preserve">2. </w:t>
-      </w:r>
-      <w:r>
-        <w:rPr>
-          <w:b/>
-          <w:bCs/>
-          <w:sz w:val="24"/>
-          <w:szCs w:val="24"/>
-        </w:rPr>
-        <w:t>Registro control de roedores. CAJAS</w:t>
-      </w:r>
-    </w:p>
-    <w:p>
-      <w:pPr>
         <w:jc w:val="both"/>
         <w:rPr>
           <w:rFonts w:ascii="Avenir Book" w:hAnsi="Avenir Book"/>
@@ -2236,576 +2203,26 @@
         <w:rPr>
           <w:rFonts w:ascii="Avenir Book" w:hAnsi="Avenir Book"/>
         </w:rPr>
-        <w:t xml:space="preserve">El siguiente gráfico desglosa el estado de las estaciones de control de roedores por categoría a lo largo del tiempo. Cada </w:t>
-      </w:r>
-      <w:r>
-        <w:rPr>
-          <w:rFonts w:ascii="Avenir Book" w:hAnsi="Avenir Book"/>
-        </w:rPr>
-        <w:t>panel</w:t>
-      </w:r>
-      <w:r>
-        <w:rPr>
-          <w:rFonts w:ascii="Avenir Book" w:hAnsi="Avenir Book"/>
-        </w:rPr>
-        <w:t xml:space="preserve"> corresponde a un estado diferente de la estación (Cambio de cebo por consumo, Intacto, Deteriorado, etc.) y muestra su evolución mensual mediante barras que representan la cantidad y una línea de tendencia</w:t>
-      </w:r>
-      <w:r>
-        <w:rPr>
-          <w:rFonts w:ascii="Avenir Book" w:hAnsi="Avenir Book"/>
-        </w:rPr>
-        <w:t>.</w:t>
-      </w:r>
-    </w:p>
-    <w:p>
-      <w:r>
-        <w:t>{{roedores_1_plot}}</w:t>
-      </w:r>
-    </w:p>
-    <w:p>
-      <w:pPr>
-        <w:rPr>
-          <w:rFonts w:ascii="Avenir Book" w:hAnsi="Avenir Book"/>
-        </w:rPr>
-      </w:pPr>
-      <w:r>
-        <w:rPr>
-          <w:rFonts w:ascii="Avenir Book" w:hAnsi="Avenir Book"/>
-        </w:rPr>
-        <w:t>{{roedores_1_tabla}}</w:t>
-      </w:r>
-    </w:p>
-    <w:p>
-      <w:pPr>
-        <w:rPr>
-          <w:rFonts w:ascii="Avenir Book" w:hAnsi="Avenir Book"/>
-        </w:rPr>
-      </w:pPr>
-      <w:r>
-        <w:rPr>
-          <w:rFonts w:ascii="Avenir Book" w:hAnsi="Avenir Book"/>
-          <w:highlight w:val="yellow"/>
-        </w:rPr>
-        <w:t>{{analisis_roedores}}</w:t>
-      </w:r>
-    </w:p>
-    <w:p>
-      <w:pPr>
-        <w:jc w:val="both"/>
-        <w:rPr>
-          <w:rFonts w:ascii="Avenir Book" w:hAnsi="Avenir Book"/>
-        </w:rPr>
-      </w:pPr>
-      <w:r>
-        <w:rPr>
-          <w:rFonts w:ascii="Avenir Book" w:hAnsi="Avenir Book"/>
-        </w:rPr>
-        <w:t xml:space="preserve">El siguiente gráfico muestra la evolución temporal de la eliminación de roedores </w:t>
-      </w:r>
-      <w:r>
-        <w:rPr>
-          <w:rFonts w:ascii="Avenir Book" w:hAnsi="Avenir Book"/>
-          <w:b/>
-          <w:bCs/>
-        </w:rPr>
-        <w:t>basada en el consumo de cebo</w:t>
-      </w:r>
-      <w:r>
-        <w:rPr>
-          <w:rFonts w:ascii="Avenir Book" w:hAnsi="Avenir Book"/>
-        </w:rPr>
-        <w:t>. La línea negra conecta</w:t>
-      </w:r>
-      <w:r>
-        <w:rPr>
-          <w:rFonts w:ascii="Avenir Book" w:hAnsi="Avenir Book"/>
-        </w:rPr>
-        <w:t xml:space="preserve"> los puntos de datos creando una trayectoria clara de la tendencia a lo largo del tiempo, permitiendo evaluar la presión de roedores y la efectividad del programa de control.</w:t>
-      </w:r>
-    </w:p>
-    <w:p>
-      <w:r>
-        <w:t>{{roedores_2_plot}}</w:t>
-      </w:r>
-    </w:p>
-    <w:p>
-      <w:r>
-        <w:t>{{roedores_2_tabla}}</w:t>
-      </w:r>
-    </w:p>
-    <w:p>
-      <w:pPr>
-        <w:pBdr>
-          <w:bottom w:val="single" w:sz="6" w:space="1" w:color="auto"/>
-        </w:pBdr>
-      </w:pPr>
-    </w:p>
-    <w:p>
-      <w:pPr>
-        <w:rPr>
-          <w:b/>
-          <w:bCs/>
-          <w:sz w:val="24"/>
-          <w:szCs w:val="24"/>
-        </w:rPr>
-      </w:pPr>
-      <w:r>
-        <w:rPr>
-          <w:b/>
-          <w:bCs/>
-          <w:sz w:val="24"/>
-          <w:szCs w:val="24"/>
-        </w:rPr>
-        <w:t xml:space="preserve">3. </w:t>
-      </w:r>
-      <w:r>
-        <w:rPr>
-          <w:b/>
-          <w:bCs/>
-          <w:sz w:val="24"/>
-          <w:szCs w:val="24"/>
-        </w:rPr>
-        <w:t>Registro control de insectos voladores. Consolidado mensual y tendencia. LAMPARAS</w:t>
-      </w:r>
-    </w:p>
-    <w:p>
-      <w:pPr>
-        <w:jc w:val="both"/>
-        <w:rPr>
-          <w:rFonts w:ascii="Avenir Book" w:hAnsi="Avenir Book"/>
-        </w:rPr>
-      </w:pPr>
-      <w:r>
-        <w:rPr>
-          <w:rFonts w:ascii="Avenir Book" w:hAnsi="Avenir Book"/>
-        </w:rPr>
-        <w:t xml:space="preserve">El siguiente gráfico desglosa el estado de las lámparas por categoría a lo largo del tiempo. Cada </w:t>
-      </w:r>
-      <w:r>
-        <w:rPr>
-          <w:rFonts w:ascii="Avenir Book" w:hAnsi="Avenir Book"/>
-        </w:rPr>
-        <w:t>subgráfico</w:t>
-      </w:r>
-      <w:r>
-        <w:rPr>
-          <w:rFonts w:ascii="Avenir Book" w:hAnsi="Avenir Book"/>
-        </w:rPr>
-        <w:t xml:space="preserve"> corresponde a un estado diferente de la lámpara (Buena potencia, Deteriorada, Apagada, etc.) y muestra su evolución mensual mediante barras que representan la cantidad y una línea de tendencia con marcadores. </w:t>
-      </w:r>
-    </w:p>
-    <w:p>
-      <w:r>
-        <w:t>{{lamparas_1_plot}}</w:t>
-      </w:r>
-    </w:p>
-    <w:p>
-      <w:r>
-        <w:t>{{lamparas_1_tabla}}</w:t>
-      </w:r>
-    </w:p>
-    <w:p>
-      <w:pPr>
-        <w:rPr>
-          <w:rFonts w:ascii="Avenir Book" w:hAnsi="Avenir Book"/>
-        </w:rPr>
-      </w:pPr>
-      <w:r>
-        <w:rPr>
-          <w:rFonts w:ascii="Avenir Book" w:hAnsi="Avenir Book"/>
-          <w:highlight w:val="yellow"/>
-        </w:rPr>
-        <w:t>{{analisis_lamparas}}</w:t>
-      </w:r>
-    </w:p>
-    <w:p>
-      <w:pPr>
-        <w:jc w:val="both"/>
-      </w:pPr>
-      <w:r>
-        <w:rPr>
-          <w:rFonts w:ascii="Avenir Book" w:hAnsi="Avenir Book"/>
-        </w:rPr>
-        <w:t>El siguiente gráfico presenta una visualización de dispersión con burbujas que muestra el estado de las lámparas por área en</w:t>
-      </w:r>
-      <w:r>
-        <w:rPr>
-          <w:rFonts w:ascii="Avenir Book" w:hAnsi="Avenir Book"/>
-        </w:rPr>
-        <w:t xml:space="preserve"> </w:t>
-      </w:r>
-      <w:r>
-        <w:rPr>
-          <w:rFonts w:ascii="Avenir Book" w:hAnsi="Avenir Book"/>
-          <w:b/>
-          <w:bCs/>
-        </w:rPr>
-        <w:t>el mes más reciente</w:t>
-      </w:r>
-      <w:r>
-        <w:rPr>
-          <w:rFonts w:ascii="Avenir Book" w:hAnsi="Avenir Book"/>
-        </w:rPr>
-        <w:t>. Cada fila representa un área específica, cada columna representa un estado de la lámpara, y el tamaño de las burbujas indica la cantidad de lámparas en ese estado. Los colores facilitan la identificación rápida de situaciones críticas (</w:t>
-      </w:r>
-      <w:r>
-        <w:rPr>
-          <w:rFonts w:ascii="Avenir Book" w:hAnsi="Avenir Book"/>
-          <w:color w:val="DE433B"/>
-        </w:rPr>
-        <w:t>rojo</w:t>
-      </w:r>
-      <w:r>
-        <w:rPr>
-          <w:rFonts w:ascii="Avenir Book" w:hAnsi="Avenir Book"/>
-        </w:rPr>
-        <w:t>)</w:t>
-      </w:r>
-      <w:r>
-        <w:rPr>
-          <w:rFonts w:ascii="Avenir Book" w:hAnsi="Avenir Book"/>
-        </w:rPr>
-        <w:t>, situaciones que requieren intervención pero no son críticas (</w:t>
-      </w:r>
-      <w:r>
-        <w:rPr>
-          <w:rFonts w:ascii="Avenir Book" w:hAnsi="Avenir Book"/>
-          <w:color w:val="F18B2C"/>
-        </w:rPr>
-        <w:t>naranja</w:t>
-      </w:r>
-      <w:r>
-        <w:rPr>
-          <w:rFonts w:ascii="Avenir Book" w:hAnsi="Avenir Book"/>
-        </w:rPr>
-        <w:t xml:space="preserve">) y </w:t>
-      </w:r>
-      <w:r>
-        <w:rPr>
-          <w:rFonts w:ascii="Avenir Book" w:hAnsi="Avenir Book"/>
-        </w:rPr>
-        <w:t>condiciones óptimas (</w:t>
-      </w:r>
-      <w:r>
-        <w:rPr>
-          <w:rFonts w:ascii="Avenir Book" w:hAnsi="Avenir Book"/>
-          <w:color w:val="57A177"/>
-        </w:rPr>
-        <w:t>verde</w:t>
-      </w:r>
-      <w:r>
-        <w:rPr>
-          <w:rFonts w:ascii="Avenir Book" w:hAnsi="Avenir Book"/>
-        </w:rPr>
-        <w:t xml:space="preserve">), permitiendo priorizar áreas que requieren </w:t>
-      </w:r>
-      <w:r>
-        <w:rPr>
-          <w:rFonts w:ascii="Avenir Book" w:hAnsi="Avenir Book"/>
-        </w:rPr>
-        <w:t>acciones</w:t>
-      </w:r>
-      <w:r>
-        <w:rPr>
-          <w:rFonts w:ascii="Avenir Book" w:hAnsi="Avenir Book"/>
-        </w:rPr>
-        <w:t xml:space="preserve"> inmediat</w:t>
-      </w:r>
-      <w:r>
-        <w:rPr>
-          <w:rFonts w:ascii="Avenir Book" w:hAnsi="Avenir Book"/>
-        </w:rPr>
-        <w:t>as</w:t>
-      </w:r>
-      <w:r>
-        <w:rPr>
-          <w:rFonts w:ascii="Avenir Book" w:hAnsi="Avenir Book"/>
-        </w:rPr>
-        <w:t>.</w:t>
-      </w:r>
-    </w:p>
-    <w:p>
-      <w:r>
-        <w:t>{{lamparas_2_plot}}</w:t>
-      </w:r>
-    </w:p>
-    <w:p>
-      <w:r>
-        <w:t>{{lamparas_2_tabla}}</w:t>
-      </w:r>
-    </w:p>
-    <w:p/>
-    <w:p>
-      <w:pPr>
-        <w:jc w:val="both"/>
-        <w:rPr>
-          <w:rFonts w:ascii="Avenir Book" w:hAnsi="Avenir Book"/>
-        </w:rPr>
-      </w:pPr>
-      <w:r>
-        <w:rPr>
-          <w:rFonts w:ascii="Avenir Book" w:hAnsi="Avenir Book"/>
-        </w:rPr>
-        <w:t xml:space="preserve">El siguiente gráfico </w:t>
-      </w:r>
-      <w:r>
-        <w:rPr>
-          <w:rFonts w:ascii="Avenir Book" w:hAnsi="Avenir Book"/>
-        </w:rPr>
-        <w:t>muestra</w:t>
-      </w:r>
-      <w:r>
-        <w:rPr>
-          <w:rFonts w:ascii="Avenir Book" w:hAnsi="Avenir Book"/>
-        </w:rPr>
-        <w:t xml:space="preserve"> las capturas por especie a lo largo del tiempo. Cada </w:t>
-      </w:r>
-      <w:r>
-        <w:rPr>
-          <w:rFonts w:ascii="Avenir Book" w:hAnsi="Avenir Book"/>
-        </w:rPr>
-        <w:t>subgráfico</w:t>
-      </w:r>
-      <w:r>
-        <w:rPr>
-          <w:rFonts w:ascii="Avenir Book" w:hAnsi="Avenir Book"/>
-        </w:rPr>
-        <w:t xml:space="preserve"> corresponde a una especie diferente capturada por las lámparas y muestra su evolución mensual mediante barras que representan el volumen de capturas y una línea de tendencia</w:t>
-      </w:r>
-      <w:r>
-        <w:rPr>
-          <w:rFonts w:ascii="Avenir Book" w:hAnsi="Avenir Book"/>
-        </w:rPr>
-        <w:t xml:space="preserve">, mostrando así </w:t>
-      </w:r>
-      <w:r>
-        <w:rPr>
-          <w:rFonts w:ascii="Avenir Book" w:hAnsi="Avenir Book"/>
-        </w:rPr>
-        <w:t xml:space="preserve">patrones específicos </w:t>
-      </w:r>
-      <w:r>
-        <w:rPr>
-          <w:rFonts w:ascii="Avenir Book" w:hAnsi="Avenir Book"/>
-        </w:rPr>
-        <w:t>a lo largo del tiempo.</w:t>
-      </w:r>
-    </w:p>
-    <w:p>
-      <w:r>
-        <w:t>{{lamparas_3_plot}}</w:t>
-      </w:r>
-    </w:p>
-    <w:p>
-      <w:r>
-        <w:t>{{lamparas_3_tabla}}</w:t>
-      </w:r>
-    </w:p>
-    <w:p>
-      <w:pPr>
-        <w:jc w:val="both"/>
-        <w:rPr>
-          <w:rFonts w:ascii="Avenir Light" w:hAnsi="Avenir Light" w:cs="Times New Roman"/>
-        </w:rPr>
-      </w:pPr>
-      <w:r>
-        <w:rPr>
-          <w:rFonts w:ascii="Avenir Light" w:hAnsi="Avenir Light" w:cs="Times New Roman"/>
-        </w:rPr>
-        <w:t xml:space="preserve">El siguiente gráfico muestra la evolución temporal del total de capturas de insectos realizadas por las lámparas. Las barras representan el volumen total mensual de </w:t>
-      </w:r>
-      <w:r>
-        <w:rPr>
-          <w:rFonts w:ascii="Avenir Light" w:hAnsi="Avenir Light" w:cs="Times New Roman"/>
-          <w:b/>
-          <w:bCs/>
-        </w:rPr>
-        <w:t>todas las especies combinadas</w:t>
-      </w:r>
-      <w:r>
-        <w:rPr>
-          <w:rFonts w:ascii="Avenir Light" w:hAnsi="Avenir Light" w:cs="Times New Roman"/>
-        </w:rPr>
-        <w:t xml:space="preserve">, mientras que la línea negra conecta los </w:t>
-      </w:r>
-      <w:r>
-        <w:rPr>
-          <w:rFonts w:ascii="Avenir Light" w:hAnsi="Avenir Light" w:cs="Times New Roman"/>
-        </w:rPr>
-        <w:t>valores</w:t>
-      </w:r>
-      <w:r>
-        <w:rPr>
-          <w:rFonts w:ascii="Avenir Light" w:hAnsi="Avenir Light" w:cs="Times New Roman"/>
-        </w:rPr>
-        <w:t xml:space="preserve"> creando una trayectoria clara de la tendencia a lo largo del tiempo, permitiendo evaluar la efectividad general del sistema de control de insectos voladores.</w:t>
-      </w:r>
-    </w:p>
-    <w:p>
-      <w:r>
-        <w:t>{{lamparas_4_plot}}</w:t>
-      </w:r>
-    </w:p>
-    <w:p>
-      <w:r>
-        <w:t>{{lamparas_4_tabla}}</w:t>
-      </w:r>
-    </w:p>
-    <w:p>
-      <w:pPr>
-        <w:pBdr>
-          <w:bottom w:val="single" w:sz="6" w:space="1" w:color="auto"/>
-        </w:pBdr>
-      </w:pPr>
-    </w:p>
-    <w:p>
-      <w:pPr>
-        <w:rPr>
-          <w:b/>
-          <w:bCs/>
-          <w:sz w:val="24"/>
-          <w:szCs w:val="24"/>
-        </w:rPr>
-      </w:pPr>
-      <w:r>
-        <w:rPr>
-          <w:b/>
-          <w:bCs/>
-          <w:sz w:val="24"/>
-          <w:szCs w:val="24"/>
-        </w:rPr>
-        <w:t xml:space="preserve">4. </w:t>
-      </w:r>
-      <w:r>
-        <w:rPr>
-          <w:b/>
-          <w:bCs/>
-          <w:sz w:val="24"/>
-          <w:szCs w:val="24"/>
-        </w:rPr>
-        <w:t>Registro control de órdenes de mantenimiento y seguimiento. CORRECTIVOS</w:t>
-      </w:r>
-    </w:p>
-    <w:p>
-      <w:pPr>
-        <w:jc w:val="both"/>
-        <w:rPr>
-          <w:rFonts w:ascii="Avenir Book" w:hAnsi="Avenir Book"/>
-        </w:rPr>
-      </w:pPr>
-      <w:r>
-        <w:rPr>
-          <w:rFonts w:ascii="Avenir Book" w:hAnsi="Avenir Book"/>
-        </w:rPr>
-        <w:t xml:space="preserve">El siguiente gráfico compara dos métricas por mes: la cantidad total de órdenes de mantenimiento correctivo y el número de órdenes que reportaron evidencia de plagas. Cada mes se representa con dos barras verticales una al lado de la otra, permitiendo una comparación visual directa entre el volumen total de trabajo y los casos que requirieron intervención por presencia de plagas. </w:t>
-      </w:r>
-    </w:p>
-    <w:p>
-      <w:r>
-        <w:t>{{correctivo_1_plot}}</w:t>
-      </w:r>
-    </w:p>
-    <w:p>
-      <w:r>
-        <w:t>{{correctivo_1_tabla}}</w:t>
-      </w:r>
-    </w:p>
-    <w:p>
-      <w:pPr>
-        <w:jc w:val="both"/>
-        <w:rPr>
-          <w:rFonts w:ascii="Avenir Book" w:hAnsi="Avenir Book"/>
-        </w:rPr>
-      </w:pPr>
-      <w:r>
-        <w:rPr>
-          <w:rFonts w:ascii="Avenir Book" w:hAnsi="Avenir Book"/>
-        </w:rPr>
-        <w:t xml:space="preserve">El </w:t>
-      </w:r>
-      <w:r>
-        <w:rPr>
-          <w:rFonts w:ascii="Avenir Book" w:hAnsi="Avenir Book"/>
-        </w:rPr>
-        <w:t xml:space="preserve">siguiente </w:t>
-      </w:r>
-      <w:r>
-        <w:rPr>
-          <w:rFonts w:ascii="Avenir Book" w:hAnsi="Avenir Book"/>
-        </w:rPr>
-        <w:t>gráfico m</w:t>
-      </w:r>
-      <w:r>
-        <w:rPr>
-          <w:rFonts w:ascii="Avenir Book" w:hAnsi="Avenir Book"/>
-        </w:rPr>
-        <w:t xml:space="preserve">uestra </w:t>
-      </w:r>
-      <w:r>
-        <w:rPr>
-          <w:rFonts w:ascii="Avenir Book" w:hAnsi="Avenir Book"/>
-        </w:rPr>
-        <w:t xml:space="preserve">la evolución temporal del total de hallazgos </w:t>
-      </w:r>
-      <w:r>
-        <w:rPr>
-          <w:rFonts w:ascii="Avenir Book" w:hAnsi="Avenir Book"/>
-        </w:rPr>
-        <w:t xml:space="preserve">encontrados en órdenes correctivas. </w:t>
-      </w:r>
-      <w:r>
-        <w:rPr>
-          <w:rFonts w:ascii="Avenir Book" w:hAnsi="Avenir Book"/>
-        </w:rPr>
-        <w:t xml:space="preserve"> </w:t>
-      </w:r>
-      <w:r>
-        <w:rPr>
-          <w:rFonts w:ascii="Avenir Book" w:hAnsi="Avenir Book"/>
-        </w:rPr>
-        <w:t xml:space="preserve">Las baras representan el </w:t>
-      </w:r>
-      <w:r>
-        <w:rPr>
-          <w:rFonts w:ascii="Avenir Book" w:hAnsi="Avenir Book"/>
-        </w:rPr>
-        <w:t xml:space="preserve">volumen </w:t>
-      </w:r>
-      <w:r>
-        <w:rPr>
-          <w:rFonts w:ascii="Avenir Book" w:hAnsi="Avenir Book"/>
-        </w:rPr>
-        <w:t xml:space="preserve">total </w:t>
-      </w:r>
-      <w:r>
-        <w:rPr>
-          <w:rFonts w:ascii="Avenir Book" w:hAnsi="Avenir Book"/>
-        </w:rPr>
-        <w:t xml:space="preserve">mensual, mientras que la línea negra conecta los puntos de datos creando una trayectoria clara de la tendencia a lo largo del tiempo. </w:t>
-      </w:r>
-    </w:p>
-    <w:p>
-      <w:r>
-        <w:t>{{correctivo_2_plot}}</w:t>
-      </w:r>
-    </w:p>
-    <w:p>
-      <w:r>
-        <w:t>{{correctivo_2_tabla}}</w:t>
-      </w:r>
-    </w:p>
-    <w:p>
-      <w:pPr>
-        <w:jc w:val="both"/>
-        <w:rPr>
-          <w:rFonts w:ascii="Avenir Book" w:hAnsi="Avenir Book"/>
-        </w:rPr>
-      </w:pPr>
-      <w:r>
-        <w:rPr>
-          <w:rFonts w:ascii="Avenir Book" w:hAnsi="Avenir Book"/>
-        </w:rPr>
-        <w:t>El siguiente gráfico presenta una visualización que analiza el nivel de infestación detectado en las órdenes de mantenimiento correctivas del mes más reciente. Cada panel corresponde a una especie de plaga diferente y muestra la distribución de órdenes clasificadas en tres categorías: Alto, Medio y Bajo. La clasificación se determina comparando la cantidad de hallazgos reportados en cada orden con los valores de referencia establecidos en la tabla de referencia. Las órdenes sin evidencia de plagas se excluyen del gráfico para concentrar el análisis únicamente en situaciones que requieren intervención.</w:t>
+        <w:lastRenderedPageBreak/>
+        <w:t xml:space="preserve">El siguiente gráfico presenta una visualización que analiza el nivel de infestación detectado en las órdenes de mantenimiento </w:t>
+      </w:r>
+      <w:r>
+        <w:rPr>
+          <w:rFonts w:ascii="Avenir Book" w:hAnsi="Avenir Book"/>
+        </w:rPr>
+        <w:t xml:space="preserve">preventivas </w:t>
+      </w:r>
+      <w:r>
+        <w:rPr>
+          <w:rFonts w:ascii="Avenir Book" w:hAnsi="Avenir Book"/>
+        </w:rPr>
+        <w:t>del mes más reciente. Cada panel corresponde a una especie de plaga diferente y muestra la distribución de órdenes clasificadas en tres categorías: Alto, Medio y Bajo. La clasificación se determina comparando la cantidad de hallazgos reportados en cada orden con los valores de referencia establecidos en la tabla de referencia</w:t>
+      </w:r>
+      <w:r>
+        <w:rPr>
+          <w:rFonts w:ascii="Avenir Book" w:hAnsi="Avenir Book"/>
+        </w:rPr>
+        <w:t xml:space="preserve"> mostrada a continuación.</w:t>
       </w:r>
     </w:p>
     <w:tbl>
@@ -2871,7 +2288,6 @@
               <w:rPr>
                 <w:rFonts w:ascii="Avenir Book" w:hAnsi="Avenir Book"/>
               </w:rPr>
-              <w:lastRenderedPageBreak/>
               <w:t>Plaga</w:t>
             </w:r>
           </w:p>
@@ -3706,8 +3122,1603 @@
         </w:tc>
       </w:tr>
     </w:tbl>
+    <w:p>
+      <w:pPr>
+        <w:pBdr>
+          <w:bottom w:val="single" w:sz="6" w:space="1" w:color="auto"/>
+        </w:pBdr>
+      </w:pPr>
+    </w:p>
+    <w:p>
+      <w:pPr>
+        <w:pBdr>
+          <w:bottom w:val="single" w:sz="6" w:space="1" w:color="auto"/>
+        </w:pBdr>
+      </w:pPr>
+    </w:p>
+    <w:p>
+      <w:pPr>
+        <w:pBdr>
+          <w:bottom w:val="single" w:sz="6" w:space="1" w:color="auto"/>
+        </w:pBdr>
+      </w:pPr>
+      <w:r>
+        <w:t>{{preventivos_4_plot}}</w:t>
+      </w:r>
+    </w:p>
+    <w:p>
+      <w:pPr>
+        <w:pBdr>
+          <w:bottom w:val="single" w:sz="6" w:space="1" w:color="auto"/>
+        </w:pBdr>
+      </w:pPr>
+      <w:r>
+        <w:t>{{preventivos_4_tabla}}</w:t>
+      </w:r>
+    </w:p>
+    <w:p>
+      <w:pPr>
+        <w:pBdr>
+          <w:bottom w:val="single" w:sz="6" w:space="1" w:color="auto"/>
+        </w:pBdr>
+      </w:pPr>
+    </w:p>
+    <w:p>
+      <w:pPr>
+        <w:pBdr>
+          <w:bottom w:val="single" w:sz="6" w:space="1" w:color="auto"/>
+        </w:pBdr>
+      </w:pPr>
+    </w:p>
+    <w:p>
+      <w:pPr>
+        <w:rPr>
+          <w:sz w:val="24"/>
+          <w:szCs w:val="24"/>
+        </w:rPr>
+      </w:pPr>
+      <w:r>
+        <w:rPr>
+          <w:b/>
+          <w:bCs/>
+          <w:sz w:val="24"/>
+          <w:szCs w:val="24"/>
+        </w:rPr>
+        <w:t xml:space="preserve">2. </w:t>
+      </w:r>
+      <w:r>
+        <w:rPr>
+          <w:b/>
+          <w:bCs/>
+          <w:sz w:val="24"/>
+          <w:szCs w:val="24"/>
+        </w:rPr>
+        <w:t>Registro control de roedores. CAJAS</w:t>
+      </w:r>
+    </w:p>
+    <w:p>
+      <w:pPr>
+        <w:jc w:val="both"/>
+        <w:rPr>
+          <w:rFonts w:ascii="Avenir Book" w:hAnsi="Avenir Book"/>
+        </w:rPr>
+      </w:pPr>
+      <w:r>
+        <w:rPr>
+          <w:rFonts w:ascii="Avenir Book" w:hAnsi="Avenir Book"/>
+        </w:rPr>
+        <w:t xml:space="preserve">El siguiente gráfico desglosa el estado de las estaciones de control de roedores por categoría a lo largo del tiempo. Cada </w:t>
+      </w:r>
+      <w:r>
+        <w:rPr>
+          <w:rFonts w:ascii="Avenir Book" w:hAnsi="Avenir Book"/>
+        </w:rPr>
+        <w:t>panel</w:t>
+      </w:r>
+      <w:r>
+        <w:rPr>
+          <w:rFonts w:ascii="Avenir Book" w:hAnsi="Avenir Book"/>
+        </w:rPr>
+        <w:t xml:space="preserve"> corresponde a un estado diferente de la estación (Cambio de cebo por consumo, Intacto, Deteriorado, etc.) y muestra su evolución mensual mediante barras que representan la cantidad y una línea de tendencia</w:t>
+      </w:r>
+      <w:r>
+        <w:rPr>
+          <w:rFonts w:ascii="Avenir Book" w:hAnsi="Avenir Book"/>
+        </w:rPr>
+        <w:t>.</w:t>
+      </w:r>
+    </w:p>
+    <w:p>
+      <w:r>
+        <w:t>{{roedores_1_plot}}</w:t>
+      </w:r>
+    </w:p>
+    <w:p>
+      <w:pPr>
+        <w:rPr>
+          <w:rFonts w:ascii="Avenir Book" w:hAnsi="Avenir Book"/>
+        </w:rPr>
+      </w:pPr>
+      <w:r>
+        <w:rPr>
+          <w:rFonts w:ascii="Avenir Book" w:hAnsi="Avenir Book"/>
+        </w:rPr>
+        <w:t>{{roedores_1_tabla}}</w:t>
+      </w:r>
+    </w:p>
+    <w:p>
+      <w:pPr>
+        <w:rPr>
+          <w:rFonts w:ascii="Avenir Book" w:hAnsi="Avenir Book"/>
+        </w:rPr>
+      </w:pPr>
+      <w:r>
+        <w:rPr>
+          <w:rFonts w:ascii="Avenir Book" w:hAnsi="Avenir Book"/>
+          <w:highlight w:val="yellow"/>
+        </w:rPr>
+        <w:t>{{analisis_roedores}}</w:t>
+      </w:r>
+    </w:p>
+    <w:p>
+      <w:pPr>
+        <w:jc w:val="both"/>
+        <w:rPr>
+          <w:rFonts w:ascii="Avenir Book" w:hAnsi="Avenir Book"/>
+        </w:rPr>
+      </w:pPr>
+      <w:r>
+        <w:rPr>
+          <w:rFonts w:ascii="Avenir Book" w:hAnsi="Avenir Book"/>
+        </w:rPr>
+        <w:t xml:space="preserve">El siguiente gráfico muestra la evolución temporal de la eliminación de roedores </w:t>
+      </w:r>
+      <w:r>
+        <w:rPr>
+          <w:rFonts w:ascii="Avenir Book" w:hAnsi="Avenir Book"/>
+          <w:b/>
+          <w:bCs/>
+        </w:rPr>
+        <w:t>basada en el consumo de cebo</w:t>
+      </w:r>
+      <w:r>
+        <w:rPr>
+          <w:rFonts w:ascii="Avenir Book" w:hAnsi="Avenir Book"/>
+        </w:rPr>
+        <w:t>. La línea negra conecta</w:t>
+      </w:r>
+      <w:r>
+        <w:rPr>
+          <w:rFonts w:ascii="Avenir Book" w:hAnsi="Avenir Book"/>
+        </w:rPr>
+        <w:t xml:space="preserve"> los puntos de datos creando una trayectoria clara de la tendencia a lo largo del tiempo, permitiendo evaluar la presión de roedores y la efectividad del programa de control.</w:t>
+      </w:r>
+    </w:p>
+    <w:p>
+      <w:r>
+        <w:t>{{roedores_2_plot}}</w:t>
+      </w:r>
+    </w:p>
+    <w:p>
+      <w:r>
+        <w:lastRenderedPageBreak/>
+        <w:t>{{roedores_2_tabla}}</w:t>
+      </w:r>
+    </w:p>
+    <w:p>
+      <w:pPr>
+        <w:pBdr>
+          <w:bottom w:val="single" w:sz="6" w:space="1" w:color="auto"/>
+        </w:pBdr>
+      </w:pPr>
+    </w:p>
+    <w:p>
+      <w:pPr>
+        <w:rPr>
+          <w:b/>
+          <w:bCs/>
+          <w:sz w:val="24"/>
+          <w:szCs w:val="24"/>
+        </w:rPr>
+      </w:pPr>
+      <w:r>
+        <w:rPr>
+          <w:b/>
+          <w:bCs/>
+          <w:sz w:val="24"/>
+          <w:szCs w:val="24"/>
+        </w:rPr>
+        <w:t xml:space="preserve">3. </w:t>
+      </w:r>
+      <w:r>
+        <w:rPr>
+          <w:b/>
+          <w:bCs/>
+          <w:sz w:val="24"/>
+          <w:szCs w:val="24"/>
+        </w:rPr>
+        <w:t>Registro control de insectos voladores. Consolidado mensual y tendencia. LAMPARAS</w:t>
+      </w:r>
+    </w:p>
+    <w:p>
+      <w:pPr>
+        <w:jc w:val="both"/>
+        <w:rPr>
+          <w:rFonts w:ascii="Avenir Book" w:hAnsi="Avenir Book"/>
+        </w:rPr>
+      </w:pPr>
+      <w:r>
+        <w:rPr>
+          <w:rFonts w:ascii="Avenir Book" w:hAnsi="Avenir Book"/>
+        </w:rPr>
+        <w:t xml:space="preserve">El siguiente gráfico desglosa el estado de las lámparas por categoría a lo largo del tiempo. Cada </w:t>
+      </w:r>
+      <w:r>
+        <w:rPr>
+          <w:rFonts w:ascii="Avenir Book" w:hAnsi="Avenir Book"/>
+        </w:rPr>
+        <w:t>subgráfico</w:t>
+      </w:r>
+      <w:r>
+        <w:rPr>
+          <w:rFonts w:ascii="Avenir Book" w:hAnsi="Avenir Book"/>
+        </w:rPr>
+        <w:t xml:space="preserve"> corresponde a un estado diferente de la lámpara (Buena potencia, Deteriorada, Apagada, etc.) y muestra su evolución mensual mediante barras que representan la cantidad y una línea de tendencia con marcadores. </w:t>
+      </w:r>
+    </w:p>
+    <w:p>
+      <w:r>
+        <w:t>{{lamparas_1_plot}}</w:t>
+      </w:r>
+    </w:p>
+    <w:p>
+      <w:r>
+        <w:t>{{lamparas_1_tabla}}</w:t>
+      </w:r>
+    </w:p>
+    <w:p>
+      <w:pPr>
+        <w:rPr>
+          <w:rFonts w:ascii="Avenir Book" w:hAnsi="Avenir Book"/>
+        </w:rPr>
+      </w:pPr>
+      <w:r>
+        <w:rPr>
+          <w:rFonts w:ascii="Avenir Book" w:hAnsi="Avenir Book"/>
+          <w:highlight w:val="yellow"/>
+        </w:rPr>
+        <w:t>{{analisis_lamparas}}</w:t>
+      </w:r>
+    </w:p>
+    <w:p>
+      <w:pPr>
+        <w:jc w:val="both"/>
+      </w:pPr>
+      <w:r>
+        <w:rPr>
+          <w:rFonts w:ascii="Avenir Book" w:hAnsi="Avenir Book"/>
+        </w:rPr>
+        <w:t>El siguiente gráfico presenta una visualización de dispersión con burbujas que muestra el estado de las lámparas por área en</w:t>
+      </w:r>
+      <w:r>
+        <w:rPr>
+          <w:rFonts w:ascii="Avenir Book" w:hAnsi="Avenir Book"/>
+        </w:rPr>
+        <w:t xml:space="preserve"> </w:t>
+      </w:r>
+      <w:r>
+        <w:rPr>
+          <w:rFonts w:ascii="Avenir Book" w:hAnsi="Avenir Book"/>
+          <w:b/>
+          <w:bCs/>
+        </w:rPr>
+        <w:t>el mes más reciente</w:t>
+      </w:r>
+      <w:r>
+        <w:rPr>
+          <w:rFonts w:ascii="Avenir Book" w:hAnsi="Avenir Book"/>
+        </w:rPr>
+        <w:t>. Cada fila representa un área específica, cada columna representa un estado de la lámpara, y el tamaño de las burbujas indica la cantidad de lámparas en ese estado. Los colores facilitan la identificación rápida de situaciones críticas (</w:t>
+      </w:r>
+      <w:r>
+        <w:rPr>
+          <w:rFonts w:ascii="Avenir Book" w:hAnsi="Avenir Book"/>
+          <w:color w:val="DE433B"/>
+        </w:rPr>
+        <w:t>rojo</w:t>
+      </w:r>
+      <w:r>
+        <w:rPr>
+          <w:rFonts w:ascii="Avenir Book" w:hAnsi="Avenir Book"/>
+        </w:rPr>
+        <w:t>)</w:t>
+      </w:r>
+      <w:r>
+        <w:rPr>
+          <w:rFonts w:ascii="Avenir Book" w:hAnsi="Avenir Book"/>
+        </w:rPr>
+        <w:t>, situaciones que requieren intervención pero no son críticas (</w:t>
+      </w:r>
+      <w:r>
+        <w:rPr>
+          <w:rFonts w:ascii="Avenir Book" w:hAnsi="Avenir Book"/>
+          <w:color w:val="F18B2C"/>
+        </w:rPr>
+        <w:t>naranja</w:t>
+      </w:r>
+      <w:r>
+        <w:rPr>
+          <w:rFonts w:ascii="Avenir Book" w:hAnsi="Avenir Book"/>
+        </w:rPr>
+        <w:t xml:space="preserve">) y </w:t>
+      </w:r>
+      <w:r>
+        <w:rPr>
+          <w:rFonts w:ascii="Avenir Book" w:hAnsi="Avenir Book"/>
+        </w:rPr>
+        <w:t>condiciones óptimas (</w:t>
+      </w:r>
+      <w:r>
+        <w:rPr>
+          <w:rFonts w:ascii="Avenir Book" w:hAnsi="Avenir Book"/>
+          <w:color w:val="57A177"/>
+        </w:rPr>
+        <w:t>verde</w:t>
+      </w:r>
+      <w:r>
+        <w:rPr>
+          <w:rFonts w:ascii="Avenir Book" w:hAnsi="Avenir Book"/>
+        </w:rPr>
+        <w:t xml:space="preserve">), permitiendo priorizar áreas que requieren </w:t>
+      </w:r>
+      <w:r>
+        <w:rPr>
+          <w:rFonts w:ascii="Avenir Book" w:hAnsi="Avenir Book"/>
+        </w:rPr>
+        <w:t>acciones</w:t>
+      </w:r>
+      <w:r>
+        <w:rPr>
+          <w:rFonts w:ascii="Avenir Book" w:hAnsi="Avenir Book"/>
+        </w:rPr>
+        <w:t xml:space="preserve"> inmediat</w:t>
+      </w:r>
+      <w:r>
+        <w:rPr>
+          <w:rFonts w:ascii="Avenir Book" w:hAnsi="Avenir Book"/>
+        </w:rPr>
+        <w:t>as</w:t>
+      </w:r>
+      <w:r>
+        <w:rPr>
+          <w:rFonts w:ascii="Avenir Book" w:hAnsi="Avenir Book"/>
+        </w:rPr>
+        <w:t>.</w:t>
+      </w:r>
+    </w:p>
+    <w:p>
+      <w:r>
+        <w:t>{{lamparas_2_plot}}</w:t>
+      </w:r>
+    </w:p>
+    <w:p>
+      <w:r>
+        <w:t>{{lamparas_2_tabla}}</w:t>
+      </w:r>
+    </w:p>
     <w:p/>
     <w:p>
+      <w:pPr>
+        <w:jc w:val="both"/>
+        <w:rPr>
+          <w:rFonts w:ascii="Avenir Book" w:hAnsi="Avenir Book"/>
+        </w:rPr>
+      </w:pPr>
+      <w:r>
+        <w:rPr>
+          <w:rFonts w:ascii="Avenir Book" w:hAnsi="Avenir Book"/>
+        </w:rPr>
+        <w:t xml:space="preserve">El siguiente gráfico </w:t>
+      </w:r>
+      <w:r>
+        <w:rPr>
+          <w:rFonts w:ascii="Avenir Book" w:hAnsi="Avenir Book"/>
+        </w:rPr>
+        <w:t>muestra</w:t>
+      </w:r>
+      <w:r>
+        <w:rPr>
+          <w:rFonts w:ascii="Avenir Book" w:hAnsi="Avenir Book"/>
+        </w:rPr>
+        <w:t xml:space="preserve"> las capturas por especie a lo largo del tiempo. Cada </w:t>
+      </w:r>
+      <w:r>
+        <w:rPr>
+          <w:rFonts w:ascii="Avenir Book" w:hAnsi="Avenir Book"/>
+        </w:rPr>
+        <w:t>subgráfico</w:t>
+      </w:r>
+      <w:r>
+        <w:rPr>
+          <w:rFonts w:ascii="Avenir Book" w:hAnsi="Avenir Book"/>
+        </w:rPr>
+        <w:t xml:space="preserve"> corresponde a una especie diferente capturada por las lámparas y muestra su evolución mensual mediante barras que representan el volumen de capturas y una línea de tendencia</w:t>
+      </w:r>
+      <w:r>
+        <w:rPr>
+          <w:rFonts w:ascii="Avenir Book" w:hAnsi="Avenir Book"/>
+        </w:rPr>
+        <w:t xml:space="preserve">, mostrando así </w:t>
+      </w:r>
+      <w:r>
+        <w:rPr>
+          <w:rFonts w:ascii="Avenir Book" w:hAnsi="Avenir Book"/>
+        </w:rPr>
+        <w:t xml:space="preserve">patrones específicos </w:t>
+      </w:r>
+      <w:r>
+        <w:rPr>
+          <w:rFonts w:ascii="Avenir Book" w:hAnsi="Avenir Book"/>
+        </w:rPr>
+        <w:t>a lo largo del tiempo.</w:t>
+      </w:r>
+    </w:p>
+    <w:p>
+      <w:r>
+        <w:t>{{lamparas_3_plot}}</w:t>
+      </w:r>
+    </w:p>
+    <w:p>
+      <w:r>
+        <w:t>{{lamparas_3_tabla}}</w:t>
+      </w:r>
+    </w:p>
+    <w:p>
+      <w:pPr>
+        <w:jc w:val="both"/>
+        <w:rPr>
+          <w:rFonts w:ascii="Avenir Light" w:hAnsi="Avenir Light" w:cs="Times New Roman"/>
+        </w:rPr>
+      </w:pPr>
+      <w:r>
+        <w:rPr>
+          <w:rFonts w:ascii="Avenir Light" w:hAnsi="Avenir Light" w:cs="Times New Roman"/>
+        </w:rPr>
+        <w:t xml:space="preserve">El siguiente gráfico muestra la evolución temporal del total de capturas de insectos realizadas por las lámparas. Las barras representan el volumen total mensual de </w:t>
+      </w:r>
+      <w:r>
+        <w:rPr>
+          <w:rFonts w:ascii="Avenir Light" w:hAnsi="Avenir Light" w:cs="Times New Roman"/>
+          <w:b/>
+          <w:bCs/>
+        </w:rPr>
+        <w:t>todas las especies combinadas</w:t>
+      </w:r>
+      <w:r>
+        <w:rPr>
+          <w:rFonts w:ascii="Avenir Light" w:hAnsi="Avenir Light" w:cs="Times New Roman"/>
+        </w:rPr>
+        <w:t xml:space="preserve">, mientras que la línea negra conecta los </w:t>
+      </w:r>
+      <w:r>
+        <w:rPr>
+          <w:rFonts w:ascii="Avenir Light" w:hAnsi="Avenir Light" w:cs="Times New Roman"/>
+        </w:rPr>
+        <w:t>valores</w:t>
+      </w:r>
+      <w:r>
+        <w:rPr>
+          <w:rFonts w:ascii="Avenir Light" w:hAnsi="Avenir Light" w:cs="Times New Roman"/>
+        </w:rPr>
+        <w:t xml:space="preserve"> creando una trayectoria clara de la tendencia a lo largo del tiempo, permitiendo evaluar la efectividad general del sistema de control de insectos voladores.</w:t>
+      </w:r>
+    </w:p>
+    <w:p>
+      <w:r>
+        <w:t>{{lamparas_4_plot}}</w:t>
+      </w:r>
+    </w:p>
+    <w:p>
+      <w:r>
+        <w:t>{{lamparas_4_tabla}}</w:t>
+      </w:r>
+    </w:p>
+    <w:p>
+      <w:pPr>
+        <w:pBdr>
+          <w:bottom w:val="single" w:sz="6" w:space="1" w:color="auto"/>
+        </w:pBdr>
+      </w:pPr>
+    </w:p>
+    <w:p>
+      <w:pPr>
+        <w:rPr>
+          <w:b/>
+          <w:bCs/>
+          <w:sz w:val="24"/>
+          <w:szCs w:val="24"/>
+        </w:rPr>
+      </w:pPr>
+      <w:r>
+        <w:rPr>
+          <w:b/>
+          <w:bCs/>
+          <w:sz w:val="24"/>
+          <w:szCs w:val="24"/>
+        </w:rPr>
+        <w:lastRenderedPageBreak/>
+        <w:t xml:space="preserve">4. </w:t>
+      </w:r>
+      <w:r>
+        <w:rPr>
+          <w:b/>
+          <w:bCs/>
+          <w:sz w:val="24"/>
+          <w:szCs w:val="24"/>
+        </w:rPr>
+        <w:t>Registro control de órdenes de mantenimiento y seguimiento. CORRECTIVOS</w:t>
+      </w:r>
+    </w:p>
+    <w:p>
+      <w:pPr>
+        <w:jc w:val="both"/>
+        <w:rPr>
+          <w:rFonts w:ascii="Avenir Book" w:hAnsi="Avenir Book"/>
+        </w:rPr>
+      </w:pPr>
+      <w:r>
+        <w:rPr>
+          <w:rFonts w:ascii="Avenir Book" w:hAnsi="Avenir Book"/>
+        </w:rPr>
+        <w:t xml:space="preserve">El siguiente gráfico compara dos métricas por mes: la cantidad total de órdenes de mantenimiento correctivo y el número de órdenes que reportaron evidencia de plagas. Cada mes se representa con dos barras verticales una al lado de la otra, permitiendo una comparación visual directa entre el volumen total de trabajo y los casos que requirieron intervención por presencia de plagas. </w:t>
+      </w:r>
+    </w:p>
+    <w:p>
+      <w:r>
+        <w:t>{{correctivo_1_plot}}</w:t>
+      </w:r>
+    </w:p>
+    <w:p>
+      <w:r>
+        <w:t>{{correctivo_1_tabla}}</w:t>
+      </w:r>
+    </w:p>
+    <w:p>
+      <w:pPr>
+        <w:jc w:val="both"/>
+        <w:rPr>
+          <w:rFonts w:ascii="Avenir Book" w:hAnsi="Avenir Book"/>
+        </w:rPr>
+      </w:pPr>
+      <w:r>
+        <w:rPr>
+          <w:rFonts w:ascii="Avenir Book" w:hAnsi="Avenir Book"/>
+        </w:rPr>
+        <w:t xml:space="preserve">El </w:t>
+      </w:r>
+      <w:r>
+        <w:rPr>
+          <w:rFonts w:ascii="Avenir Book" w:hAnsi="Avenir Book"/>
+        </w:rPr>
+        <w:t xml:space="preserve">siguiente </w:t>
+      </w:r>
+      <w:r>
+        <w:rPr>
+          <w:rFonts w:ascii="Avenir Book" w:hAnsi="Avenir Book"/>
+        </w:rPr>
+        <w:t>gráfico m</w:t>
+      </w:r>
+      <w:r>
+        <w:rPr>
+          <w:rFonts w:ascii="Avenir Book" w:hAnsi="Avenir Book"/>
+        </w:rPr>
+        <w:t xml:space="preserve">uestra </w:t>
+      </w:r>
+      <w:r>
+        <w:rPr>
+          <w:rFonts w:ascii="Avenir Book" w:hAnsi="Avenir Book"/>
+        </w:rPr>
+        <w:t xml:space="preserve">la evolución temporal del total de hallazgos </w:t>
+      </w:r>
+      <w:r>
+        <w:rPr>
+          <w:rFonts w:ascii="Avenir Book" w:hAnsi="Avenir Book"/>
+        </w:rPr>
+        <w:t xml:space="preserve">encontrados en órdenes correctivas. </w:t>
+      </w:r>
+      <w:r>
+        <w:rPr>
+          <w:rFonts w:ascii="Avenir Book" w:hAnsi="Avenir Book"/>
+        </w:rPr>
+        <w:t xml:space="preserve"> </w:t>
+      </w:r>
+      <w:r>
+        <w:rPr>
+          <w:rFonts w:ascii="Avenir Book" w:hAnsi="Avenir Book"/>
+        </w:rPr>
+        <w:t xml:space="preserve">Las baras representan el </w:t>
+      </w:r>
+      <w:r>
+        <w:rPr>
+          <w:rFonts w:ascii="Avenir Book" w:hAnsi="Avenir Book"/>
+        </w:rPr>
+        <w:t xml:space="preserve">volumen </w:t>
+      </w:r>
+      <w:r>
+        <w:rPr>
+          <w:rFonts w:ascii="Avenir Book" w:hAnsi="Avenir Book"/>
+        </w:rPr>
+        <w:t xml:space="preserve">total </w:t>
+      </w:r>
+      <w:r>
+        <w:rPr>
+          <w:rFonts w:ascii="Avenir Book" w:hAnsi="Avenir Book"/>
+        </w:rPr>
+        <w:t xml:space="preserve">mensual, mientras que la línea negra conecta los puntos de datos creando una trayectoria clara de la tendencia a lo largo del tiempo. </w:t>
+      </w:r>
+    </w:p>
+    <w:p>
+      <w:r>
+        <w:t>{{correctivo_2_plot}}</w:t>
+      </w:r>
+    </w:p>
+    <w:p>
+      <w:r>
+        <w:t>{{correctivo_2_tabla}}</w:t>
+      </w:r>
+    </w:p>
+    <w:p>
+      <w:pPr>
+        <w:jc w:val="both"/>
+        <w:rPr>
+          <w:rFonts w:ascii="Avenir Book" w:hAnsi="Avenir Book"/>
+        </w:rPr>
+      </w:pPr>
+      <w:r>
+        <w:rPr>
+          <w:rFonts w:ascii="Avenir Book" w:hAnsi="Avenir Book"/>
+        </w:rPr>
+        <w:t>El siguiente gráfico presenta una visualización que analiza el nivel de infestación detectado en las órdenes de mantenimiento correctivas del mes más reciente. Cada panel corresponde a una especie de plaga diferente y muestra la distribución de órdenes clasificadas en tres categorías: Alto, Medio y Bajo. La clasificación se determina comparando la cantidad de hallazgos reportados en cada orden con los valores de referencia establecidos en la tabla de referencia</w:t>
+      </w:r>
+      <w:r>
+        <w:rPr>
+          <w:rFonts w:ascii="Avenir Book" w:hAnsi="Avenir Book"/>
+        </w:rPr>
+        <w:t xml:space="preserve"> </w:t>
+      </w:r>
+      <w:r>
+        <w:rPr>
+          <w:rFonts w:ascii="Avenir Book" w:hAnsi="Avenir Book"/>
+        </w:rPr>
+        <w:t>mostrada a continuación</w:t>
+      </w:r>
+      <w:r>
+        <w:rPr>
+          <w:rFonts w:ascii="Avenir Book" w:hAnsi="Avenir Book"/>
+        </w:rPr>
+        <w:t>.</w:t>
+      </w:r>
+      <w:r>
+        <w:rPr>
+          <w:rFonts w:ascii="Avenir Book" w:hAnsi="Avenir Book"/>
+        </w:rPr>
+        <w:t xml:space="preserve"> </w:t>
+      </w:r>
+    </w:p>
+    <w:tbl>
+      <w:tblPr>
+        <w:tblStyle w:val="TableGrid"/>
+        <w:tblW w:w="0" w:type="auto"/>
+        <w:jc w:val="center"/>
+        <w:tblLook w:val="04A0" w:firstRow="1" w:lastRow="0" w:firstColumn="1" w:lastColumn="0" w:noHBand="0" w:noVBand="1"/>
+      </w:tblPr>
+      <w:tblGrid>
+        <w:gridCol w:w="2268"/>
+        <w:gridCol w:w="827"/>
+        <w:gridCol w:w="1016"/>
+        <w:gridCol w:w="850"/>
+      </w:tblGrid>
+      <w:tr>
+        <w:trPr>
+          <w:jc w:val="center"/>
+        </w:trPr>
+        <w:tc>
+          <w:tcPr>
+            <w:tcW w:w="4961" w:type="dxa"/>
+            <w:gridSpan w:val="4"/>
+            <w:vAlign w:val="center"/>
+          </w:tcPr>
+          <w:p>
+            <w:pPr>
+              <w:jc w:val="center"/>
+              <w:rPr>
+                <w:rFonts w:ascii="Avenir Book" w:hAnsi="Avenir Book"/>
+                <w:b/>
+                <w:bCs/>
+              </w:rPr>
+            </w:pPr>
+            <w:r>
+              <w:rPr>
+                <w:rFonts w:ascii="Avenir Book" w:hAnsi="Avenir Book"/>
+                <w:b/>
+                <w:bCs/>
+              </w:rPr>
+              <w:t>Valores de Referencia</w:t>
+            </w:r>
+          </w:p>
+        </w:tc>
+      </w:tr>
+      <w:tr>
+        <w:trPr>
+          <w:jc w:val="center"/>
+        </w:trPr>
+        <w:tc>
+          <w:tcPr>
+            <w:tcW w:w="2268" w:type="dxa"/>
+            <w:vAlign w:val="center"/>
+          </w:tcPr>
+          <w:p>
+            <w:pPr>
+              <w:jc w:val="right"/>
+              <w:rPr>
+                <w:rFonts w:ascii="Avenir Book" w:hAnsi="Avenir Book"/>
+              </w:rPr>
+            </w:pPr>
+            <w:r>
+              <w:rPr>
+                <w:rFonts w:ascii="Avenir Book" w:hAnsi="Avenir Book"/>
+              </w:rPr>
+              <w:t>Plaga</w:t>
+            </w:r>
+          </w:p>
+        </w:tc>
+        <w:tc>
+          <w:tcPr>
+            <w:tcW w:w="827" w:type="dxa"/>
+            <w:shd w:val="clear" w:color="auto" w:fill="8FCC4F"/>
+            <w:vAlign w:val="center"/>
+          </w:tcPr>
+          <w:p>
+            <w:pPr>
+              <w:jc w:val="center"/>
+              <w:rPr>
+                <w:rFonts w:ascii="Avenir Book" w:hAnsi="Avenir Book"/>
+              </w:rPr>
+            </w:pPr>
+            <w:r>
+              <w:rPr>
+                <w:rFonts w:ascii="Avenir Book" w:hAnsi="Avenir Book"/>
+              </w:rPr>
+              <w:t>Bajo</w:t>
+            </w:r>
+          </w:p>
+        </w:tc>
+        <w:tc>
+          <w:tcPr>
+            <w:tcW w:w="1016" w:type="dxa"/>
+            <w:shd w:val="clear" w:color="auto" w:fill="F5B800"/>
+            <w:vAlign w:val="center"/>
+          </w:tcPr>
+          <w:p>
+            <w:pPr>
+              <w:jc w:val="center"/>
+              <w:rPr>
+                <w:rFonts w:ascii="Avenir Book" w:hAnsi="Avenir Book"/>
+              </w:rPr>
+            </w:pPr>
+            <w:r>
+              <w:rPr>
+                <w:rFonts w:ascii="Avenir Book" w:hAnsi="Avenir Book"/>
+              </w:rPr>
+              <w:t>Medio</w:t>
+            </w:r>
+          </w:p>
+        </w:tc>
+        <w:tc>
+          <w:tcPr>
+            <w:tcW w:w="850" w:type="dxa"/>
+            <w:shd w:val="clear" w:color="auto" w:fill="DF0204"/>
+            <w:vAlign w:val="center"/>
+          </w:tcPr>
+          <w:p>
+            <w:pPr>
+              <w:jc w:val="center"/>
+              <w:rPr>
+                <w:rFonts w:ascii="Avenir Book" w:hAnsi="Avenir Book"/>
+              </w:rPr>
+            </w:pPr>
+            <w:r>
+              <w:rPr>
+                <w:rFonts w:ascii="Avenir Book" w:hAnsi="Avenir Book"/>
+              </w:rPr>
+              <w:t>Alto</w:t>
+            </w:r>
+          </w:p>
+        </w:tc>
+      </w:tr>
+      <w:tr>
+        <w:trPr>
+          <w:jc w:val="center"/>
+        </w:trPr>
+        <w:tc>
+          <w:tcPr>
+            <w:tcW w:w="2268" w:type="dxa"/>
+            <w:vAlign w:val="center"/>
+          </w:tcPr>
+          <w:p>
+            <w:pPr>
+              <w:jc w:val="right"/>
+              <w:rPr>
+                <w:rFonts w:ascii="Avenir Book" w:hAnsi="Avenir Book"/>
+              </w:rPr>
+            </w:pPr>
+            <w:r>
+              <w:rPr>
+                <w:rFonts w:ascii="Avenir Book" w:hAnsi="Avenir Book"/>
+              </w:rPr>
+              <w:t>Cucaracha Americana</w:t>
+            </w:r>
+          </w:p>
+        </w:tc>
+        <w:tc>
+          <w:tcPr>
+            <w:tcW w:w="827" w:type="dxa"/>
+            <w:vAlign w:val="center"/>
+          </w:tcPr>
+          <w:p>
+            <w:pPr>
+              <w:jc w:val="center"/>
+              <w:rPr>
+                <w:rFonts w:ascii="Avenir Book" w:hAnsi="Avenir Book"/>
+              </w:rPr>
+            </w:pPr>
+            <w:r>
+              <w:rPr>
+                <w:rFonts w:ascii="Avenir Book" w:hAnsi="Avenir Book"/>
+              </w:rPr>
+              <w:t>1-20</w:t>
+            </w:r>
+          </w:p>
+        </w:tc>
+        <w:tc>
+          <w:tcPr>
+            <w:tcW w:w="1016" w:type="dxa"/>
+            <w:vAlign w:val="center"/>
+          </w:tcPr>
+          <w:p>
+            <w:pPr>
+              <w:jc w:val="center"/>
+              <w:rPr>
+                <w:rFonts w:ascii="Avenir Book" w:hAnsi="Avenir Book"/>
+              </w:rPr>
+            </w:pPr>
+            <w:r>
+              <w:rPr>
+                <w:rFonts w:ascii="Avenir Book" w:hAnsi="Avenir Book"/>
+              </w:rPr>
+              <w:t>21-50</w:t>
+            </w:r>
+          </w:p>
+        </w:tc>
+        <w:tc>
+          <w:tcPr>
+            <w:tcW w:w="850" w:type="dxa"/>
+            <w:vAlign w:val="center"/>
+          </w:tcPr>
+          <w:p>
+            <w:pPr>
+              <w:jc w:val="center"/>
+              <w:rPr>
+                <w:rFonts w:ascii="Avenir Book" w:hAnsi="Avenir Book"/>
+              </w:rPr>
+            </w:pPr>
+            <w:r>
+              <w:rPr>
+                <w:rFonts w:ascii="Avenir Book" w:hAnsi="Avenir Book"/>
+              </w:rPr>
+              <w:t>&gt;50</w:t>
+            </w:r>
+          </w:p>
+        </w:tc>
+      </w:tr>
+      <w:tr>
+        <w:trPr>
+          <w:jc w:val="center"/>
+        </w:trPr>
+        <w:tc>
+          <w:tcPr>
+            <w:tcW w:w="2268" w:type="dxa"/>
+            <w:vAlign w:val="center"/>
+          </w:tcPr>
+          <w:p>
+            <w:pPr>
+              <w:jc w:val="right"/>
+              <w:rPr>
+                <w:rFonts w:ascii="Avenir Book" w:hAnsi="Avenir Book"/>
+              </w:rPr>
+            </w:pPr>
+            <w:r>
+              <w:rPr>
+                <w:rFonts w:ascii="Avenir Book" w:hAnsi="Avenir Book"/>
+              </w:rPr>
+              <w:t>Cucaracha Alemana</w:t>
+            </w:r>
+          </w:p>
+        </w:tc>
+        <w:tc>
+          <w:tcPr>
+            <w:tcW w:w="827" w:type="dxa"/>
+            <w:vAlign w:val="center"/>
+          </w:tcPr>
+          <w:p>
+            <w:pPr>
+              <w:jc w:val="center"/>
+              <w:rPr>
+                <w:rFonts w:ascii="Avenir Book" w:hAnsi="Avenir Book"/>
+              </w:rPr>
+            </w:pPr>
+            <w:r>
+              <w:rPr>
+                <w:rFonts w:ascii="Avenir Book" w:hAnsi="Avenir Book"/>
+              </w:rPr>
+              <w:t>1-20</w:t>
+            </w:r>
+          </w:p>
+        </w:tc>
+        <w:tc>
+          <w:tcPr>
+            <w:tcW w:w="1016" w:type="dxa"/>
+            <w:vAlign w:val="center"/>
+          </w:tcPr>
+          <w:p>
+            <w:pPr>
+              <w:jc w:val="center"/>
+              <w:rPr>
+                <w:rFonts w:ascii="Avenir Book" w:hAnsi="Avenir Book"/>
+              </w:rPr>
+            </w:pPr>
+            <w:r>
+              <w:rPr>
+                <w:rFonts w:ascii="Avenir Book" w:hAnsi="Avenir Book"/>
+              </w:rPr>
+              <w:t>21-50</w:t>
+            </w:r>
+          </w:p>
+        </w:tc>
+        <w:tc>
+          <w:tcPr>
+            <w:tcW w:w="850" w:type="dxa"/>
+            <w:vAlign w:val="center"/>
+          </w:tcPr>
+          <w:p>
+            <w:pPr>
+              <w:jc w:val="center"/>
+              <w:rPr>
+                <w:rFonts w:ascii="Avenir Book" w:hAnsi="Avenir Book"/>
+              </w:rPr>
+            </w:pPr>
+            <w:r>
+              <w:rPr>
+                <w:rFonts w:ascii="Avenir Book" w:hAnsi="Avenir Book"/>
+              </w:rPr>
+              <w:t>&gt;50</w:t>
+            </w:r>
+          </w:p>
+        </w:tc>
+      </w:tr>
+      <w:tr>
+        <w:trPr>
+          <w:jc w:val="center"/>
+        </w:trPr>
+        <w:tc>
+          <w:tcPr>
+            <w:tcW w:w="2268" w:type="dxa"/>
+            <w:vAlign w:val="center"/>
+          </w:tcPr>
+          <w:p>
+            <w:pPr>
+              <w:jc w:val="right"/>
+              <w:rPr>
+                <w:rFonts w:ascii="Avenir Book" w:hAnsi="Avenir Book"/>
+              </w:rPr>
+            </w:pPr>
+            <w:r>
+              <w:rPr>
+                <w:rFonts w:ascii="Avenir Book" w:hAnsi="Avenir Book"/>
+              </w:rPr>
+              <w:t>Hormigas</w:t>
+            </w:r>
+          </w:p>
+        </w:tc>
+        <w:tc>
+          <w:tcPr>
+            <w:tcW w:w="827" w:type="dxa"/>
+            <w:vAlign w:val="center"/>
+          </w:tcPr>
+          <w:p>
+            <w:pPr>
+              <w:jc w:val="center"/>
+              <w:rPr>
+                <w:rFonts w:ascii="Avenir Book" w:hAnsi="Avenir Book"/>
+              </w:rPr>
+            </w:pPr>
+            <w:r>
+              <w:rPr>
+                <w:rFonts w:ascii="Avenir Book" w:hAnsi="Avenir Book"/>
+              </w:rPr>
+              <w:t>1-100</w:t>
+            </w:r>
+          </w:p>
+        </w:tc>
+        <w:tc>
+          <w:tcPr>
+            <w:tcW w:w="1016" w:type="dxa"/>
+            <w:vAlign w:val="center"/>
+          </w:tcPr>
+          <w:p>
+            <w:pPr>
+              <w:jc w:val="center"/>
+              <w:rPr>
+                <w:rFonts w:ascii="Avenir Book" w:hAnsi="Avenir Book"/>
+              </w:rPr>
+            </w:pPr>
+            <w:r>
+              <w:rPr>
+                <w:rFonts w:ascii="Avenir Book" w:hAnsi="Avenir Book"/>
+              </w:rPr>
+              <w:t>101-200</w:t>
+            </w:r>
+          </w:p>
+        </w:tc>
+        <w:tc>
+          <w:tcPr>
+            <w:tcW w:w="850" w:type="dxa"/>
+            <w:vAlign w:val="center"/>
+          </w:tcPr>
+          <w:p>
+            <w:pPr>
+              <w:jc w:val="center"/>
+              <w:rPr>
+                <w:rFonts w:ascii="Avenir Book" w:hAnsi="Avenir Book"/>
+              </w:rPr>
+            </w:pPr>
+            <w:r>
+              <w:rPr>
+                <w:rFonts w:ascii="Avenir Book" w:hAnsi="Avenir Book"/>
+              </w:rPr>
+              <w:t>&gt;200</w:t>
+            </w:r>
+          </w:p>
+        </w:tc>
+      </w:tr>
+      <w:tr>
+        <w:trPr>
+          <w:jc w:val="center"/>
+        </w:trPr>
+        <w:tc>
+          <w:tcPr>
+            <w:tcW w:w="2268" w:type="dxa"/>
+            <w:vAlign w:val="center"/>
+          </w:tcPr>
+          <w:p>
+            <w:pPr>
+              <w:jc w:val="right"/>
+              <w:rPr>
+                <w:rFonts w:ascii="Avenir Book" w:hAnsi="Avenir Book"/>
+              </w:rPr>
+            </w:pPr>
+            <w:r>
+              <w:rPr>
+                <w:rFonts w:ascii="Avenir Book" w:hAnsi="Avenir Book"/>
+              </w:rPr>
+              <w:t>Moscas</w:t>
+            </w:r>
+          </w:p>
+        </w:tc>
+        <w:tc>
+          <w:tcPr>
+            <w:tcW w:w="827" w:type="dxa"/>
+            <w:vAlign w:val="center"/>
+          </w:tcPr>
+          <w:p>
+            <w:pPr>
+              <w:jc w:val="center"/>
+              <w:rPr>
+                <w:rFonts w:ascii="Avenir Book" w:hAnsi="Avenir Book"/>
+              </w:rPr>
+            </w:pPr>
+            <w:r>
+              <w:rPr>
+                <w:rFonts w:ascii="Avenir Book" w:hAnsi="Avenir Book"/>
+              </w:rPr>
+              <w:t>1-5</w:t>
+            </w:r>
+          </w:p>
+        </w:tc>
+        <w:tc>
+          <w:tcPr>
+            <w:tcW w:w="1016" w:type="dxa"/>
+            <w:vAlign w:val="center"/>
+          </w:tcPr>
+          <w:p>
+            <w:pPr>
+              <w:jc w:val="center"/>
+              <w:rPr>
+                <w:rFonts w:ascii="Avenir Book" w:hAnsi="Avenir Book"/>
+              </w:rPr>
+            </w:pPr>
+            <w:r>
+              <w:rPr>
+                <w:rFonts w:ascii="Avenir Book" w:hAnsi="Avenir Book"/>
+              </w:rPr>
+              <w:t>6-20</w:t>
+            </w:r>
+          </w:p>
+        </w:tc>
+        <w:tc>
+          <w:tcPr>
+            <w:tcW w:w="850" w:type="dxa"/>
+            <w:vAlign w:val="center"/>
+          </w:tcPr>
+          <w:p>
+            <w:pPr>
+              <w:jc w:val="center"/>
+              <w:rPr>
+                <w:rFonts w:ascii="Avenir Book" w:hAnsi="Avenir Book"/>
+              </w:rPr>
+            </w:pPr>
+            <w:r>
+              <w:rPr>
+                <w:rFonts w:ascii="Avenir Book" w:hAnsi="Avenir Book"/>
+              </w:rPr>
+              <w:t>&gt;20</w:t>
+            </w:r>
+          </w:p>
+        </w:tc>
+      </w:tr>
+      <w:tr>
+        <w:trPr>
+          <w:jc w:val="center"/>
+        </w:trPr>
+        <w:tc>
+          <w:tcPr>
+            <w:tcW w:w="2268" w:type="dxa"/>
+            <w:vAlign w:val="center"/>
+          </w:tcPr>
+          <w:p>
+            <w:pPr>
+              <w:jc w:val="right"/>
+              <w:rPr>
+                <w:rFonts w:ascii="Avenir Book" w:hAnsi="Avenir Book"/>
+              </w:rPr>
+            </w:pPr>
+            <w:r>
+              <w:rPr>
+                <w:rFonts w:ascii="Avenir Book" w:hAnsi="Avenir Book"/>
+              </w:rPr>
+              <w:t>Mosquitos</w:t>
+            </w:r>
+          </w:p>
+        </w:tc>
+        <w:tc>
+          <w:tcPr>
+            <w:tcW w:w="827" w:type="dxa"/>
+            <w:vAlign w:val="center"/>
+          </w:tcPr>
+          <w:p>
+            <w:pPr>
+              <w:jc w:val="center"/>
+              <w:rPr>
+                <w:rFonts w:ascii="Avenir Book" w:hAnsi="Avenir Book"/>
+              </w:rPr>
+            </w:pPr>
+            <w:r>
+              <w:rPr>
+                <w:rFonts w:ascii="Avenir Book" w:hAnsi="Avenir Book"/>
+              </w:rPr>
+              <w:t>1-5</w:t>
+            </w:r>
+          </w:p>
+        </w:tc>
+        <w:tc>
+          <w:tcPr>
+            <w:tcW w:w="1016" w:type="dxa"/>
+            <w:vAlign w:val="center"/>
+          </w:tcPr>
+          <w:p>
+            <w:pPr>
+              <w:jc w:val="center"/>
+              <w:rPr>
+                <w:rFonts w:ascii="Avenir Book" w:hAnsi="Avenir Book"/>
+              </w:rPr>
+            </w:pPr>
+            <w:r>
+              <w:rPr>
+                <w:rFonts w:ascii="Avenir Book" w:hAnsi="Avenir Book"/>
+              </w:rPr>
+              <w:t>6-15</w:t>
+            </w:r>
+          </w:p>
+        </w:tc>
+        <w:tc>
+          <w:tcPr>
+            <w:tcW w:w="850" w:type="dxa"/>
+            <w:vAlign w:val="center"/>
+          </w:tcPr>
+          <w:p>
+            <w:pPr>
+              <w:jc w:val="center"/>
+              <w:rPr>
+                <w:rFonts w:ascii="Avenir Book" w:hAnsi="Avenir Book"/>
+              </w:rPr>
+            </w:pPr>
+            <w:r>
+              <w:rPr>
+                <w:rFonts w:ascii="Avenir Book" w:hAnsi="Avenir Book"/>
+              </w:rPr>
+              <w:t>&gt;15</w:t>
+            </w:r>
+          </w:p>
+        </w:tc>
+      </w:tr>
+      <w:tr>
+        <w:trPr>
+          <w:jc w:val="center"/>
+        </w:trPr>
+        <w:tc>
+          <w:tcPr>
+            <w:tcW w:w="2268" w:type="dxa"/>
+            <w:vAlign w:val="center"/>
+          </w:tcPr>
+          <w:p>
+            <w:pPr>
+              <w:jc w:val="right"/>
+              <w:rPr>
+                <w:rFonts w:ascii="Avenir Book" w:hAnsi="Avenir Book"/>
+              </w:rPr>
+            </w:pPr>
+            <w:r>
+              <w:rPr>
+                <w:rFonts w:ascii="Avenir Book" w:hAnsi="Avenir Book"/>
+              </w:rPr>
+              <w:t>Zancudos</w:t>
+            </w:r>
+          </w:p>
+        </w:tc>
+        <w:tc>
+          <w:tcPr>
+            <w:tcW w:w="827" w:type="dxa"/>
+            <w:vAlign w:val="center"/>
+          </w:tcPr>
+          <w:p>
+            <w:pPr>
+              <w:jc w:val="center"/>
+              <w:rPr>
+                <w:rFonts w:ascii="Avenir Book" w:hAnsi="Avenir Book"/>
+              </w:rPr>
+            </w:pPr>
+            <w:r>
+              <w:rPr>
+                <w:rFonts w:ascii="Avenir Book" w:hAnsi="Avenir Book"/>
+              </w:rPr>
+              <w:t>1-5</w:t>
+            </w:r>
+          </w:p>
+        </w:tc>
+        <w:tc>
+          <w:tcPr>
+            <w:tcW w:w="1016" w:type="dxa"/>
+            <w:vAlign w:val="center"/>
+          </w:tcPr>
+          <w:p>
+            <w:pPr>
+              <w:jc w:val="center"/>
+              <w:rPr>
+                <w:rFonts w:ascii="Avenir Book" w:hAnsi="Avenir Book"/>
+              </w:rPr>
+            </w:pPr>
+            <w:r>
+              <w:rPr>
+                <w:rFonts w:ascii="Avenir Book" w:hAnsi="Avenir Book"/>
+              </w:rPr>
+              <w:t>6-15</w:t>
+            </w:r>
+          </w:p>
+        </w:tc>
+        <w:tc>
+          <w:tcPr>
+            <w:tcW w:w="850" w:type="dxa"/>
+            <w:vAlign w:val="center"/>
+          </w:tcPr>
+          <w:p>
+            <w:pPr>
+              <w:jc w:val="center"/>
+              <w:rPr>
+                <w:rFonts w:ascii="Avenir Book" w:hAnsi="Avenir Book"/>
+              </w:rPr>
+            </w:pPr>
+            <w:r>
+              <w:rPr>
+                <w:rFonts w:ascii="Avenir Book" w:hAnsi="Avenir Book"/>
+              </w:rPr>
+              <w:t>&gt;15</w:t>
+            </w:r>
+          </w:p>
+        </w:tc>
+      </w:tr>
+      <w:tr>
+        <w:trPr>
+          <w:jc w:val="center"/>
+        </w:trPr>
+        <w:tc>
+          <w:tcPr>
+            <w:tcW w:w="2268" w:type="dxa"/>
+            <w:vAlign w:val="center"/>
+          </w:tcPr>
+          <w:p>
+            <w:pPr>
+              <w:jc w:val="right"/>
+              <w:rPr>
+                <w:rFonts w:ascii="Avenir Book" w:hAnsi="Avenir Book"/>
+              </w:rPr>
+            </w:pPr>
+            <w:r>
+              <w:rPr>
+                <w:rFonts w:ascii="Avenir Book" w:hAnsi="Avenir Book"/>
+              </w:rPr>
+              <w:t>Ratón casero</w:t>
+            </w:r>
+          </w:p>
+        </w:tc>
+        <w:tc>
+          <w:tcPr>
+            <w:tcW w:w="827" w:type="dxa"/>
+            <w:vAlign w:val="center"/>
+          </w:tcPr>
+          <w:p>
+            <w:pPr>
+              <w:jc w:val="center"/>
+              <w:rPr>
+                <w:rFonts w:ascii="Avenir Book" w:hAnsi="Avenir Book"/>
+              </w:rPr>
+            </w:pPr>
+            <w:r>
+              <w:rPr>
+                <w:rFonts w:ascii="Avenir Book" w:hAnsi="Avenir Book"/>
+              </w:rPr>
+              <w:t>1</w:t>
+            </w:r>
+          </w:p>
+        </w:tc>
+        <w:tc>
+          <w:tcPr>
+            <w:tcW w:w="1016" w:type="dxa"/>
+            <w:vAlign w:val="center"/>
+          </w:tcPr>
+          <w:p>
+            <w:pPr>
+              <w:jc w:val="center"/>
+              <w:rPr>
+                <w:rFonts w:ascii="Avenir Book" w:hAnsi="Avenir Book"/>
+              </w:rPr>
+            </w:pPr>
+            <w:r>
+              <w:rPr>
+                <w:rFonts w:ascii="Avenir Book" w:hAnsi="Avenir Book"/>
+              </w:rPr>
+              <w:t>2-3</w:t>
+            </w:r>
+          </w:p>
+        </w:tc>
+        <w:tc>
+          <w:tcPr>
+            <w:tcW w:w="850" w:type="dxa"/>
+            <w:vAlign w:val="center"/>
+          </w:tcPr>
+          <w:p>
+            <w:pPr>
+              <w:jc w:val="center"/>
+              <w:rPr>
+                <w:rFonts w:ascii="Avenir Book" w:hAnsi="Avenir Book"/>
+              </w:rPr>
+            </w:pPr>
+            <w:r>
+              <w:rPr>
+                <w:rFonts w:ascii="Avenir Book" w:hAnsi="Avenir Book"/>
+              </w:rPr>
+              <w:t>&gt;3</w:t>
+            </w:r>
+          </w:p>
+        </w:tc>
+      </w:tr>
+      <w:tr>
+        <w:trPr>
+          <w:jc w:val="center"/>
+        </w:trPr>
+        <w:tc>
+          <w:tcPr>
+            <w:tcW w:w="2268" w:type="dxa"/>
+            <w:vAlign w:val="center"/>
+          </w:tcPr>
+          <w:p>
+            <w:pPr>
+              <w:jc w:val="right"/>
+              <w:rPr>
+                <w:rFonts w:ascii="Avenir Book" w:hAnsi="Avenir Book"/>
+              </w:rPr>
+            </w:pPr>
+            <w:r>
+              <w:rPr>
+                <w:rFonts w:ascii="Avenir Book" w:hAnsi="Avenir Book"/>
+              </w:rPr>
+              <w:t>Rata Noruega</w:t>
+            </w:r>
+          </w:p>
+        </w:tc>
+        <w:tc>
+          <w:tcPr>
+            <w:tcW w:w="827" w:type="dxa"/>
+            <w:vAlign w:val="center"/>
+          </w:tcPr>
+          <w:p>
+            <w:pPr>
+              <w:jc w:val="center"/>
+              <w:rPr>
+                <w:rFonts w:ascii="Avenir Book" w:hAnsi="Avenir Book"/>
+              </w:rPr>
+            </w:pPr>
+            <w:r>
+              <w:rPr>
+                <w:rFonts w:ascii="Avenir Book" w:hAnsi="Avenir Book"/>
+              </w:rPr>
+              <w:t>1</w:t>
+            </w:r>
+          </w:p>
+        </w:tc>
+        <w:tc>
+          <w:tcPr>
+            <w:tcW w:w="1016" w:type="dxa"/>
+            <w:vAlign w:val="center"/>
+          </w:tcPr>
+          <w:p>
+            <w:pPr>
+              <w:jc w:val="center"/>
+              <w:rPr>
+                <w:rFonts w:ascii="Avenir Book" w:hAnsi="Avenir Book"/>
+              </w:rPr>
+            </w:pPr>
+            <w:r>
+              <w:rPr>
+                <w:rFonts w:ascii="Avenir Book" w:hAnsi="Avenir Book"/>
+              </w:rPr>
+              <w:t>2-3</w:t>
+            </w:r>
+          </w:p>
+        </w:tc>
+        <w:tc>
+          <w:tcPr>
+            <w:tcW w:w="850" w:type="dxa"/>
+            <w:vAlign w:val="center"/>
+          </w:tcPr>
+          <w:p>
+            <w:pPr>
+              <w:jc w:val="center"/>
+              <w:rPr>
+                <w:rFonts w:ascii="Avenir Book" w:hAnsi="Avenir Book"/>
+              </w:rPr>
+            </w:pPr>
+            <w:r>
+              <w:rPr>
+                <w:rFonts w:ascii="Avenir Book" w:hAnsi="Avenir Book"/>
+              </w:rPr>
+              <w:t>&gt;3</w:t>
+            </w:r>
+          </w:p>
+        </w:tc>
+      </w:tr>
+      <w:tr>
+        <w:trPr>
+          <w:jc w:val="center"/>
+        </w:trPr>
+        <w:tc>
+          <w:tcPr>
+            <w:tcW w:w="2268" w:type="dxa"/>
+            <w:vAlign w:val="center"/>
+          </w:tcPr>
+          <w:p>
+            <w:pPr>
+              <w:jc w:val="right"/>
+              <w:rPr>
+                <w:rFonts w:ascii="Avenir Book" w:hAnsi="Avenir Book"/>
+              </w:rPr>
+            </w:pPr>
+            <w:r>
+              <w:rPr>
+                <w:rFonts w:ascii="Avenir Book" w:hAnsi="Avenir Book"/>
+              </w:rPr>
+              <w:t>Ratón de tejado</w:t>
+            </w:r>
+          </w:p>
+        </w:tc>
+        <w:tc>
+          <w:tcPr>
+            <w:tcW w:w="827" w:type="dxa"/>
+            <w:vAlign w:val="center"/>
+          </w:tcPr>
+          <w:p>
+            <w:pPr>
+              <w:jc w:val="center"/>
+              <w:rPr>
+                <w:rFonts w:ascii="Avenir Book" w:hAnsi="Avenir Book"/>
+              </w:rPr>
+            </w:pPr>
+            <w:r>
+              <w:rPr>
+                <w:rFonts w:ascii="Avenir Book" w:hAnsi="Avenir Book"/>
+              </w:rPr>
+              <w:t>1</w:t>
+            </w:r>
+          </w:p>
+        </w:tc>
+        <w:tc>
+          <w:tcPr>
+            <w:tcW w:w="1016" w:type="dxa"/>
+            <w:vAlign w:val="center"/>
+          </w:tcPr>
+          <w:p>
+            <w:pPr>
+              <w:jc w:val="center"/>
+              <w:rPr>
+                <w:rFonts w:ascii="Avenir Book" w:hAnsi="Avenir Book"/>
+              </w:rPr>
+            </w:pPr>
+            <w:r>
+              <w:rPr>
+                <w:rFonts w:ascii="Avenir Book" w:hAnsi="Avenir Book"/>
+              </w:rPr>
+              <w:t>2-3</w:t>
+            </w:r>
+          </w:p>
+        </w:tc>
+        <w:tc>
+          <w:tcPr>
+            <w:tcW w:w="850" w:type="dxa"/>
+            <w:vAlign w:val="center"/>
+          </w:tcPr>
+          <w:p>
+            <w:pPr>
+              <w:jc w:val="center"/>
+              <w:rPr>
+                <w:rFonts w:ascii="Avenir Book" w:hAnsi="Avenir Book"/>
+              </w:rPr>
+            </w:pPr>
+            <w:r>
+              <w:rPr>
+                <w:rFonts w:ascii="Avenir Book" w:hAnsi="Avenir Book"/>
+              </w:rPr>
+              <w:t>&gt;3</w:t>
+            </w:r>
+          </w:p>
+        </w:tc>
+      </w:tr>
+    </w:tbl>
+    <w:p>
+      <w:r>
+        <w:rPr>
+          <w:rFonts w:ascii="Avenir Book" w:hAnsi="Avenir Book"/>
+          <w:b/>
+          <w:bCs/>
+        </w:rPr>
+        <w:t>Nota:</w:t>
+      </w:r>
+      <w:r>
+        <w:rPr>
+          <w:rFonts w:ascii="Avenir Book" w:hAnsi="Avenir Book"/>
+        </w:rPr>
+        <w:t xml:space="preserve"> Las órdenes sin evidencia de plagas se excluyen del gráfico para concentrar el análisis únicamente en situaciones que requieren intervención.</w:t>
+      </w:r>
+    </w:p>
+    <w:p>
       <w:r>
         <w:t>{{correctivo_3_plot}}</w:t>
       </w:r>
@@ -3769,6 +4780,7 @@
     </w:p>
     <w:p>
       <w:r>
+        <w:lastRenderedPageBreak/>
         <w:t>{{correctivo_4_plot}}</w:t>
       </w:r>
     </w:p>
@@ -3944,7 +4956,6 @@
           <w:sz w:val="24"/>
           <w:szCs w:val="24"/>
         </w:rPr>
-        <w:lastRenderedPageBreak/>
         <w:t xml:space="preserve">6. Informe de Zonas comunes (Desnidado, motomochila, zonas verdes, cajas de aguas negras…)  </w:t>
       </w:r>
     </w:p>
@@ -4144,6 +5155,7 @@
         <w:rPr>
           <w:rFonts w:ascii="Avenir Book" w:hAnsi="Avenir Book"/>
         </w:rPr>
+        <w:lastRenderedPageBreak/>
         <w:t>Responsable: Mantenimiento</w:t>
       </w:r>
     </w:p>
@@ -4525,7 +5537,6 @@
         <w:rPr>
           <w:rFonts w:ascii="Avenir Book" w:hAnsi="Avenir Book"/>
         </w:rPr>
-        <w:lastRenderedPageBreak/>
         <w:t>Reubicar lámparas existentes para exteriores en sitios estratégicos.</w:t>
       </w:r>
     </w:p>
@@ -4999,7 +6010,7 @@
       <w:rPr>
         <w:noProof/>
       </w:rPr>
-      <w:pict w14:anchorId="269EF0EE">
+      <w:pict w14:anchorId="402CBE6D">
         <v:shapetype id="_x0000_t75" coordsize="21600,21600" o:spt="75" o:preferrelative="t" path="m@4@5l@4@11@9@11@9@5xe" filled="f" stroked="f">
           <v:stroke joinstyle="miter"/>
           <v:formulas>
@@ -5039,7 +6050,7 @@
       <w:rPr>
         <w:noProof/>
       </w:rPr>
-      <w:pict w14:anchorId="4D87CEAD">
+      <w:pict w14:anchorId="0F4DF300">
         <v:shapetype id="_x0000_t75" coordsize="21600,21600" o:spt="75" o:preferrelative="t" path="m@4@5l@4@11@9@11@9@5xe" filled="f" stroked="f">
           <v:stroke joinstyle="miter"/>
           <v:formulas>
@@ -5079,7 +6090,7 @@
       <w:rPr>
         <w:noProof/>
       </w:rPr>
-      <w:pict w14:anchorId="5C77C5BE">
+      <w:pict w14:anchorId="371CD939">
         <v:shapetype id="_x0000_t75" coordsize="21600,21600" o:spt="75" o:preferrelative="t" path="m@4@5l@4@11@9@11@9@5xe" filled="f" stroked="f">
           <v:stroke joinstyle="miter"/>
           <v:formulas>

</xml_diff>

<commit_message>
Actualizar la plantilla de Word para agregar placeholder de zonas_comunes
</commit_message>
<xml_diff>
--- a/Plantilla.docx
+++ b/Plantilla.docx
@@ -4963,6 +4963,48 @@
           <w:szCs w:val="24"/>
         </w:rPr>
         <w:t xml:space="preserve">6. Informe de Zonas comunes (Desnidado, motomochila, zonas verdes, cajas de aguas negras…)  </w:t>
+      </w:r>
+    </w:p>
+    <w:p>
+      <w:pPr>
+        <w:rPr>
+          <w:rFonts w:ascii="Avenir Book" w:hAnsi="Avenir Book"/>
+        </w:rPr>
+      </w:pPr>
+      <w:r>
+        <w:rPr>
+          <w:rFonts w:ascii="Avenir Book" w:hAnsi="Avenir Book"/>
+          <w:highlight w:val="yellow"/>
+        </w:rPr>
+        <w:t>{{</w:t>
+      </w:r>
+      <w:r>
+        <w:rPr>
+          <w:rFonts w:ascii="Avenir Book" w:hAnsi="Avenir Book"/>
+          <w:highlight w:val="yellow"/>
+        </w:rPr>
+        <w:t>zonas</w:t>
+      </w:r>
+      <w:r>
+        <w:rPr>
+          <w:rFonts w:ascii="Avenir Book" w:hAnsi="Avenir Book"/>
+          <w:highlight w:val="yellow"/>
+        </w:rPr>
+        <w:t>_</w:t>
+      </w:r>
+      <w:r>
+        <w:rPr>
+          <w:rFonts w:ascii="Avenir Book" w:hAnsi="Avenir Book"/>
+          <w:highlight w:val="yellow"/>
+        </w:rPr>
+        <w:t>comunes</w:t>
+      </w:r>
+      <w:r>
+        <w:rPr>
+          <w:rFonts w:ascii="Avenir Book" w:hAnsi="Avenir Book"/>
+          <w:highlight w:val="yellow"/>
+        </w:rPr>
+        <w:t>}}</w:t>
       </w:r>
     </w:p>
     <w:p>
@@ -5735,7 +5777,6 @@
           </w:p>
           <w:p>
             <w:r>
-              <w:lastRenderedPageBreak/>
               <w:t>Teléfonos: 3225241</w:t>
             </w:r>
           </w:p>
@@ -6017,7 +6058,7 @@
       <w:rPr>
         <w:noProof/>
       </w:rPr>
-      <w:pict w14:anchorId="21EB468A">
+      <w:pict w14:anchorId="07A208CE">
         <v:shapetype id="_x0000_t75" coordsize="21600,21600" o:spt="75" o:preferrelative="t" path="m@4@5l@4@11@9@11@9@5xe" filled="f" stroked="f">
           <v:stroke joinstyle="miter"/>
           <v:formulas>
@@ -6057,7 +6098,7 @@
       <w:rPr>
         <w:noProof/>
       </w:rPr>
-      <w:pict w14:anchorId="2522B1C6">
+      <w:pict w14:anchorId="6D6FD0FD">
         <v:shapetype id="_x0000_t75" coordsize="21600,21600" o:spt="75" o:preferrelative="t" path="m@4@5l@4@11@9@11@9@5xe" filled="f" stroked="f">
           <v:stroke joinstyle="miter"/>
           <v:formulas>
@@ -6097,7 +6138,7 @@
       <w:rPr>
         <w:noProof/>
       </w:rPr>
-      <w:pict w14:anchorId="5D19174B">
+      <w:pict w14:anchorId="54115787">
         <v:shapetype id="_x0000_t75" coordsize="21600,21600" o:spt="75" o:preferrelative="t" path="m@4@5l@4@11@9@11@9@5xe" filled="f" stroked="f">
           <v:stroke joinstyle="miter"/>
           <v:formulas>

</xml_diff>